<commit_message>
Masterclass script: add the science models and sources to every slide
Co-Authored-By: Claude Fable 5.1 <noreply@anthropic.com>
Claude-Session: https://claude.ai/code/session_011ZxZ5Sjnca9JQsayzBoJk5
</commit_message>
<xml_diff>
--- a/script/The-Longevity-Masterclass-script-three-versions.docx
+++ b/script/The-Longevity-Masterclass-script-three-versions.docx
@@ -38,7 +38,7 @@
     </w:p>
     <w:p>
       <w:r>
-        <w:t>Seventeen slides means every slide earns about three and a half minutes, and some earn five. That is on purpose. Each one is a single object or a single photograph with one to three builds, so you stay on a picture while you tell its story, instead of clicking through a deck. Version A is the keynote cut. Version B is the straight-line cut. Version C is the one I would pick. Your open items from your own document are still in brackets, where you left them. Your original, word for word, is at the end, under Previous round.</w:t>
+        <w:t>Seventeen slides means every slide earns about three and a half minutes, and some earn five. That is on purpose. Each one is a single object or a single photograph with one to three builds, so you stay on a picture while you tell its story, instead of clicking through a deck. Version A is the keynote cut. Version B is the straight-line cut. Version C is the one I would pick. Your open items from your own document are still in brackets, where you left them. Your original, word for word, is here: Julie's original script, 15 October (https://docs.google.com/document/d/1RaNIGgGIpNGrUIw0QDtey2JbigpMigGPa69Ed5osZ4M/edit).</w:t>
       </w:r>
     </w:p>
     <w:p>
@@ -48,7 +48,12 @@
     </w:p>
     <w:p>
       <w:r>
-        <w:t>You can take a whole cut, or mix. The three sit on the same seventeen slides in the same order, so slide 7 from one and slide 15 from another fit together. Tell me which, or change it directly in the doc.</w:t>
+        <w:t>You can take a whole cut, or mix. The three sit on the same seventeen slides in the same order, so slide 7 from one and slide 15 from another fit together. Tell me which, or change it directly in the document.</w:t>
+      </w:r>
+    </w:p>
+    <w:p>
+      <w:r>
+        <w:t>Every slide now carries its model: the real science behind the picture, with the study it comes from in brackets so you can check it or cut it. The full list is at the end, under Models and sources. Nothing is stated as fact that does not have a paper behind it, and every one is marked for you to confirm before you say it on camera.</w:t>
       </w:r>
     </w:p>
     <w:p>
@@ -109,7 +114,7 @@
           <w:color w:val="1E6FFF"/>
           <w:sz w:val="29"/>
         </w:rPr>
-        <w:t>Slide 1 | I AM VERY NORMAL. THAT'S THE WHOLE POINT. | 2:30</w:t>
+        <w:t>Slide 1 | I AM VERY NORMAL. THAT'S THE WHOLE POINT. | 2:00</w:t>
       </w:r>
     </w:p>
     <w:p>
@@ -205,7 +210,7 @@
           <w:color w:val="5B6472"/>
           <w:sz w:val="22"/>
         </w:rPr>
-        <w:t>On screen: First the plain line, huge, cream: Ten years pass. By this test, I age about six. Nothing else, so the whole room gets the point before any science. Then the gauge rises, hero size: dark glass face, 1.0 at the top, the needle glowing light blue, cream ticks at 0.665 and 0.76, and the second beat of the headline in light blue: The speed towards death. Build: the needle sweeps from 1.0 down to 0.65 as you say the number, then up to 0.76 when you confess it. Approved visual, unchanged in markings and meaning.</w:t>
+        <w:t>On screen: First the plain line, huge, cream: Ten years pass. By this test, I age about six. Nothing else, so the whole room gets the point before any science. Then the gauge rises, hero size: dark glass face, 1.0 at the top, the needle glowing light blue, cream ticks at 0.665 and 0.76, and the second beat of the headline in light blue: The speed towards death. Build: the needle sweeps from 1.0 down to 0.65 as you say the number, then up to 0.76 when you confess it. Approved visual, unchanged in markings and meaning. Final build: the pace-of-aging curve from the study behind the test, a soft bell drawn over the gauge: most people near 1.0, a few near zero, a tail out to three years per year, your 0.665 marked on it. Small: Belsky et al., PNAS 2015.</w:t>
       </w:r>
     </w:p>
     <w:p>
@@ -215,7 +220,7 @@
     </w:p>
     <w:p>
       <w:r>
-        <w:t>The test behind that number is called DunedinPACE. The scientists call what it measures your pace of aging. I'll give you the less polite version. It measures your speed towards death. How fast your body is aging right now, this year. A score of 1.0 means you're aging one year for every calendar year, which is what most people do. [check this wording against the test provider's description] My best score was 0.65. Average my three tests and it's 0.665. That's the more honest number, so you get both.</w:t>
+        <w:t>The test behind that number is called DunedinPACE. The scientists call what it measures your pace of aging. I'll give you the less polite version. It measures your speed towards death. How fast your body is aging right now, this year. A score of 1.0 means you're aging one year for every calendar year, which is what most people do. [check this wording against the test provider's description] My best score was 0.65. Average my three tests and it's 0.665. That's the more honest number, so you get both. And so you know this isn't a vanity number: in the study that built this test, 954 people, all aged 38, were measured. Most were aging about a year per year. A few were close to zero. And some were aging close to three years for every year on the calendar. [Belsky et al., PNAS 2015; confirm you are comfortable citing it]</w:t>
       </w:r>
     </w:p>
     <w:p>
@@ -236,7 +241,7 @@
           <w:color w:val="1E6FFF"/>
           <w:sz w:val="29"/>
         </w:rPr>
-        <w:t>Slide 4 | LONGEVITY IS LIKE A CAKE. | 1:00</w:t>
+        <w:t>Slide 4 | LONGEVITY IS LIKE A CAKE. | 1:30</w:t>
       </w:r>
     </w:p>
     <w:p>
@@ -249,12 +254,12 @@
           <w:color w:val="5B6472"/>
           <w:sz w:val="22"/>
         </w:rPr>
-        <w:t>On screen: The cake, hero size, turning slowly, every layer lit evenly this once: Sleep, Food, Movement, Stress Management, the thin layer, the icing labeled Therapies, exactly as you drew it. Headline above, "cake" in light blue. Approved visual, unchanged. It returns at the start of every layer with that layer lit.</w:t>
-      </w:r>
-    </w:p>
-    <w:p>
-      <w:r>
-        <w:t>So how does a single mom with a day job end up on that list? Not with what's on your feed. With one picture. Longevity is like a cake. The cake is four layers. Sleep. Food. Movement. Stress. That's where almost all of the work lives. For the women in the room there's one more thin layer, and I'll come to it. And on top is the icing. Sauna. IVs. Peptides. A pill with a very exciting name. Icing is delightful. Nobody has ever eaten a bowl of icing and called it a cake.</w:t>
+        <w:t>On screen: First build, one root and four branches: Aging at the root, and heart disease, cancer, dementia, type 2 diabetes on the branches. Small: the geroscience hypothesis, Kennedy et al., Cell 2014. Then the cake, hero size, turning slowly, every layer lit evenly this once: Sleep, Food, Movement, Stress Management, the thin layer, the icing labeled Therapies, exactly as you drew it. Headline above, "cake" in light blue. Approved visual, unchanged. It returns at the start of every layer with that layer lit.</w:t>
+      </w:r>
+    </w:p>
+    <w:p>
+      <w:r>
+        <w:t>Before the how, one picture of why anyone bothers. Aging is the biggest risk factor for the four things we're all afraid of: heart disease, cancer, dementia, type 2 diabetes. Slow the aging itself and you push all four back at once. That's the whole bet of a field called geroscience, and it's the bet I made. [Kennedy et al., Cell 2014; the Buck Institute's founding idea] So how does a single mom with a day job end up on that list? Not with what's on your feed. With one picture. Longevity is like a cake. The cake is four layers. Sleep. Food. Movement. Stress. That's where almost all of the work lives. For the women in the room there's one more thin layer, and I'll come to it. And on top is the icing. Sauna. IVs. Peptides. A pill with a very exciting name. Icing is delightful. Nobody has ever eaten a bowl of icing and called it a cake.</w:t>
       </w:r>
     </w:p>
     <w:p>
@@ -299,7 +304,7 @@
           <w:color w:val="5B6472"/>
           <w:sz w:val="22"/>
         </w:rPr>
-        <w:t>On screen: The cake with only the icing lit, then it slides away and the cost rail rises, left to right, climbing: glass markers for Sauna, Prebiotics and most supplements, NAD drips, Peptides, Stem cells, Rapamycin with a doctor, and one tall marker at the end, the two-million-a-year program. [confirm the order] Build 2: four markers turn amber. Build 3: a single coin lights at the far left, "Twelve dollars a day." Build 4: the sauna marker glows warm. The rail is the list; there are no bullets.</w:t>
+        <w:t>On screen: The cake with only the icing lit, then it slides away and the cost map rises: a two-by-two, cost left to right, strength of human evidence bottom to top, glass markers placed on it: Sauna (cheap, twenty years of data), Prebiotics and most supplements (cheap, depends on a test), NAD drips, Peptides, Stem cells (expensive, thin human evidence), Rapamycin with a doctor (prescription, strong animal data, human trials under way), and one marker off the chart at the far right, the two-million-a-year program. [confirm the placements] Small, under the sauna marker: Laukkanen et al., JAMA Internal Medicine 2015. Build 2: four markers turn amber. Build 3: a single coin lights at the far left, "Twelve dollars a day." Build 4: the sauna marker glows warm. The rail is the list; there are no bullets.</w:t>
       </w:r>
     </w:p>
     <w:p>
@@ -324,7 +329,7 @@
     </w:p>
     <w:p>
       <w:r>
-        <w:t>Now a confession. The one piece of icing I use every single week is the cheapest one on the line. Sauna. Three to five mornings a week, at my gym. And here's a secret that will upset every personal trainer on this call: the sauna is why I get up. Nobody in history has leapt out of bed at five in the morning excited about intervals. I get up for the sauna. The workout happens to be on the way. There's good research on sauna and I'll point you to the sources I trust rather than quote a number from memory. [one or two sources from your From Paper to Plate episode, exact figures only] If you have a heart or blood pressure condition, ask your doctor first. And drink water.</w:t>
+        <w:t>Now a confession. The one piece of icing I use every single week is the cheapest one on the line. Sauna. Three to five mornings a week, at my gym. And here's a secret that will upset every personal trainer on this call: the sauna is why I get up. Nobody in history has leapt out of bed at five in the morning excited about intervals. I get up for the sauna. The workout happens to be on the way. And it's the one piece of icing with serious long-term data behind it. A Finnish study followed 2,315 men for about twenty years. The men who used a sauna four to seven times a week had a forty percent lower risk of dying from any cause than the men who went once a week. [Laukkanen et al., JAMA Internal Medicine 2015; add your own From Paper to Plate sources if you prefer] If you have a heart or blood pressure condition, ask your doctor first. And drink water.</w:t>
       </w:r>
     </w:p>
     <w:p>
@@ -353,12 +358,12 @@
           <w:color w:val="5B6472"/>
           <w:sz w:val="22"/>
         </w:rPr>
-        <w:t>On screen: The cake returns, the thin layer glowing light blue, everything else dark. One small line beneath: The Menopause Society. Find a certified practitioner. [URL] Final build: the four layers light one after another, bottom to top, the icing dims, and the headline changes to two words in cream: Now we bake.</w:t>
-      </w:r>
-    </w:p>
-    <w:p>
-      <w:r>
-        <w:t>Before we leave the icing, there's one thing that gets filed under it by mistake, usually by people who've never been through it. Menopause therapy. For half of this room, menopause is going to change your sleep, your bones, your mood, and the shape of your body, and it changes how well every other layer can do its job. Decoration doesn't do that. This is a thin layer of the cake. [your own path, one or two sentences, as much as you choose] The action is one line: find a doctor through the Menopause Society. They keep a directory of certified practitioners. [confirm naming it] This is the one place tonight where I'll say it twice. Your doctor. Not a webinar.</w:t>
+        <w:t>On screen: The cake returns, the thin layer glowing light blue, everything else dark. One small line beneath: The Menopause Society. Find a certified practitioner. [URL] Second build: a short timeline, menopause to ten years after, labeled the window. Small: The Menopause Society, 2022 Hormone Therapy Position Statement. Final build: the four layers light one after another, bottom to top, the icing dims, and the headline changes to two words in cream: Now we bake.</w:t>
+      </w:r>
+    </w:p>
+    <w:p>
+      <w:r>
+        <w:t>Before we leave the icing, there's one thing that gets filed under it by mistake, usually by people who've never been through it. Menopause therapy. For half of this room, menopause is going to change your sleep, your bones, your mood, and the shape of your body, and it changes how well every other layer can do its job. Decoration doesn't do that. This is a thin layer of the cake. The Menopause Society's own position, updated in 2022, is that for healthy women with symptoms who are under sixty, or within ten years of menopause, the benefits of hormone therapy generally outweigh the risks. That's their sentence, not mine, and it's why the next line matters. [The Menopause Society, 2022 Position Statement; confirm you want to state it] [your own path, one or two sentences, as much as you choose] The action is one line: find a doctor through the Menopause Society. They keep a directory of certified practitioners. [confirm naming it] This is the one place tonight where I'll say it twice. Your doctor. Not a webinar.</w:t>
       </w:r>
     </w:p>
     <w:p>
@@ -408,12 +413,12 @@
           <w:color w:val="5B6472"/>
           <w:sz w:val="22"/>
         </w:rPr>
-        <w:t>On screen: The cake, sleep lit, for the first sentence. Then the night arc: one arc from 9 PM on the left to 5 AM on the right, moon to sun, the five numbers the only type: Lights out 9:00 PM. Up 5:00 AM. Last meal three hours before bed. Screens off one hour before. An eight-hour opportunity, cool and dark.</w:t>
-      </w:r>
-    </w:p>
-    <w:p>
-      <w:r>
-        <w:t>Bottom layer. Sleep. I think of it as the repair shift. It's the hours when your body does its maintenance while you're not in the way. If I skimp on it, everything I do on the other three layers works harder and pays me back less. I'm going to give you my exact numbers, because I find vague advice impossible to follow. "Get good sleep" has never once told me what to do at 8:45 on a Tuesday night.</w:t>
+        <w:t>On screen: The cake, sleep lit, for the first sentence. Then the night arc: one arc from 9 PM on the left to 5 AM on the right, moon to sun, the five numbers the only type: Lights out 9:00 PM. Up 5:00 AM. Last meal three hours before bed. Screens off one hour before. An eight-hour opportunity, cool and dark. Build between the numbers: a band across the deepest part of the night labeled the repair shift. Small: Xie et al., Science 2013; Fultz et al., Science 2019.</w:t>
+      </w:r>
+    </w:p>
+    <w:p>
+      <w:r>
+        <w:t>Bottom layer. Sleep. I think of it as the repair shift. It's the hours when your body does its maintenance while you're not in the way. That's not a metaphor, by the way. In 2013 a team at the University of Rochester showed that during deep sleep the brain's drainage system opens up and flushes out the day's waste, and in 2019 a Boston team watched the same rhythm in sleeping humans. [Xie et al., Science 2013; Fultz et al., Science 2019] If I skimp on it, everything I do on the other three layers works harder and pays me back less. I'm going to give you my exact numbers, because I find vague advice impossible to follow. "Get good sleep" has never once told me what to do at 8:45 on a Tuesday night.</w:t>
       </w:r>
     </w:p>
     <w:p>
@@ -486,7 +491,7 @@
           <w:color w:val="5B6472"/>
           <w:sz w:val="22"/>
         </w:rPr>
-        <w:t>On screen: The cake, food lit, for the opening. Then the plate, seen from above, three parts, one line each: Protein is the floor. Fiber is the lever. Whole food is the default. Final build: five numbers around the rim: A pound of vegetables a day. One gram of protein per pound of goal bodyweight. Eat between 8 AM and 6 PM. Coffee cutoff 10 AM. No alcohol on training days.</w:t>
+        <w:t>On screen: The cake, food lit, for the opening. Then the plate, seen from above, three parts, one line each: Protein is the floor. Fiber is the lever. Whole food is the default. Final build: five numbers around the rim: A pound of vegetables a day. One gram of protein per pound of goal bodyweight. Eat between 8 AM and 6 PM. Coffee cutoff 10 AM. No alcohol on training days. Beside the plate, two numbers: the fiber target, 25 to 38 grams a day, and the average American, about 15. Small: Dietary Guidelines for Americans; Quagliani and Felt-Gunderson, 2017.</w:t>
       </w:r>
     </w:p>
     <w:p>
@@ -496,7 +501,7 @@
     </w:p>
     <w:p>
       <w:r>
-        <w:t>My plate has three rules. Protein is the floor. It's there at every meal, no exceptions. Fiber is the lever, which is where the vegetables come in, and that's where most of the work gets done. And whole food is the default. When I have a choice, I pick the thing that looks like it came from the ground or an animal, not a factory.</w:t>
+        <w:t>My plate has three rules. Protein is the floor. It's there at every meal, no exceptions. Fiber is the lever, which is where the vegetables come in, and that's where most of the work gets done. Here's why it's the lever: the target is 25 to 38 grams a day, and the average American gets about 15. Almost nobody is hitting it, which means almost everybody has room. [Dietary Guidelines for Americans; Quagliani and Felt-Gunderson, 2017] And whole food is the default. When I have a choice, I pick the thing that looks like it came from the ground or an animal, not a factory.</w:t>
       </w:r>
     </w:p>
     <w:p>
@@ -530,12 +535,12 @@
           <w:color w:val="5B6472"/>
           <w:sz w:val="22"/>
         </w:rPr>
-        <w:t>On screen: The sugar slide, Omri's build in the same 3D language: how sugar affects aging, one idea, one object, no text beyond the headline. Approved, unchanged. Final build: the object dims and two large checkboxes appear, Move dinner earlier and Rebuild one plate, under one word: Monday.</w:t>
-      </w:r>
-    </w:p>
-    <w:p>
-      <w:r>
-        <w:t>There are a hundred diets out there, and every one of them argues with the other ninety-nine. You have to find yours. But there's one thing every single one of them agrees on, and it's on the screen. Sugar is bad for aging. I'll let the slide carry the biology. What I do about it is simple. [one sentence: when you cut sugar and what you keep] In the Academy, every student wears a glucose monitor for two weeks and watches what their own food does to their own blood sugar, on their phone. I'll come back to that.</w:t>
+        <w:t>On screen: The sugar slide, Omri's build in the same 3D language, three panels on one object: Spike (a glucose curve jumping after a meal), Signal (insulin and the nutrient-sensing pathways switching on; deregulated nutrient sensing is one of the twelve hallmarks of aging), Scar (sugar bonding to proteins, glycation; HbA1c is the measured version of this). Approved slide, model added. Small: López-Otín et al., Cell 2023; Uribarri et al., 2010. Final build: the object dims and two large checkboxes appear, Move dinner earlier and Rebuild one plate, under one word: Monday.</w:t>
+      </w:r>
+    </w:p>
+    <w:p>
+      <w:r>
+        <w:t>There are a hundred diets out there, and every one of them argues with the other ninety-nine. You have to find yours. But there's one thing every single one of them agrees on, and it's on the screen. Sugar is bad for aging. Here's the model in three words. Spike, signal, scar. A spike is what you see on a glucose monitor after a sugary meal. The signal is what the spike turns on inside you: insulin and the nutrient-sensing pathways, and when they're on all day, every day, that's one of the twelve recognized hallmarks of aging. And the scar is the part people don't know: sugar sticks to proteins, a process called glycation, and the HbA1c test your doctor already runs is literally a measure of sugar stuck to your red blood cells. [López-Otín et al., Cell 2023; confirm the wording] What I do about it is simple. [one sentence: when you cut sugar and what you keep] In the Academy, every student wears a glucose monitor for two weeks and watches what their own food does to their own blood sugar, on their phone. I'll come back to that.</w:t>
       </w:r>
     </w:p>
     <w:p>
@@ -585,12 +590,12 @@
           <w:color w:val="5B6472"/>
           <w:sz w:val="22"/>
         </w:rPr>
-        <w:t>On screen: The cake, movement lit, for one breath. Then the photograph: two people, full height, the same age, side by side, same light, same background. One stands tall. One leans on a cane. Two words, cream, centered low. Approved visual, unchanged.</w:t>
-      </w:r>
-    </w:p>
-    <w:p>
-      <w:r>
-        <w:t>Third layer. Movement. I'm not going to demonstrate a workout. I want to show you one picture. Two people. Same age. One stands tall. One leans on a cane. Not everything that puts a person on a cane is a choice, and I would never say it was. But a great deal of what keeps you off one is a weekly pattern, and that pattern is a choice you can make this week. [confirm you're comfortable with this framing]</w:t>
+        <w:t>On screen: The cake, movement lit, for one breath. Then the photograph: two people, full height, the same age, side by side, same light, same background. One stands tall. One leans on a cane. Two words, cream, centered low. Approved visual, unchanged. Under each figure, a bar: years lived, and years lived well. The gap between them is about twelve years. Small: WHO, healthy life expectancy, United States, 2019.</w:t>
+      </w:r>
+    </w:p>
+    <w:p>
+      <w:r>
+        <w:t>Third layer. Movement. I'm not going to demonstrate a workout. I want to show you one picture. Two people. Same age. One stands tall. One leans on a cane. Not everything that puts a person on a cane is a choice, and I would never say it was. But a great deal of what keeps you off one is a weekly pattern, and that pattern is a choice you can make this week. [confirm you're comfortable with this framing] Here's the number behind the picture. In America, life expectancy is about seventy-eight. Healthy life expectancy, the years you live without serious illness or disability, is about sixty-six. Twelve years, on average, at the end, in poor health. Those twelve years are what this layer is about. [WHO 2019 figures; confirm]</w:t>
       </w:r>
     </w:p>
     <w:p>
@@ -606,7 +611,7 @@
           <w:color w:val="1E6FFF"/>
           <w:sz w:val="29"/>
         </w:rPr>
-        <w:t>Slide 12 | YOUR BODY HAS FOUR JOBS FOR YOU. | 3:00</w:t>
+        <w:t>Slide 12 | YOUR BODY HAS FOUR JOBS FOR YOU. | 3:30</w:t>
       </w:r>
     </w:p>
     <w:p>
@@ -619,7 +624,7 @@
           <w:color w:val="5B6472"/>
           <w:sz w:val="22"/>
         </w:rPr>
-        <w:t>On screen: The body map: a translucent figure in profile, four points lighting as you name them, bones and muscle, heart, heart, brain. Four tiles to the right, one per type: Weights. VO2 max. Zone 2. Mobility and balance. [a source per tile if you want a claim on screen] The macro slide: the four types, before any detail.</w:t>
+        <w:t>On screen: The body map: a translucent figure in profile, four points lighting as you name them, bones and muscle, heart, heart, brain. Four tiles to the right, each with the number researchers use to predict how long you live: Weights, grip strength (Leong et al., Lancet 2015). VO2 max, fitness (Mandsager et al., JAMA Network Open 2018). Zone 2, steps a day (Paluch et al., JAMA Network Open 2021). Mobility and balance, the ten-second one-leg stand (Araujo et al., British Journal of Sports Medicine 2022). The macro slide: the four types, before any detail.</w:t>
       </w:r>
     </w:p>
     <w:p>
@@ -630,6 +635,11 @@
     <w:p>
       <w:r>
         <w:t>Weights. That's resistance training, your muscles working against a load. I build mine around compound lifts, movements that use several joints at once. That one serves your bones and your muscle. VO2 max. That's how much oxygen your body can use when you're working hard. It sounds scary, and I'll admit it's not what gets me out of bed. That one serves your heart. Zone 2. Easy cardio at a conversational pace. If you can chat with a friend while you do it, you're about right. Also the heart. And mobility and balance. Your joints through their full range, and staying steady on your feet. It's the one everybody forgets. It serves your brain as much as your body, and it's the one that keeps you doing the other three at eighty. If you're a runner, add the weights. If you're a lifter, add the easy cardio. That's all I'm asking.</w:t>
+      </w:r>
+    </w:p>
+    <w:p>
+      <w:r>
+        <w:t>And each tile has a number attached, one that researchers have used to predict how long people live. Grip strength: in a study of a hundred and forty thousand people across seventeen countries, every five kilos of grip you lose came with a sixteen percent higher risk of dying. Fitness: at the Cleveland Clinic, among a hundred and twenty-two thousand patients, being unfit was a bigger risk than smoking. Steps: seven thousand a day cut the risk of death by half or more over ten years, in people in their forties. And balance: in a study of adults between fifty-one and seventy-five, the people who couldn't stand on one leg for ten seconds had an eighty-four percent higher risk of dying in the next decade. Try it tonight. Ten seconds. Shoes off. [Leong 2015; Mandsager 2018; Paluch 2021; Araujo 2022; confirm the figures before you say them]</w:t>
       </w:r>
     </w:p>
     <w:p>
@@ -645,7 +655,7 @@
           <w:color w:val="1E6FFF"/>
           <w:sz w:val="29"/>
         </w:rPr>
-        <w:t>Slide 13 | THREE STRENGTH. TWO ZONE 2. ONE SPRINT. 8,000 STEPS. | 2:00</w:t>
+        <w:t>Slide 13 | THREE STRENGTH. TWO ZONE 2. ONE SPRINT. 8,000 STEPS. | 1:30</w:t>
       </w:r>
     </w:p>
     <w:p>
@@ -692,12 +702,12 @@
           <w:color w:val="5B6472"/>
           <w:sz w:val="22"/>
         </w:rPr>
-        <w:t>On screen: The cake, stress lit, held for the whole story; no graph, no numbers. Then the breath: two short arcs in through the nose, one long arc out through the mouth, animating at speaking pace as you lead it. [verify the technique and the source you want to cite]</w:t>
-      </w:r>
-    </w:p>
-    <w:p>
-      <w:r>
-        <w:t>Fourth layer. Stress. It's the one people skip, and I want to tell you how I found out it was real, because I didn't read it in a book. A few years ago I went through a divorce. [confirm the timing] Somewhere in the middle of it I had a test done, and my cortisol, the stress hormone, was high. [confirm what was measured] I'm an engineer. A high number is a problem to solve. I didn't buy anything. I found a transcendental meditation center, I learned it, and about six months later the number was back where it belonged and it stayed there.</w:t>
+        <w:t>On screen: The cake, stress lit, held for the whole story; no graph, no numbers. Then the breath: two short arcs in through the nose, one long arc out through the mouth, animating at speaking pace as you lead it. Small: Balban, Spiegel and Huberman, Cell Reports Medicine 2023, 111 people, five minutes a day for a month.</w:t>
+      </w:r>
+    </w:p>
+    <w:p>
+      <w:r>
+        <w:t>Fourth layer. Stress. It's the one people skip, and I want to tell you how I found out it was real, because I didn't read it in a book. A few years ago I went through a divorce. [confirm the timing] Somewhere in the middle of it I had a test done, and my cortisol, the stress hormone, was high. [confirm what was measured] Stress hormones are built for short bursts. When they never switch off, they wear the body down; researchers call it allostatic load. [McEwen, New England Journal of Medicine 1998] I'm an engineer. A high number is a problem to solve. I didn't buy anything. I found a transcendental meditation center, I learned it, and about six months later the number was back where it belonged and it stayed there.</w:t>
       </w:r>
     </w:p>
     <w:p>
@@ -707,7 +717,7 @@
     </w:p>
     <w:p>
       <w:r>
-        <w:t>And I want to send you home with one free tool. It's called the physiological sigh. [verify attribution before naming anyone] Two short breaths in through the nose, then one long, slow breath out through the mouth. Let's do three together, cameras on. In, in, out. Again. One more. If anyone feels lightheaded, stop and breathe normally. That took about thirty seconds, and it cost you nothing. Keep it in your back pocket for the next meeting that goes badly.</w:t>
+        <w:t>And I want to send you home with one free tool. It's called the physiological sigh, and it's the best-studied breath I know of: a Stanford team tested it on a hundred and eleven people, five minutes a day for a month, and it improved mood more than mindfulness meditation did, and lowered their resting breathing rate. [Balban et al., Cell Reports Medicine 2023] Two short breaths in through the nose, then one long, slow breath out through the mouth. Let's do three together, cameras on. In, in, out. Again. One more. If anyone feels lightheaded, stop and breathe normally. That took about thirty seconds, and it cost you nothing. Keep it in your back pocket for the next meeting that goes badly.</w:t>
       </w:r>
     </w:p>
     <w:p>
@@ -752,12 +762,12 @@
           <w:color w:val="5B6472"/>
           <w:sz w:val="22"/>
         </w:rPr>
-        <w:t>On screen: The day ring: your day as a clock, 5 AM to 9 PM, each hour colored by its layer, 9 PM at the top so the eye starts at bedtime. Large hour marks: 5 wake, 7 gym and sauna, 8 window opens, 10 coffee closes, midday biggest meal and walk, afternoon meditation, 6 last meal, 8 screens off, 9 lights out. The one-page schedule people were promised. They screenshot this one.</w:t>
-      </w:r>
-    </w:p>
-    <w:p>
-      <w:r>
-        <w:t>Now let's put the layers into a day, because a day is where they fight each other for the same hour. Five. Wake. Water first, then light. [how you get light: outside, or blinds] Seven, the gym, then the sauna, which we've established is the real reason I show up. [confirm your training time] Eight, the eating window opens. Ten, coffee closes. Midday, work, my biggest meal, and the walk after it. [confirm] Afternoon, meditation. [confirm when] Six, last meal. Eight, screens off. Nine, lights out.</w:t>
+        <w:t>On screen: The day ring: your day as a clock, 5 AM to 9 PM, each hour colored by its layer, 9 PM at the top so the eye starts at bedtime. Large hour marks: 5 wake, 7 gym and sauna, 8 window opens, 10 coffee closes, midday biggest meal and walk, afternoon meditation, 6 last meal, 8 screens off, 9 lights out. The one-page schedule people were promised. The ten hours from 8 to 6 shaded as one band: the eating window. Small: Wilkinson et al., Cell Metabolism 2020, the Salk Institute. They screenshot this one.</w:t>
+      </w:r>
+    </w:p>
+    <w:p>
+      <w:r>
+        <w:t>Now let's put the layers into a day, because a day is where they fight each other for the same hour. Five. Wake. Water first, then light. [how you get light: outside, or blinds] Seven, the gym, then the sauna, which we've established is the real reason I show up. [confirm your training time] Eight, the eating window opens. Ten, coffee closes. That window, eight to six, is ten hours, and it isn't an accident: the Salk Institute's work on time-restricted eating used a ten-hour window and saw weight, blood pressure and cholesterol improve in twelve weeks. [Wilkinson et al., Cell Metabolism 2020; confirm] Midday, work, my biggest meal, and the walk after it. [confirm] Afternoon, meditation. [confirm when] Six, last meal. Eight, screens off. Nine, lights out.</w:t>
       </w:r>
     </w:p>
     <w:p>
@@ -846,7 +856,7 @@
           <w:color w:val="5B6472"/>
           <w:sz w:val="22"/>
         </w:rPr>
-        <w:t>On screen: The closing cake, every layer lit, the icing on top, turning slowly. Approved visual, unchanged. Build 2: the cake recedes and the ring of three rises: Why, Intention, Resources on a lit ring, a line between each pair; the center lights only when all three are on. Build 3: the Blueprint card in your video-card style, the Academy mark top center, two lines, "The same cake, built week by week," in cream and "with a teacher." in light blue. Final: Your why. Your intention. Your resources. One thing. Forty-eight hours. [link or QR]</w:t>
+        <w:t>On screen: The closing cake, every layer lit, the icing on top, turning slowly. Approved visual, unchanged. Build 2: two curves on one chart, how long we live and how long we live well, and the gap between them closing. Small: Fries, New England Journal of Medicine 1980, the compression of morbidity. Build 3: the cake recedes and the ring of three rises: Why, Intention, Resources on a lit ring, a line between each pair; the center lights only when all three are on. Build 4: the Blueprint card in your video-card style, the Academy mark top center, two lines, "The same cake, built week by week," in cream and "with a teacher." in light blue. Final: Your why. Your intention. Your resources. One thing. Forty-eight hours. [link or QR]</w:t>
       </w:r>
     </w:p>
     <w:p>
@@ -856,7 +866,7 @@
     </w:p>
     <w:p>
       <w:r>
-        <w:t>What's my why? Mine isn't a leaderboard. It's a kid who needs his mom to show up for a long time. [your words] A why is a direction. It tells you which way to walk. It doesn't tell you how far or how fast. What's my intention? That's the thing you'd write on the wall. Mine is one sentence: I want my healthspan to match my lifespan. Every year I'm alive, I want to be able to use. You can measure that. And what are my resources? Time, money, energy. The real amounts, not the ones you wish you had. Mine are an hour in the morning and about twelve dollars a day. [confirm] Resources set the pace. They decide what you're still doing in March, when nobody's watching.</w:t>
+        <w:t>What's my why? Mine isn't a leaderboard. It's a kid who needs his mom to show up for a long time. [your words] A why is a direction. It tells you which way to walk. It doesn't tell you how far or how fast. What's my intention? That's the thing you'd write on the wall. Mine is one sentence: I want my healthspan to match my lifespan. There's a drawing from 1980 by a Stanford doctor named James Fries that says it better than I can: two lines, how long you live and how long you live well. Most of medicine pushes the first line out. The point is to drag the second one up to meet it. [Fries, New England Journal of Medicine 1980] Every year I'm alive, I want to be able to use. You can measure that. And what are my resources? Time, money, energy. The real amounts, not the ones you wish you had. Mine are an hour in the morning and about twelve dollars a day. [confirm] Resources set the pace. They decide what you're still doing in March, when nobody's watching.</w:t>
       </w:r>
     </w:p>
     <w:p>
@@ -945,7 +955,7 @@
           <w:color w:val="1E6FFF"/>
           <w:sz w:val="29"/>
         </w:rPr>
-        <w:t>Slide 1 | HOW DOES SOMEONE AGE EIGHT MONTHS A YEAR ON TWELVE DOLLARS A DAY? | 2:00</w:t>
+        <w:t>Slide 1 | HOW DOES SOMEONE AGE EIGHT MONTHS A YEAR ON TWELVE DOLLARS A DAY? | 1:30</w:t>
       </w:r>
     </w:p>
     <w:p>
@@ -1036,7 +1046,7 @@
           <w:color w:val="5B6472"/>
           <w:sz w:val="22"/>
         </w:rPr>
-        <w:t>On screen: First the plain line, huge, cream: Ten years pass. By this test, I age about six. Nothing else, so the room gets the point before any science. Then the gauge rises, hero size: dark glass face, 1.0 at the top, needle glowing light blue at 0.65, cream ticks at 0.665 and 0.76, and the second beat of the headline in light blue: The speed towards death. Build: the needle sweeps down to 0.65 as you say it, then up to 0.76. Approved visual, unchanged.</w:t>
+        <w:t>On screen: First the plain line, huge, cream: Ten years pass. By this test, I age about six. Nothing else, so the room gets the point before any science. Then the gauge rises, hero size: dark glass face, 1.0 at the top, needle glowing light blue at 0.65, cream ticks at 0.665 and 0.76, and the second beat of the headline in light blue: The speed towards death. Build: the needle sweeps down to 0.65 as you say it, then up to 0.76. Approved visual, unchanged. Final build: the pace-of-aging curve from the study behind the test, a soft bell drawn over the gauge: most people near 1.0, a few near zero, a tail out to three years per year, your 0.665 marked on it. Small: Belsky et al., PNAS 2015.</w:t>
       </w:r>
     </w:p>
     <w:p>
@@ -1046,7 +1056,7 @@
     </w:p>
     <w:p>
       <w:r>
-        <w:t>The test is called DunedinPACE. It reads your blood and estimates how fast your body is aging right now. The scientists call it pace of aging. I call it your speed towards death, because that's what it is, and because it got my attention. A score of 1.0 means one year of aging for every calendar year, which is what most people do. [check against the provider's wording] In 2023 my best score was 0.65. That score put me second in the Rejuvenation Olympics, a global leaderboard of about [number] people, ahead of some very well-funded programs. Average my three tests and I land at 0.665. That's the more honest number, so you get both.</w:t>
+        <w:t>The test is called DunedinPACE. It reads your blood and estimates how fast your body is aging right now. The scientists call it pace of aging. I call it your speed towards death, because that's what it is, and because it got my attention. A score of 1.0 means one year of aging for every calendar year, which is what most people do. [check against the provider's wording] In 2023 my best score was 0.65. That score put me second in the Rejuvenation Olympics, a global leaderboard of about [number] people, ahead of some very well-funded programs. Average my three tests and I land at 0.665. That's the more honest number, so you get both. And so you know this isn't a vanity number: in the study that built this test, 954 people, all aged 38, were measured. Most were aging about a year per year. A few were close to zero. And some were aging close to three years for every year on the calendar. [Belsky et al., PNAS 2015; confirm you are comfortable citing it]</w:t>
       </w:r>
     </w:p>
     <w:p>
@@ -1067,7 +1077,7 @@
           <w:color w:val="1E6FFF"/>
           <w:sz w:val="29"/>
         </w:rPr>
-        <w:t>Slide 4 | FOUR LAYERS DO THE WORK. LONGEVITY IS LIKE A CAKE. | 1:00</w:t>
+        <w:t>Slide 4 | FOUR LAYERS DO THE WORK. LONGEVITY IS LIKE A CAKE. | 1:30</w:t>
       </w:r>
     </w:p>
     <w:p>
@@ -1080,12 +1090,12 @@
           <w:color w:val="5B6472"/>
           <w:sz w:val="22"/>
         </w:rPr>
-        <w:t>On screen: The cake, hero size, turning slowly, every layer lit evenly this once: Sleep, Food, Movement, Stress Management, the thin layer, the icing labeled Therapies, exactly as you drew it. Approved visual, unchanged. It returns at the start of each layer, that layer lit.</w:t>
-      </w:r>
-    </w:p>
-    <w:p>
-      <w:r>
-        <w:t>So what moved the number? Here's the model I use for everything. Longevity is like a cake. Four layers: sleep, food, movement, and stress management. Most of the work lives there. For women there's one more thin layer, and I'll come to it in a few minutes. On top is the icing: sauna, IVs, peptides, the pill with the exciting name. Icing is delightful. Nobody has ever eaten a bowl of icing and called it a cake. Part one is about telling the two apart.</w:t>
+        <w:t>On screen: First build, one root and four branches: Aging at the root, and heart disease, cancer, dementia, type 2 diabetes on the branches. Small: the geroscience hypothesis, Kennedy et al., Cell 2014. Then the cake, hero size, turning slowly, every layer lit evenly this once: Sleep, Food, Movement, Stress Management, the thin layer, the icing labeled Therapies, exactly as you drew it. Approved visual, unchanged. It returns at the start of each layer, that layer lit.</w:t>
+      </w:r>
+    </w:p>
+    <w:p>
+      <w:r>
+        <w:t>Before the how, one picture of why anyone bothers. Aging is the biggest risk factor for the four things we're all afraid of: heart disease, cancer, dementia, type 2 diabetes. Slow the aging itself and you push all four back at once. That's the whole bet of a field called geroscience, and it's the bet I made. [Kennedy et al., Cell 2014; the Buck Institute's founding idea] So what moved the number? Here's the model I use for everything. Longevity is like a cake. Four layers: sleep, food, movement, and stress management. Most of the work lives there. For women there's one more thin layer, and I'll come to it in a few minutes. On top is the icing: sauna, IVs, peptides, the pill with the exciting name. Icing is delightful. Nobody has ever eaten a bowl of icing and called it a cake. Part one is about telling the two apart.</w:t>
       </w:r>
     </w:p>
     <w:p>
@@ -1130,7 +1140,7 @@
           <w:color w:val="5B6472"/>
           <w:sz w:val="22"/>
         </w:rPr>
-        <w:t>On screen: The cost rail, left to right, climbing: glass markers for Sauna, Prebiotics and most supplements, NAD drips, Peptides, Stem cells, Rapamycin with a doctor, and one tall marker at the end, the two-million-a-year program. [confirm the order] Build 2: four markers turn amber and a line appears above them, "Four things not worth your money. Yet." Build 3: the sauna marker glows warm. Build 4: a single coin at the far left, "Twelve dollars a day."</w:t>
+        <w:t>On screen: The cost map rises: a two-by-two, cost left to right, strength of human evidence bottom to top, glass markers placed on it: Sauna (cheap, twenty years of data), Prebiotics and most supplements (cheap, depends on a test), NAD drips, Peptides, Stem cells (expensive, thin human evidence), Rapamycin with a doctor (prescription, strong animal data, human trials under way), and one marker off the chart at the far right, the two-million-a-year program. [confirm the placements] Small, under the sauna marker: Laukkanen et al., JAMA Internal Medicine 2015. Build 2: four markers turn amber and a line appears above them, "Four things not worth your money. Yet." Build 3: the sauna marker glows warm. Build 4: a single coin at the far left, "Twelve dollars a day."</w:t>
       </w:r>
     </w:p>
     <w:p>
@@ -1145,7 +1155,7 @@
     </w:p>
     <w:p>
       <w:r>
-        <w:t>The one piece of icing I actually use is the cheapest one. Sauna, three to five days a week, at my gym. And I'll tell you a secret that will horrify every personal trainer on this call: the sauna is what gets me out of bed. It's never the thought of a VO2 max workout. I get up for the sauna, and the workout happens to be on the way. There's research on sauna and I'll point you to the sources I trust rather than quote from memory. [sources from your From Paper to Plate episode, exact figures only] A quick safety note: heart or blood pressure concerns, ask your doctor first, and drink water.</w:t>
+        <w:t>The one piece of icing I actually use is the cheapest one. Sauna, three to five days a week, at my gym. And I'll tell you a secret that will horrify every personal trainer on this call: the sauna is what gets me out of bed. It's never the thought of a VO2 max workout. I get up for the sauna, and the workout happens to be on the way. And it's the one piece of icing with serious long-term data behind it. A Finnish study followed 2,315 men for about twenty years. The men who used a sauna four to seven times a week had a forty percent lower risk of dying from any cause than the men who went once a week. [Laukkanen et al., JAMA Internal Medicine 2015; add your own From Paper to Plate sources if you prefer] A quick safety note: heart or blood pressure concerns, ask your doctor first, and drink water.</w:t>
       </w:r>
     </w:p>
     <w:p>
@@ -1179,12 +1189,12 @@
           <w:color w:val="5B6472"/>
           <w:sz w:val="22"/>
         </w:rPr>
-        <w:t>On screen: The cake returns, the thin layer glowing light blue, everything else dark. One small line beneath: The Menopause Society. Find a certified practitioner. [URL] Final build: the four layers light one after another from the bottom, the icing dims, and three words appear beside them as you say them, Sleep, Food, Movement, with a fourth in light blue, Stress, and one line: the layer that makes the other three possible. The three inputs the site promised, as the bridge into part two.</w:t>
-      </w:r>
-    </w:p>
-    <w:p>
-      <w:r>
-        <w:t>One thing gets filed under icing that doesn't belong there. Menopause therapy. For half of this room, menopause will change your sleep, your bones, your mood, and your body composition, and it changes how well every other layer can work. That is not icing. That's a thin layer of the cake, and it deserves the same seriousness as the other four. [your own path, one or two sentences, as much as you choose] The action is one line: find a doctor through the Menopause Society, which keeps a directory of certified practitioners. [confirm naming it] On this one I'll say it twice. Your doctor. Not a webinar.</w:t>
+        <w:t>On screen: The cake returns, the thin layer glowing light blue, everything else dark. One small line beneath: The Menopause Society. Find a certified practitioner. [URL] Second build: a short timeline, menopause to ten years after, labeled the window. Small: The Menopause Society, 2022 Hormone Therapy Position Statement. Final build: the four layers light one after another from the bottom, the icing dims, and three words appear beside them as you say them, Sleep, Food, Movement, with a fourth in light blue, Stress, and one line: the layer that makes the other three possible. The three inputs the site promised, as the bridge into part two.</w:t>
+      </w:r>
+    </w:p>
+    <w:p>
+      <w:r>
+        <w:t>One thing gets filed under icing that doesn't belong there. Menopause therapy. For half of this room, menopause will change your sleep, your bones, your mood, and your body composition, and it changes how well every other layer can work. That is not icing. That's a thin layer of the cake, and it deserves the same seriousness as the other four. The Menopause Society's own position, updated in 2022, is that for healthy women with symptoms who are under sixty, or within ten years of menopause, the benefits of hormone therapy generally outweigh the risks. That's their sentence, not mine, and it's why the next line matters. [The Menopause Society, 2022 Position Statement; confirm you want to state it] [your own path, one or two sentences, as much as you choose] The action is one line: find a doctor through the Menopause Society, which keeps a directory of certified practitioners. [confirm naming it] On this one I'll say it twice. Your doctor. Not a webinar.</w:t>
       </w:r>
     </w:p>
     <w:p>
@@ -1234,12 +1244,12 @@
           <w:color w:val="5B6472"/>
           <w:sz w:val="22"/>
         </w:rPr>
-        <w:t>On screen: The cake, sleep lit, for the first sentence. Then the night arc, 9 PM on the left to 5 AM on the right, moon to sun, the five numbers the only type: Lights out 9:00 PM. Up 5:00 AM. Last meal three hours before bed. Screens off one hour before bed. An eight-hour opportunity, cool and dark.</w:t>
-      </w:r>
-    </w:p>
-    <w:p>
-      <w:r>
-        <w:t>Sleep is the bottom layer, and I think of it as the repair shift: the time your body does its maintenance while you're not in the way. If I skimp on it, everything I do on the other three layers works harder and pays me back less. I'm going to give you exact numbers, because I find vague advice impossible to follow. "Get good sleep" has never once told me what to do at 8:45 on a Tuesday night.</w:t>
+        <w:t>On screen: The cake, sleep lit, for the first sentence. Then the night arc, 9 PM on the left to 5 AM on the right, moon to sun, the five numbers the only type: Lights out 9:00 PM. Up 5:00 AM. Last meal three hours before bed. Screens off one hour before bed. An eight-hour opportunity, cool and dark. Build between the numbers: a band across the deepest part of the night labeled the repair shift. Small: Xie et al., Science 2013; Fultz et al., Science 2019.</w:t>
+      </w:r>
+    </w:p>
+    <w:p>
+      <w:r>
+        <w:t>Sleep is the bottom layer, and I think of it as the repair shift: the time your body does its maintenance while you're not in the way. That's not a metaphor, by the way. In 2013 a team at the University of Rochester showed that during deep sleep the brain's drainage system opens up and flushes out the day's waste, and in 2019 a Boston team watched the same rhythm in sleeping humans. [Xie et al., Science 2013; Fultz et al., Science 2019] If I skimp on it, everything I do on the other three layers works harder and pays me back less. I'm going to give you exact numbers, because I find vague advice impossible to follow. "Get good sleep" has never once told me what to do at 8:45 on a Tuesday night.</w:t>
       </w:r>
     </w:p>
     <w:p>
@@ -1307,12 +1317,12 @@
           <w:color w:val="5B6472"/>
           <w:sz w:val="22"/>
         </w:rPr>
-        <w:t>On screen: The cake, food lit, for the opening. Then the plate, seen from above, three parts, one line each: Protein is the floor. Fiber is the lever. Whole food is the default. Final build: five numbers around the rim: One pound of vegetables a day. One gram of protein per pound of goal bodyweight. Eating window 8:00 AM to 6:00 PM. Coffee cutoff 10:00 AM. Zero alcohol on training days.</w:t>
-      </w:r>
-    </w:p>
-    <w:p>
-      <w:r>
-        <w:t>Now food, and first, the type of diet. Vegan, keto, Mediterranean, carnivore. It isn't about the type. I've been vegan; I've been most things. [confirm] People need to take the religion out of their diet and look at the plate. I think of mine in three parts. Protein is the floor; I make sure it's there at every meal. Fiber is the lever, which is where the vegetables come in. And whole food is the default: when I have a choice, I pick the thing that looks like it came from the ground or an animal, not from a factory.</w:t>
+        <w:t>On screen: The cake, food lit, for the opening. Then the plate, seen from above, three parts, one line each: Protein is the floor. Fiber is the lever. Whole food is the default. Final build: five numbers around the rim: One pound of vegetables a day. One gram of protein per pound of goal bodyweight. Eating window 8:00 AM to 6:00 PM. Coffee cutoff 10:00 AM. Zero alcohol on training days. Beside the plate, two numbers: the fiber target, 25 to 38 grams a day, and the average American, about 15. Small: Dietary Guidelines for Americans; Quagliani and Felt-Gunderson, 2017.</w:t>
+      </w:r>
+    </w:p>
+    <w:p>
+      <w:r>
+        <w:t>Now food, and first, the type of diet. Vegan, keto, Mediterranean, carnivore. It isn't about the type. I've been vegan; I've been most things. [confirm] People need to take the religion out of their diet and look at the plate. I think of mine in three parts. Protein is the floor; I make sure it's there at every meal. Fiber is the lever, which is where the vegetables come in. Here's why it's the lever: the target is 25 to 38 grams a day, and the average American gets about 15. Almost nobody is hitting it, which means almost everybody has room. [Dietary Guidelines for Americans; Quagliani and Felt-Gunderson, 2017] And whole food is the default: when I have a choice, I pick the thing that looks like it came from the ground or an animal, not from a factory.</w:t>
       </w:r>
     </w:p>
     <w:p>
@@ -1346,12 +1356,12 @@
           <w:color w:val="5B6472"/>
           <w:sz w:val="22"/>
         </w:rPr>
-        <w:t>On screen: The sugar slide, Omri's build in the same 3D language: how sugar affects aging, one idea, one object. Approved, unchanged. Final build: the object dims and two large checkboxes appear, Move dinner earlier and Rebuild one plate, under the words: Two changes for Monday.</w:t>
-      </w:r>
-    </w:p>
-    <w:p>
-      <w:r>
-        <w:t>There are so many diets out there, and everyone needs to find what works for them. But there's one thing every one of them agrees on: sugar is bad for aging. The slide carries the biology, so I'll give you the practical part. [one sentence: when you cut sugar and what you keep] In the Academy, every student wears a continuous glucose monitor for two weeks and sees what their own meals do to their own blood sugar. It's the fastest way I know to stop arguing about diets and start looking at your own data.</w:t>
+        <w:t>On screen: The sugar slide, Omri's build in the same 3D language, three panels on one object: Spike (a glucose curve jumping after a meal), Signal (insulin and the nutrient-sensing pathways switching on; deregulated nutrient sensing is one of the twelve hallmarks of aging), Scar (sugar bonding to proteins, glycation; HbA1c is the measured version of this). Approved slide, model added. Small: López-Otín et al., Cell 2023; Uribarri et al., 2010. Final build: the object dims and two large checkboxes appear, Move dinner earlier and Rebuild one plate, under the words: Two changes for Monday.</w:t>
+      </w:r>
+    </w:p>
+    <w:p>
+      <w:r>
+        <w:t>There are so many diets out there, and everyone needs to find what works for them. But there's one thing every one of them agrees on: sugar is bad for aging. Here's the model in three words. Spike, signal, scar. A spike is what you see on a glucose monitor after a sugary meal. The signal is what the spike turns on inside you: insulin and the nutrient-sensing pathways, and when they're on all day, every day, that's one of the twelve recognized hallmarks of aging. And the scar is the part people don't know: sugar sticks to proteins, a process called glycation, and the HbA1c test your doctor already runs is literally a measure of sugar stuck to your red blood cells. [López-Otín et al., Cell 2023; confirm the wording] Now the practical part. [one sentence: when you cut sugar and what you keep] In the Academy, every student wears a continuous glucose monitor for two weeks and sees what their own meals do to their own blood sugar. It's the fastest way I know to stop arguing about diets and start looking at your own data.</w:t>
       </w:r>
     </w:p>
     <w:p>
@@ -1401,12 +1411,12 @@
           <w:color w:val="5B6472"/>
           <w:sz w:val="22"/>
         </w:rPr>
-        <w:t>On screen: The cake, movement lit, for one breath. Then the photograph: two people, full height, the same age, side by side, same light, same background; one stands tall, one leans on a cane. Headline low, cream. Approved visual, unchanged.</w:t>
-      </w:r>
-    </w:p>
-    <w:p>
-      <w:r>
-        <w:t>Third layer, movement. I'm not going to demonstrate a workout. I want to start with why it matters, in one picture. Two people, the same age. One stands tall. One leans on a cane. Not everything that puts a person on a cane is a choice, and I would never say it was. But a great deal of what keeps you off one is a weekly pattern, and that pattern is a choice. [confirm the framing] Then I'll show you what belongs in that pattern, and then what my week looks like.</w:t>
+        <w:t>On screen: The cake, movement lit, for one breath. Then the photograph: two people, full height, the same age, side by side, same light, same background; one stands tall, one leans on a cane. Headline low, cream. Approved visual, unchanged. Under each figure, a bar: years lived, and years lived well. The gap between them is about twelve years. Small: WHO, healthy life expectancy, United States, 2019.</w:t>
+      </w:r>
+    </w:p>
+    <w:p>
+      <w:r>
+        <w:t>Third layer, movement. I'm not going to demonstrate a workout. I want to start with why it matters, in one picture. Two people, the same age. One stands tall. One leans on a cane. Not everything that puts a person on a cane is a choice, and I would never say it was. But a great deal of what keeps you off one is a weekly pattern, and that pattern is a choice. [confirm the framing] Here's the number behind the picture. In America, life expectancy is about seventy-eight. Healthy life expectancy, the years you live without serious illness or disability, is about sixty-six. Twelve years, on average, at the end, in poor health. Those twelve years are what this layer is about. [WHO 2019 figures; confirm] Then I'll show you what belongs in that pattern, and then what my week looks like.</w:t>
       </w:r>
     </w:p>
     <w:p>
@@ -1422,7 +1432,7 @@
           <w:color w:val="1E6FFF"/>
           <w:sz w:val="29"/>
         </w:rPr>
-        <w:t>Slide 12 | MOVEMENT: FOUR TYPES, FOUR JOBS. | 3:00</w:t>
+        <w:t>Slide 12 | MOVEMENT: FOUR TYPES, FOUR JOBS. | 3:30</w:t>
       </w:r>
     </w:p>
     <w:p>
@@ -1435,12 +1445,17 @@
           <w:color w:val="5B6472"/>
           <w:sz w:val="22"/>
         </w:rPr>
-        <w:t>On screen: The body map: a translucent figure in profile, four points lighting as you name them, bones and muscle, heart, heart, brain. Four tiles to the right: Weights. VO2 max. Zone 2. Mobility and balance. [a source per tile if you want claims on screen] The macro slide, before any detail.</w:t>
+        <w:t>On screen: The body map: a translucent figure in profile, four points lighting as you name them, bones and muscle, heart, heart, brain. Four tiles to the right, each with the number researchers use to predict how long you live: Weights, grip strength (Leong et al., Lancet 2015). VO2 max, fitness (Mandsager et al., JAMA Network Open 2018). Zone 2, steps a day (Paluch et al., JAMA Network Open 2021). Mobility and balance, the ten-second one-leg stand (Araujo et al., British Journal of Sports Medicine 2022). The macro slide, before any detail.</w:t>
       </w:r>
     </w:p>
     <w:p>
       <w:r>
         <w:t>I think of movement the way I'd think of an investment portfolio. If everything you own is in one stock, you're not diversified, you're just optimistic. Most people do one thing very well and ignore the other three. So, the four. Weights: resistance training, your muscles working against a load. I build mine around compound lifts, movements that use several joints at once. That serves your bones and muscle. VO2 max: how much oxygen your body can use when you're working hard. It sounds scary, and it's not what gets me out of bed. That serves the heart. Zone 2: easy cardio at a conversational pace; if you can chat while you do it, you're about right. Also the heart. And mobility and balance: joints through their full range, steady on your feet. It's the one everybody forgets, it serves your brain as much as your body, and it's the one that keeps you doing the other three. The common failure is cardio only or strength only. If you're a runner, add the weights. If you're a lifter, add the easy cardio.</w:t>
+      </w:r>
+    </w:p>
+    <w:p>
+      <w:r>
+        <w:t>And each tile has a number attached, one that researchers have used to predict how long people live. Grip strength: in a study of a hundred and forty thousand people across seventeen countries, every five kilos of grip you lose came with a sixteen percent higher risk of dying. Fitness: at the Cleveland Clinic, among a hundred and twenty-two thousand patients, being unfit was a bigger risk than smoking. Steps: seven thousand a day cut the risk of death by half or more over ten years, in people in their forties. And balance: in a study of adults between fifty-one and seventy-five, the people who couldn't stand on one leg for ten seconds had an eighty-four percent higher risk of dying in the next decade. Try it tonight. Ten seconds. Shoes off. [Leong 2015; Mandsager 2018; Paluch 2021; Araujo 2022; confirm the figures before you say them]</w:t>
       </w:r>
     </w:p>
     <w:p>
@@ -1456,7 +1471,7 @@
           <w:color w:val="1E6FFF"/>
           <w:sz w:val="29"/>
         </w:rPr>
-        <w:t>Slide 13 | MOVEMENT: MY WEEK, AND WHERE TO START. | 2:00</w:t>
+        <w:t>Slide 13 | MOVEMENT: MY WEEK, AND WHERE TO START. | 1:30</w:t>
       </w:r>
     </w:p>
     <w:p>
@@ -1503,17 +1518,17 @@
           <w:color w:val="5B6472"/>
           <w:sz w:val="22"/>
         </w:rPr>
-        <w:t>On screen: The cake, stress lit, held for the story; no graph, no numbers. Then the breath: two short arcs in through the nose, one long arc out through the mouth, animating at speaking pace as you lead it. [verify the technique and the source]</w:t>
-      </w:r>
-    </w:p>
-    <w:p>
-      <w:r>
-        <w:t>The fourth layer is stress, and it's the one most people skip. I'd have skipped it too, except that a number made me look. A few years ago I went through a divorce. [confirm the timing] In the middle of it I had a test done, and my cortisol, the stress hormone, was high. [confirm what was measured] I didn't buy anything. I went to a transcendental meditation center, learned the practice, and after about six months my cortisol was back to normal and stayed there. I want to be careful: that's my experience, not a promise. Many forms of meditation work. TM is the one I learned and stuck with. If another kind speaks to you, use that one. The best practice is the one you'll actually do. [optional, your call: "I don't recommend divorce as a stress test. But it did give me data."]</w:t>
-      </w:r>
-    </w:p>
-    <w:p>
-      <w:r>
-        <w:t>And one free tool to leave with. It's called the physiological sigh. [verify attribution before naming anyone] A double inhale through the nose, then one long, slow exhale through the mouth. Let's do three together, cameras on. Inhale, inhale, long exhale. Again. One more. If anyone feels lightheaded, stop and breathe normally. Thirty seconds, no cost. Keep it in your back pocket. That's part two: the four layers, in numbers. Part three puts them into one day.</w:t>
+        <w:t>On screen: The cake, stress lit, held for the story; no graph, no numbers. Then the breath: two short arcs in through the nose, one long arc out through the mouth, animating at speaking pace as you lead it. Small: Balban, Spiegel and Huberman, Cell Reports Medicine 2023, 111 people, five minutes a day for a month.</w:t>
+      </w:r>
+    </w:p>
+    <w:p>
+      <w:r>
+        <w:t>The fourth layer is stress, and it's the one most people skip. I'd have skipped it too, except that a number made me look. A few years ago I went through a divorce. [confirm the timing] In the middle of it I had a test done, and my cortisol, the stress hormone, was high. [confirm what was measured] Stress hormones are built for short bursts. When they never switch off, they wear the body down; researchers call it allostatic load. [McEwen, New England Journal of Medicine 1998] I didn't buy anything. I went to a transcendental meditation center, learned the practice, and after about six months my cortisol was back to normal and stayed there. I want to be careful: that's my experience, not a promise. Many forms of meditation work. TM is the one I learned and stuck with. If another kind speaks to you, use that one. The best practice is the one you'll actually do. [optional, your call: "I don't recommend divorce as a stress test. But it did give me data."]</w:t>
+      </w:r>
+    </w:p>
+    <w:p>
+      <w:r>
+        <w:t>And one free tool to leave with. It's called the physiological sigh, and it's the best-studied breath I know of: a Stanford team tested it on a hundred and eleven people, five minutes a day for a month, and it improved mood more than mindfulness meditation did, and lowered their resting breathing rate. [Balban et al., Cell Reports Medicine 2023] A double inhale through the nose, then one long, slow exhale through the mouth. Let's do three together, cameras on. Inhale, inhale, long exhale. Again. One more. If anyone feels lightheaded, stop and breathe normally. Thirty seconds, no cost. Keep it in your back pocket. That's part two: the four layers, in numbers. Part three puts them into one day.</w:t>
       </w:r>
     </w:p>
     <w:p>
@@ -1558,12 +1573,12 @@
           <w:color w:val="5B6472"/>
           <w:sz w:val="22"/>
         </w:rPr>
-        <w:t>On screen: The day ring: your day as a clock, 5 AM to 9 PM, each hour colored by its layer, 9 PM at the top. Large hour marks: 5 wake, 7 training and sauna, 8 window opens, 10 coffee closes, midday biggest meal and walk, afternoon meditation, 6 last meal, 8 screens off, 9 lights out. The one-page schedule people were promised. Final build: the ring slides left and two columns stand beside it, your device: What's transferable (the order of priorities; the numbers, as a menu) and What's just me (my clock).</w:t>
-      </w:r>
-    </w:p>
-    <w:p>
-      <w:r>
-        <w:t>Here's my day, so you can see where the layers fit and where they fight each other for the same hour. Five, wake. Water first, then light. [how you get light] Seven, training, then the sauna, which is the real reason I show up. [confirm the time] Eight, eating window opens. Ten, coffee cuts off. Midday, work and my biggest meal, followed by a walk. [confirm] Afternoon, meditation. [confirm when] Six, eating window closes; that's my last meal, three hours before bed. Eight, screens off; the wind-down begins. Nine, lights out.</w:t>
+        <w:t>On screen: The day ring: your day as a clock, 5 AM to 9 PM, each hour colored by its layer, 9 PM at the top. Large hour marks: 5 wake, 7 training and sauna, 8 window opens, 10 coffee closes, midday biggest meal and walk, afternoon meditation, 6 last meal, 8 screens off, 9 lights out. The one-page schedule people were promised. The ten hours from 8 to 6 shaded as one band: the eating window. Small: Wilkinson et al., Cell Metabolism 2020, the Salk Institute. Final build: the ring slides left and two columns stand beside it, your device: What's transferable (the order of priorities; the numbers, as a menu) and What's just me (my clock).</w:t>
+      </w:r>
+    </w:p>
+    <w:p>
+      <w:r>
+        <w:t>Here's my day, so you can see where the layers fit and where they fight each other for the same hour. Five, wake. Water first, then light. [how you get light] Seven, training, then the sauna, which is the real reason I show up. [confirm the time] Eight, eating window opens. Ten, coffee cuts off. That window, eight to six, is ten hours, and it isn't an accident: the Salk Institute's work on time-restricted eating used a ten-hour window and saw weight, blood pressure and cholesterol improve in twelve weeks. [Wilkinson et al., Cell Metabolism 2020; confirm] Midday, work and my biggest meal, followed by a walk. [confirm] Afternoon, meditation. [confirm when] Six, eating window closes; that's my last meal, three hours before bed. Eight, screens off; the wind-down begins. Nine, lights out.</w:t>
       </w:r>
     </w:p>
     <w:p>
@@ -1657,7 +1672,7 @@
           <w:color w:val="5B6472"/>
           <w:sz w:val="22"/>
         </w:rPr>
-        <w:t>On screen: The closing cake, all four layers labeled, the icing on top, turning slowly; each layer brightens as you give its sentence. Approved visual, unchanged. Build 2: the cake recedes and the ring of three rises: Why, Intention, Resources on a lit ring, a line between each pair; the center lights only when all three are on. Build 3: the Blueprint card in your video-card style, the Academy mark top center, "Eighteen weeks. Eighteen live sessions." in cream and "A class of eight to fifteen." in light blue. Final: Your why. Your intention. Your resources. One action, forty-eight hours. [link or QR]</w:t>
+        <w:t>On screen: The closing cake, all four layers labeled, the icing on top, turning slowly; each layer brightens as you give its sentence. Approved visual, unchanged. Build 2: two curves on one chart, how long we live and how long we live well, and the gap between them closing. Small: Fries, New England Journal of Medicine 1980, the compression of morbidity. Build 3: the cake recedes and the ring of three rises: Why, Intention, Resources on a lit ring, a line between each pair; the center lights only when all three are on. Build 4: the Blueprint card in your video-card style, the Academy mark top center, "Eighteen weeks. Eighteen live sessions." in cream and "A class of eight to fifteen." in light blue. Final: Your why. Your intention. Your resources. One action, forty-eight hours. [link or QR]</w:t>
       </w:r>
     </w:p>
     <w:p>
@@ -1667,7 +1682,7 @@
     </w:p>
     <w:p>
       <w:r>
-        <w:t>I've given you a lot of numbers, and I'll be honest: numbers aren't what kept me doing this for ten years. [confirm] Three questions did, and I run every decision through them. What's my why? Mine is my son; I want to be here for him for a long time. [your words] A why gives you a direction. What's my intention? Mine is one sentence: I want my healthspan to match my lifespan. Every year I'm alive, I want to be able to use. An intention gives you something you can measure. And what are my resources? Time, money, energy, the real amounts. Mine are an hour in the morning and about twelve dollars a day. [confirm] Resources set the pace. The three only work together. A why with no intention is a wish. An intention with no resources is a plan you quit in week six. Resources with no why are a gym membership you never use. Answer all three once, and you stop asking "what should I do" and start asking "does this fit." Sauna fits. Peptides don't, not for me, not right now. A nine o'clock bedtime fits.</w:t>
+        <w:t>I've given you a lot of numbers, and I'll be honest: numbers aren't what kept me doing this for ten years. [confirm] Three questions did, and I run every decision through them. What's my why? Mine is my son; I want to be here for him for a long time. [your words] A why gives you a direction. What's my intention? Mine is one sentence: I want my healthspan to match my lifespan. There's a drawing from 1980 by a Stanford doctor named James Fries that says it better than I can: two lines, how long you live and how long you live well. Most of medicine pushes the first line out. The point is to drag the second one up to meet it. [Fries, New England Journal of Medicine 1980] Every year I'm alive, I want to be able to use. An intention gives you something you can measure. And what are my resources? Time, money, energy, the real amounts. Mine are an hour in the morning and about twelve dollars a day. [confirm] Resources set the pace. The three only work together. A why with no intention is a wish. An intention with no resources is a plan you quit in week six. Resources with no why are a gym membership you never use. Answer all three once, and you stop asking "what should I do" and start asking "does this fit." Sauna fits. Peptides don't, not for me, not right now. A nine o'clock bedtime fits.</w:t>
       </w:r>
     </w:p>
     <w:p>
@@ -1746,7 +1761,7 @@
           <w:color w:val="1E6FFF"/>
           <w:sz w:val="29"/>
         </w:rPr>
-        <w:t>Slide 1 | WELCOME. I AM VERY NORMAL. | 2:30</w:t>
+        <w:t>Slide 1 | WELCOME. I AM VERY NORMAL. | 2:00</w:t>
       </w:r>
     </w:p>
     <w:p>
@@ -1842,7 +1857,7 @@
           <w:color w:val="5B6472"/>
           <w:sz w:val="22"/>
         </w:rPr>
-        <w:t>On screen: First the plain line, huge, cream: Ten years pass. By this test, I age about six. Nothing else, so the room gets the point before any science. Then the gauge rises, hero size: dark glass face, 1.0 at the top, needle glowing light blue at 0.65, cream ticks at 0.665 and 0.76, and the second beat of the headline in light blue: The speed towards death. Build: the needle sweeps down to 0.65 as you say it, then up to 0.76. Approved visual, unchanged.</w:t>
+        <w:t>On screen: First the plain line, huge, cream: Ten years pass. By this test, I age about six. Nothing else, so the room gets the point before any science. Then the gauge rises, hero size: dark glass face, 1.0 at the top, needle glowing light blue at 0.65, cream ticks at 0.665 and 0.76, and the second beat of the headline in light blue: The speed towards death. Build: the needle sweeps down to 0.65 as you say it, then up to 0.76. Approved visual, unchanged. Final build: the pace-of-aging curve from the study behind the test, a soft bell drawn over the gauge: most people near 1.0, a few near zero, a tail out to three years per year, your 0.665 marked on it. Small: Belsky et al., PNAS 2015.</w:t>
       </w:r>
     </w:p>
     <w:p>
@@ -1852,7 +1867,7 @@
     </w:p>
     <w:p>
       <w:r>
-        <w:t>The score behind that is called DunedinPACE. In plain language it estimates how fast your body is aging. The scientists say pace of aging. I say speed towards death, because it's the same thing and it's harder to ignore. A score of 1.0 means you're aging one year for every calendar year. [check against the provider's wording] My best score was 0.65. Average all three of my tests and I land at 0.665. That's the more honest number, so I'm giving you both.</w:t>
+        <w:t>The score behind that is called DunedinPACE. In plain language it estimates how fast your body is aging. The scientists say pace of aging. I say speed towards death, because it's the same thing and it's harder to ignore. A score of 1.0 means you're aging one year for every calendar year. [check against the provider's wording] My best score was 0.65. Average all three of my tests and I land at 0.665. That's the more honest number, so I'm giving you both. And so you know this isn't a vanity number: in the study that built this test, 954 people, all aged 38, were measured. Most were aging about a year per year. A few were close to zero. And some were aging close to three years for every year on the calendar. [Belsky et al., PNAS 2015; confirm you are comfortable citing it]</w:t>
       </w:r>
     </w:p>
     <w:p>
@@ -1873,7 +1888,7 @@
           <w:color w:val="1E6FFF"/>
           <w:sz w:val="29"/>
         </w:rPr>
-        <w:t>Slide 4 | LONGEVITY IS LIKE A CAKE. | 1:00</w:t>
+        <w:t>Slide 4 | LONGEVITY IS LIKE A CAKE. | 1:30</w:t>
       </w:r>
     </w:p>
     <w:p>
@@ -1886,12 +1901,12 @@
           <w:color w:val="5B6472"/>
           <w:sz w:val="22"/>
         </w:rPr>
-        <w:t>On screen: The cake, hero size, turning slowly, every layer lit evenly this once: Sleep, Food, Movement, Stress Management, the thin layer, the icing labeled Therapies, exactly as you drew it. Headline above, "cake" in light blue. Approved visual, unchanged. It returns at the start of each layer, lit.</w:t>
-      </w:r>
-    </w:p>
-    <w:p>
-      <w:r>
-        <w:t>Here's how I think about all of it. Longevity is like a cake. The cake is four things: sleep, food, movement, and stress management. That's where most of the work lives. For the women here, there's one more thin layer and I'll get to it. The icing is the fun stuff: sauna, and the fancy, expensive therapies. Icing is delightful. But nobody has ever eaten a bowl of icing and called it a cake. We're going to start with the icing, because that's what your feed is full of, and I want you to be able to relax about it. Then we'll build the cake.</w:t>
+        <w:t>On screen: First build, one root and four branches: Aging at the root, and heart disease, cancer, dementia, type 2 diabetes on the branches. Small: the geroscience hypothesis, Kennedy et al., Cell 2014. Then the cake, hero size, turning slowly, every layer lit evenly this once: Sleep, Food, Movement, Stress Management, the thin layer, the icing labeled Therapies, exactly as you drew it. Headline above, "cake" in light blue. Approved visual, unchanged. It returns at the start of each layer, lit.</w:t>
+      </w:r>
+    </w:p>
+    <w:p>
+      <w:r>
+        <w:t>Before the how, one picture of why anyone bothers. Aging is the biggest risk factor for the four things we're all afraid of: heart disease, cancer, dementia, type 2 diabetes. Slow the aging itself and you push all four back at once. That's the whole bet of a field called geroscience, and it's the bet I made. [Kennedy et al., Cell 2014; the Buck Institute's founding idea] Here's how I think about all of it. Longevity is like a cake. The cake is four things: sleep, food, movement, and stress management. That's where most of the work lives. For the women here, there's one more thin layer and I'll get to it. The icing is the fun stuff: sauna, and the fancy, expensive therapies. Icing is delightful. But nobody has ever eaten a bowl of icing and called it a cake. We're going to start with the icing, because that's what your feed is full of, and I want you to be able to relax about it. Then we'll build the cake.</w:t>
       </w:r>
     </w:p>
     <w:p>
@@ -1936,7 +1951,7 @@
           <w:color w:val="5B6472"/>
           <w:sz w:val="22"/>
         </w:rPr>
-        <w:t>On screen: The cake with only the icing lit, then it slides away and the cost rail rises, left to right, climbing: glass markers for Sauna, Prebiotics and most supplements, NAD drips, Peptides, Stem cells, Rapamycin with a doctor, and one tall marker at the end, the two-million-a-year program. [confirm the order] Build 2: four markers turn amber. Build 3: the sauna marker glows warm. Build 4: a single coin at the far left, "Twelve dollars a day." The rail is the list.</w:t>
+        <w:t>On screen: The cake with only the icing lit, then it slides away and the cost map rises: a two-by-two, cost left to right, strength of human evidence bottom to top, glass markers placed on it: Sauna (cheap, twenty years of data), Prebiotics and most supplements (cheap, depends on a test), NAD drips, Peptides, Stem cells (expensive, thin human evidence), Rapamycin with a doctor (prescription, strong animal data, human trials under way), and one marker off the chart at the far right, the two-million-a-year program. [confirm the placements] Small, under the sauna marker: Laukkanen et al., JAMA Internal Medicine 2015. Build 2: four markers turn amber. Build 3: the sauna marker glows warm. Build 4: a single coin at the far left, "Twelve dollars a day." The rail is the list.</w:t>
       </w:r>
     </w:p>
     <w:p>
@@ -1956,7 +1971,7 @@
     </w:p>
     <w:p>
       <w:r>
-        <w:t>Let me tell you about the therapy I actually use. I go to the sauna three to five days a week, at my gym. And I'll tell you a secret that will horrify every personal trainer on this call: the sauna is what gets me out of bed. It is never the thought of a VO2 max workout. Nobody has ever hopped out of bed at five excited about intervals. I get up for the sauna, and the workout happens to be on the way. There's research on sauna use, and I'll point you to the sources I trust rather than quoting numbers from memory. [one or two sources from your From Paper to Plate episode, exact figures only] Quick safety note: heart, blood pressure, or other medical concerns, check with your doctor before you start, and drink water.</w:t>
+        <w:t>Let me tell you about the therapy I actually use. I go to the sauna three to five days a week, at my gym. And I'll tell you a secret that will horrify every personal trainer on this call: the sauna is what gets me out of bed. It is never the thought of a VO2 max workout. Nobody has ever hopped out of bed at five excited about intervals. I get up for the sauna, and the workout happens to be on the way. And it's the one piece of icing with serious long-term data behind it. A Finnish study followed 2,315 men for about twenty years. The men who used a sauna four to seven times a week had a forty percent lower risk of dying from any cause than the men who went once a week. [Laukkanen et al., JAMA Internal Medicine 2015; add your own From Paper to Plate sources if you prefer] Quick safety note: heart, blood pressure, or other medical concerns, check with your doctor before you start, and drink water.</w:t>
       </w:r>
     </w:p>
     <w:p>
@@ -1990,12 +2005,12 @@
           <w:color w:val="5B6472"/>
           <w:sz w:val="22"/>
         </w:rPr>
-        <w:t>On screen: The cake returns, the thin layer glowing light blue, everything else dark. One small line beneath: The Menopause Society. Find a certified practitioner. [URL] Final build: the four layers light one after another, bottom to top, the icing dims, and the headline changes to: Four layers hold up the cake.</w:t>
-      </w:r>
-    </w:p>
-    <w:p>
-      <w:r>
-        <w:t>Before we bake, one thing that gets filed under icing by mistake, usually by people who've never been through it. Menopause therapy. For half of this room, menopause will change your sleep, your bones, your mood, and the shape of your body, and it changes how well every other layer can do its job. Decoration doesn't do that. This is a thin layer of the cake. [your own path, one or two sentences, as much as you choose] The action is one line: find a doctor through the Menopause Society. They keep a directory of certified practitioners. [confirm naming it] This is the one place tonight I'll say it twice. Your doctor. Not a webinar.</w:t>
+        <w:t>On screen: The cake returns, the thin layer glowing light blue, everything else dark. One small line beneath: The Menopause Society. Find a certified practitioner. [URL] Second build: a short timeline, menopause to ten years after, labeled the window. Small: The Menopause Society, 2022 Hormone Therapy Position Statement. Final build: the four layers light one after another, bottom to top, the icing dims, and the headline changes to: Four layers hold up the cake.</w:t>
+      </w:r>
+    </w:p>
+    <w:p>
+      <w:r>
+        <w:t>Before we bake, one thing that gets filed under icing by mistake, usually by people who've never been through it. Menopause therapy. For half of this room, menopause will change your sleep, your bones, your mood, and the shape of your body, and it changes how well every other layer can do its job. Decoration doesn't do that. This is a thin layer of the cake. The Menopause Society's own position, updated in 2022, is that for healthy women with symptoms who are under sixty, or within ten years of menopause, the benefits of hormone therapy generally outweigh the risks. That's their sentence, not mine, and it's why the next line matters. [The Menopause Society, 2022 Position Statement; confirm you want to state it] [your own path, one or two sentences, as much as you choose] The action is one line: find a doctor through the Menopause Society. They keep a directory of certified practitioners. [confirm naming it] This is the one place tonight I'll say it twice. Your doctor. Not a webinar.</w:t>
       </w:r>
     </w:p>
     <w:p>
@@ -2045,12 +2060,12 @@
           <w:color w:val="5B6472"/>
           <w:sz w:val="22"/>
         </w:rPr>
-        <w:t>On screen: The cake, sleep lit, for the first sentence. Then the night arc, 9 PM on the left to 5 AM on the right, moon to sun, the five numbers the only type: Lights out 9:00 PM. Up 5:00 AM. Last meal three hours before bed. Screens off one hour before bed. An eight-hour opportunity, cool and dark.</w:t>
-      </w:r>
-    </w:p>
-    <w:p>
-      <w:r>
-        <w:t>Let's start at the bottom of the cake with sleep. I think of sleep as the repair shift, the time your body does its maintenance while you're not in the way. If I skimp on it, everything I do on the other three layers works harder and pays me back less. I'm going to give you my exact numbers, because I find vague advice impossible to follow. "Get good sleep" has never once told me what to do at 8:45 on a Tuesday night.</w:t>
+        <w:t>On screen: The cake, sleep lit, for the first sentence. Then the night arc, 9 PM on the left to 5 AM on the right, moon to sun, the five numbers the only type: Lights out 9:00 PM. Up 5:00 AM. Last meal three hours before bed. Screens off one hour before bed. An eight-hour opportunity, cool and dark. Build between the numbers: a band across the deepest part of the night labeled the repair shift. Small: Xie et al., Science 2013; Fultz et al., Science 2019.</w:t>
+      </w:r>
+    </w:p>
+    <w:p>
+      <w:r>
+        <w:t>Let's start at the bottom of the cake with sleep. I think of sleep as the repair shift, the time your body does its maintenance while you're not in the way. That's not a metaphor, by the way. In 2013 a team at the University of Rochester showed that during deep sleep the brain's drainage system opens up and flushes out the day's waste, and in 2019 a Boston team watched the same rhythm in sleeping humans. [Xie et al., Science 2013; Fultz et al., Science 2019] If I skimp on it, everything I do on the other three layers works harder and pays me back less. I'm going to give you my exact numbers, because I find vague advice impossible to follow. "Get good sleep" has never once told me what to do at 8:45 on a Tuesday night.</w:t>
       </w:r>
     </w:p>
     <w:p>
@@ -2123,12 +2138,12 @@
           <w:color w:val="5B6472"/>
           <w:sz w:val="22"/>
         </w:rPr>
-        <w:t>On screen: The cake, food lit, for the opening. Then the plate, seen from above, three parts, one line each: Protein is the floor. Fiber is the lever. Whole food is the default. Final build: five numbers around the rim: One pound of vegetables per day. One gram of protein per pound of goal bodyweight. Eating window 8:00 AM to 6:00 PM. Coffee cutoff 10:00 AM. Zero alcohol on training days.</w:t>
-      </w:r>
-    </w:p>
-    <w:p>
-      <w:r>
-        <w:t>Now for food. Before any numbers, I want the type of diet off the table. Vegan, keto, Mediterranean, carnivore. It's not about the type. I've been vegan. I've been most things. [confirm] What I've learned is that people need to take the religion out of their diet and look at the plate. I think of mine in three parts. Protein is the floor, meaning I make sure it's there at every meal. Fiber is the lever, which is where the vegetables come in. And whole food is the default, which means that when I have a choice, I pick the thing that looks like it came from the ground or an animal, and not from a factory.</w:t>
+        <w:t>On screen: The cake, food lit, for the opening. Then the plate, seen from above, three parts, one line each: Protein is the floor. Fiber is the lever. Whole food is the default. Final build: five numbers around the rim: One pound of vegetables per day. One gram of protein per pound of goal bodyweight. Eating window 8:00 AM to 6:00 PM. Coffee cutoff 10:00 AM. Zero alcohol on training days. Beside the plate, two numbers: the fiber target, 25 to 38 grams a day, and the average American, about 15. Small: Dietary Guidelines for Americans; Quagliani and Felt-Gunderson, 2017.</w:t>
+      </w:r>
+    </w:p>
+    <w:p>
+      <w:r>
+        <w:t>Now for food. Before any numbers, I want the type of diet off the table. Vegan, keto, Mediterranean, carnivore. It's not about the type. I've been vegan. I've been most things. [confirm] What I've learned is that people need to take the religion out of their diet and look at the plate. I think of mine in three parts. Protein is the floor, meaning I make sure it's there at every meal. Fiber is the lever, which is where the vegetables come in. Here's why it's the lever: the target is 25 to 38 grams a day, and the average American gets about 15. Almost nobody is hitting it, which means almost everybody has room. [Dietary Guidelines for Americans; Quagliani and Felt-Gunderson, 2017] And whole food is the default, which means that when I have a choice, I pick the thing that looks like it came from the ground or an animal, and not from a factory.</w:t>
       </w:r>
     </w:p>
     <w:p>
@@ -2162,12 +2177,12 @@
           <w:color w:val="5B6472"/>
           <w:sz w:val="22"/>
         </w:rPr>
-        <w:t>On screen: The sugar slide, Omri's build in the same 3D language: how sugar affects aging, one idea, one object. Approved, unchanged. Final build: the object dims and two large checkboxes appear, Move dinner earlier and Rebuild one plate, under the words: Your two Monday changes.</w:t>
-      </w:r>
-    </w:p>
-    <w:p>
-      <w:r>
-        <w:t>There are so many diets out there, and everyone needs to find what works for them. But the one thing every single one of them agrees on is that sugar is bad for aging. I'll let the slide carry the biology. Here's the practical part. [one sentence: when you cut sugar and what you keep] And here's a confession from someone who thought she had this figured out. I wore a glucose monitor for two weeks, braced for pizza to be the villain. Pizza barely moved. The thing that spiked me first thing in the morning was my healthy green drink. [your story from the Outliyr podcast; confirm and adjust] You don't know until you look. That's why every student in the Academy wears one of these for two weeks.</w:t>
+        <w:t>On screen: The sugar slide, Omri's build in the same 3D language, three panels on one object: Spike (a glucose curve jumping after a meal), Signal (insulin and the nutrient-sensing pathways switching on; deregulated nutrient sensing is one of the twelve hallmarks of aging), Scar (sugar bonding to proteins, glycation; HbA1c is the measured version of this). Approved slide, model added. Small: López-Otín et al., Cell 2023; Uribarri et al., 2010. Final build: the object dims and two large checkboxes appear, Move dinner earlier and Rebuild one plate, under the words: Your two Monday changes.</w:t>
+      </w:r>
+    </w:p>
+    <w:p>
+      <w:r>
+        <w:t>There are so many diets out there, and everyone needs to find what works for them. But the one thing every single one of them agrees on is that sugar is bad for aging. Here's the model in three words. Spike, signal, scar. A spike is what you see on a glucose monitor after a sugary meal. The signal is what the spike turns on inside you: insulin and the nutrient-sensing pathways, and when they're on all day, every day, that's one of the twelve recognized hallmarks of aging. And the scar is the part people don't know: sugar sticks to proteins, a process called glycation, and the HbA1c test your doctor already runs is literally a measure of sugar stuck to your red blood cells. [López-Otín et al., Cell 2023; confirm the wording] Here's the practical part. [one sentence: when you cut sugar and what you keep] And here's a confession from someone who thought she had this figured out. I wore a glucose monitor for two weeks, braced for pizza to be the villain. Pizza barely moved. The thing that spiked me first thing in the morning was my healthy green drink. [your story from the Outliyr podcast; confirm and adjust] You don't know until you look. That's why every student in the Academy wears one of these for two weeks.</w:t>
       </w:r>
     </w:p>
     <w:p>
@@ -2217,12 +2232,12 @@
           <w:color w:val="5B6472"/>
           <w:sz w:val="22"/>
         </w:rPr>
-        <w:t>On screen: The cake, movement lit, for one breath. Then the photograph: two people, full height, the same age, side by side, same light, same background; one stands tall, one leans on a cane. Two words, cream, centered low. Approved visual, unchanged.</w:t>
-      </w:r>
-    </w:p>
-    <w:p>
-      <w:r>
-        <w:t>Now the third layer: movement. I'm not going to demonstrate a workout today. I want to start with one picture of why it matters. Two people, the same age. One stands tall. One leans on a cane. Not everything that puts a person on a cane is a choice, and I would never say it was. But a great deal of what keeps you off one is a weekly pattern, and that pattern is a choice. [confirm the framing] Here's a confession from a woman who swam competitively as a kid: I like going to the gym, and I do not like working out. [confirm; your line] I never found the love. I found the reason instead.</w:t>
+        <w:t>On screen: The cake, movement lit, for one breath. Then the photograph: two people, full height, the same age, side by side, same light, same background; one stands tall, one leans on a cane. Two words, cream, centered low. Approved visual, unchanged. Under each figure, a bar: years lived, and years lived well. The gap between them is about twelve years. Small: WHO, healthy life expectancy, United States, 2019.</w:t>
+      </w:r>
+    </w:p>
+    <w:p>
+      <w:r>
+        <w:t>Now the third layer: movement. I'm not going to demonstrate a workout today. I want to start with one picture of why it matters. Two people, the same age. One stands tall. One leans on a cane. Not everything that puts a person on a cane is a choice, and I would never say it was. But a great deal of what keeps you off one is a weekly pattern, and that pattern is a choice. [confirm the framing] Here's the number behind the picture. In America, life expectancy is about seventy-eight. Healthy life expectancy, the years you live without serious illness or disability, is about sixty-six. Twelve years, on average, at the end, in poor health. Those twelve years are what this layer is about. [WHO 2019 figures; confirm] Here's a confession from a woman who swam competitively as a kid: I like going to the gym, and I do not like working out. [confirm; your line] I never found the love. I found the reason instead.</w:t>
       </w:r>
     </w:p>
     <w:p>
@@ -2238,7 +2253,7 @@
           <w:color w:val="1E6FFF"/>
           <w:sz w:val="29"/>
         </w:rPr>
-        <w:t>Slide 12 | FOUR TYPES OF MOVEMENT, FOUR PARTS OF YOU. | 3:00</w:t>
+        <w:t>Slide 12 | FOUR TYPES OF MOVEMENT, FOUR PARTS OF YOU. | 3:30</w:t>
       </w:r>
     </w:p>
     <w:p>
@@ -2251,7 +2266,7 @@
           <w:color w:val="5B6472"/>
           <w:sz w:val="22"/>
         </w:rPr>
-        <w:t>On screen: The body map: a translucent figure in profile, four points lighting as you name them, bones and muscle, heart, heart, brain. Four tiles to the right: Weights. VO2 max. Zone 2. Mobility and balance. [a source per tile if you want claims on screen] The macro slide, before the detail.</w:t>
+        <w:t>On screen: The body map: a translucent figure in profile, four points lighting as you name them, bones and muscle, heart, heart, brain. Four tiles to the right, each with the number researchers use to predict how long you live: Weights, grip strength (Leong et al., Lancet 2015). VO2 max, fitness (Mandsager et al., JAMA Network Open 2018). Zone 2, steps a day (Paluch et al., JAMA Network Open 2021). Mobility and balance, the ten-second one-leg stand (Araujo et al., British Journal of Sports Medicine 2022). The macro slide, before the detail.</w:t>
       </w:r>
     </w:p>
     <w:p>
@@ -2262,6 +2277,11 @@
     <w:p>
       <w:r>
         <w:t>Weights: resistance training, making your muscles work against a load. I build mine around compound lifts, movements that use several joints at once. That one is for your bones and your muscle. VO2 max: how much oxygen your body can use when you're working hard. It sounds scary, and I'll admit it's not what gets me out of bed. That one is for your heart. Zone 2: easy cardio at a conversational pace. If you can chat with a friend while you do it, you're about right. Also for the heart. And mobility and balance: your joints moving through their full range, and staying steady on your feet. It's the tile everybody forgets. It's for your brain as much as your body, and it's the one that keeps you doing the other three. The common failure is cardio only or strength only. If you're a runner, add the weights. If you're a lifter, add the easy cardio. That's all I'm asking.</w:t>
+      </w:r>
+    </w:p>
+    <w:p>
+      <w:r>
+        <w:t>And each tile has a number attached, one that researchers have used to predict how long people live. Grip strength: in a study of a hundred and forty thousand people across seventeen countries, every five kilos of grip you lose came with a sixteen percent higher risk of dying. Fitness: at the Cleveland Clinic, among a hundred and twenty-two thousand patients, being unfit was a bigger risk than smoking. Steps: seven thousand a day cut the risk of death by half or more over ten years, in people in their forties. And balance: in a study of adults between fifty-one and seventy-five, the people who couldn't stand on one leg for ten seconds had an eighty-four percent higher risk of dying in the next decade. Try it tonight. Ten seconds. Shoes off. [Leong 2015; Mandsager 2018; Paluch 2021; Araujo 2022; confirm the figures before you say them]</w:t>
       </w:r>
     </w:p>
     <w:p>
@@ -2277,7 +2297,7 @@
           <w:color w:val="1E6FFF"/>
           <w:sz w:val="29"/>
         </w:rPr>
-        <w:t>Slide 13 | WHAT MY WEEK LOOKS LIKE. | 2:00</w:t>
+        <w:t>Slide 13 | WHAT MY WEEK LOOKS LIKE. | 1:30</w:t>
       </w:r>
     </w:p>
     <w:p>
@@ -2324,12 +2344,12 @@
           <w:color w:val="5B6472"/>
           <w:sz w:val="22"/>
         </w:rPr>
-        <w:t>On screen: The cake, stress lit, held for the story; no graph, no numbers. Then the breath: two short arcs in through the nose, one long arc out through the mouth, animating at speaking pace as you lead it. [verify the technique and the source]</w:t>
-      </w:r>
-    </w:p>
-    <w:p>
-      <w:r>
-        <w:t>The fourth layer is stress, and it's the one people skip. I want to tell you how I found out it was real, because I didn't read it in a book. A few years ago I went through a divorce. [confirm the timing] Somewhere in the middle of it I had a test done, and my cortisol, the stress hormone, was high. [confirm what was measured] I'm an engineer. A high number is a problem to solve, so I went looking for a tool. I found a transcendental meditation center, I learned the practice, and after about six months my cortisol was back to normal and it stayed there.</w:t>
+        <w:t>On screen: The cake, stress lit, held for the story; no graph, no numbers. Then the breath: two short arcs in through the nose, one long arc out through the mouth, animating at speaking pace as you lead it. Small: Balban, Spiegel and Huberman, Cell Reports Medicine 2023, 111 people, five minutes a day for a month.</w:t>
+      </w:r>
+    </w:p>
+    <w:p>
+      <w:r>
+        <w:t>The fourth layer is stress, and it's the one people skip. I want to tell you how I found out it was real, because I didn't read it in a book. A few years ago I went through a divorce. [confirm the timing] Somewhere in the middle of it I had a test done, and my cortisol, the stress hormone, was high. [confirm what was measured] Stress hormones are built for short bursts. When they never switch off, they wear the body down; researchers call it allostatic load. [McEwen, New England Journal of Medicine 1998] I'm an engineer. A high number is a problem to solve, so I went looking for a tool. I found a transcendental meditation center, I learned the practice, and after about six months my cortisol was back to normal and it stayed there.</w:t>
       </w:r>
     </w:p>
     <w:p>
@@ -2339,7 +2359,7 @@
     </w:p>
     <w:p>
       <w:r>
-        <w:t>There's also a free tool I want you to leave with. It's called the physiological sigh. [verify attribution before naming anyone] A double inhale through the nose, followed by a long, slow exhale through the mouth. Let's try three together, on camera. Inhale, inhale, long exhale. Again. One more. If anyone feels lightheaded, stop and go back to normal breathing. That took about thirty seconds and it costs nothing. That's the kind of tool I'd like you to keep in your back pocket.</w:t>
+        <w:t>There's also a free tool I want you to leave with. It's called the physiological sigh, and it's the best-studied breath I know of: a Stanford team tested it on a hundred and eleven people, five minutes a day for a month, and it improved mood more than mindfulness meditation did, and lowered their resting breathing rate. [Balban et al., Cell Reports Medicine 2023] A double inhale through the nose, followed by a long, slow exhale through the mouth. Let's try three together, on camera. Inhale, inhale, long exhale. Again. One more. If anyone feels lightheaded, stop and go back to normal breathing. That took about thirty seconds and it costs nothing. That's the kind of tool I'd like you to keep in your back pocket.</w:t>
       </w:r>
     </w:p>
     <w:p>
@@ -2384,12 +2404,12 @@
           <w:color w:val="5B6472"/>
           <w:sz w:val="22"/>
         </w:rPr>
-        <w:t>On screen: The day ring: your day as a clock, 5 AM to 9 PM, each hour colored by its layer, 9 PM at the top so the eye starts at bedtime. Large hour marks: 5 wake, 7 training and sauna, 8 window opens, 10 coffee closes, midday biggest meal and walk, afternoon meditation, 6 last meal, 8 screens off, 9 lights out. The one-page schedule people were promised. They screenshot this one.</w:t>
-      </w:r>
-    </w:p>
-    <w:p>
-      <w:r>
-        <w:t>Now let's put it all together. Here's my day, so you can see where the layers fit and where they fight each other for the same hour. Five, wake. Water first, then light. [how you get light] Seven, training, then the sauna, which is the real reason I show up. [confirm the time] Eight, eating window opens. Ten, coffee cuts off. Midday, work and my biggest meal, followed by a walk. [confirm] Afternoon, meditation. [confirm when] Six, eating window closes; that's my last meal, three hours before bed. Eight, screens off; the wind-down begins. Nine, lights out.</w:t>
+        <w:t>On screen: The day ring: your day as a clock, 5 AM to 9 PM, each hour colored by its layer, 9 PM at the top so the eye starts at bedtime. Large hour marks: 5 wake, 7 training and sauna, 8 window opens, 10 coffee closes, midday biggest meal and walk, afternoon meditation, 6 last meal, 8 screens off, 9 lights out. The one-page schedule people were promised. The ten hours from 8 to 6 shaded as one band: the eating window. Small: Wilkinson et al., Cell Metabolism 2020, the Salk Institute. They screenshot this one.</w:t>
+      </w:r>
+    </w:p>
+    <w:p>
+      <w:r>
+        <w:t>Now let's put it all together. Here's my day, so you can see where the layers fit and where they fight each other for the same hour. Five, wake. Water first, then light. [how you get light] Seven, training, then the sauna, which is the real reason I show up. [confirm the time] Eight, eating window opens. Ten, coffee cuts off. That window, eight to six, is ten hours, and it isn't an accident: the Salk Institute's work on time-restricted eating used a ten-hour window and saw weight, blood pressure and cholesterol improve in twelve weeks. [Wilkinson et al., Cell Metabolism 2020; confirm] Midday, work and my biggest meal, followed by a walk. [confirm] Afternoon, meditation. [confirm when] Six, eating window closes; that's my last meal, three hours before bed. Eight, screens off; the wind-down begins. Nine, lights out.</w:t>
       </w:r>
     </w:p>
     <w:p>
@@ -2483,7 +2503,7 @@
           <w:color w:val="5B6472"/>
           <w:sz w:val="22"/>
         </w:rPr>
-        <w:t>On screen: The closing cake, every layer lit, the icing on top, turning slowly. Approved visual, unchanged. Build 2: the cake recedes and the ring of three rises: Why, Intention, Resources on a lit ring, a line between each pair; the center lights only when all three are on. Build 3: the Blueprint card in your video-card style, the Academy mark top center, "The same cake, built week by week," in cream and "with a teacher." in light blue. Final: Your why. Your intention. Your resources. One thing, forty-eight hours. [link or QR]</w:t>
+        <w:t>On screen: The closing cake, every layer lit, the icing on top, turning slowly. Approved visual, unchanged. Build 2: two curves on one chart, how long we live and how long we live well, and the gap between them closing. Small: Fries, New England Journal of Medicine 1980, the compression of morbidity. Build 3: the cake recedes and the ring of three rises: Why, Intention, Resources on a lit ring, a line between each pair; the center lights only when all three are on. Build 4: the Blueprint card in your video-card style, the Academy mark top center, "The same cake, built week by week," in cream and "with a teacher." in light blue. Final: Your why. Your intention. Your resources. One thing, forty-eight hours. [link or QR]</w:t>
       </w:r>
     </w:p>
     <w:p>
@@ -2493,7 +2513,7 @@
     </w:p>
     <w:p>
       <w:r>
-        <w:t>What's my why? Mine isn't a leaderboard. It's a kid who needs his mom to show up for a long time. [your words] A why is a direction. It tells you which way to walk; it doesn't tell you how far or how fast. What's my intention? That's the sentence you'd write on the wall. Mine is: I want my healthspan to match my lifespan. Every year I'm alive, I want to be able to use. You can measure that. And what are my resources? Time, money, energy, the real amounts, not the ones you wish you had. Mine are an hour in the morning and about twelve dollars a day. [confirm] Resources set the pace. They decide what you're still doing in March, when nobody's watching.</w:t>
+        <w:t>What's my why? Mine isn't a leaderboard. It's a kid who needs his mom to show up for a long time. [your words] A why is a direction. It tells you which way to walk; it doesn't tell you how far or how fast. What's my intention? That's the sentence you'd write on the wall. Mine is: I want my healthspan to match my lifespan. There's a drawing from 1980 by a Stanford doctor named James Fries that says it better than I can: two lines, how long you live and how long you live well. Most of medicine pushes the first line out. The point is to drag the second one up to meet it. [Fries, New England Journal of Medicine 1980] Every year I'm alive, I want to be able to use. You can measure that. And what are my resources? Time, money, energy, the real amounts, not the ones you wish you had. Mine are an hour in the morning and about twelve dollars a day. [confirm] Resources set the pace. They decide what you're still doing in March, when nobody's watching.</w:t>
       </w:r>
     </w:p>
     <w:p>
@@ -4306,6 +4326,283 @@
     <w:p>
       <w:r>
         <w:t>What we need from you before design starts: the photograph for slide 2, your cake illustration at full resolution, and a decision on the side-by-side photograph (shot, or licensed). Everything else gets built.</w:t>
+      </w:r>
+    </w:p>
+    <w:p>
+      <w:pPr>
+        <w:keepNext/>
+        <w:spacing w:before="600" w:after="200"/>
+      </w:pPr>
+      <w:r>
+        <w:rPr>
+          <w:rFonts w:ascii="Playfair Display" w:hAnsi="Playfair Display"/>
+          <w:b w:val="0"/>
+          <w:i/>
+          <w:color w:val="0A1E3F"/>
+          <w:sz w:val="52"/>
+        </w:rPr>
+        <w:t>Models and sources</w:t>
+      </w:r>
+    </w:p>
+    <w:p>
+      <w:r>
+        <w:rPr>
+          <w:color w:val="5B6472"/>
+          <w:sz w:val="22"/>
+        </w:rPr>
+        <w:t>Every model used on a slide, and the study it comes from. Each is marked [confirm] in the script; nothing goes on camera until Julie is comfortable saying it.</w:t>
+      </w:r>
+    </w:p>
+    <w:p>
+      <w:pPr>
+        <w:keepNext/>
+        <w:spacing w:before="280" w:after="80"/>
+      </w:pPr>
+      <w:r>
+        <w:rPr>
+          <w:rFonts w:ascii="Playfair Display" w:hAnsi="Playfair Display"/>
+          <w:b w:val="0"/>
+          <w:i/>
+          <w:color w:val="1E6FFF"/>
+          <w:sz w:val="29"/>
+        </w:rPr>
+        <w:t>Slide 3, the gauge</w:t>
+      </w:r>
+    </w:p>
+    <w:p>
+      <w:r>
+        <w:t>The pace-of-aging curve. In the Dunedin Study, 954 people all aged 38 were measured with the panel that became DunedinPACE: most aged about one year per year, a few near zero, some near three. Belsky DW et al., Quantification of biological aging in young adults, PNAS 2015.</w:t>
+      </w:r>
+    </w:p>
+    <w:p>
+      <w:pPr>
+        <w:keepNext/>
+        <w:spacing w:before="280" w:after="80"/>
+      </w:pPr>
+      <w:r>
+        <w:rPr>
+          <w:rFonts w:ascii="Playfair Display" w:hAnsi="Playfair Display"/>
+          <w:b w:val="0"/>
+          <w:i/>
+          <w:color w:val="1E6FFF"/>
+          <w:sz w:val="29"/>
+        </w:rPr>
+        <w:t>Slide 4, before the cake</w:t>
+      </w:r>
+    </w:p>
+    <w:p>
+      <w:r>
+        <w:t>The geroscience hypothesis: aging is the largest risk factor for heart disease, cancer, dementia and type 2 diabetes, so slowing aging delays them together. Kennedy BK et al., Geroscience: linking aging to chronic disease, Cell 2014. The founding idea of the Buck Institute.</w:t>
+      </w:r>
+    </w:p>
+    <w:p>
+      <w:pPr>
+        <w:keepNext/>
+        <w:spacing w:before="280" w:after="80"/>
+      </w:pPr>
+      <w:r>
+        <w:rPr>
+          <w:rFonts w:ascii="Playfair Display" w:hAnsi="Playfair Display"/>
+          <w:b w:val="0"/>
+          <w:i/>
+          <w:color w:val="1E6FFF"/>
+          <w:sz w:val="29"/>
+        </w:rPr>
+        <w:t>Slide 5, the icing</w:t>
+      </w:r>
+    </w:p>
+    <w:p>
+      <w:r>
+        <w:t>Cost against strength of human evidence, as a two-by-two. Sauna: Laukkanen T et al., Association between sauna bathing and fatal cardiovascular and all-cause mortality events, JAMA Internal Medicine 2015 (2,315 Finnish men, median 20.7 years; 4 to 7 sessions a week, 40 percent lower all-cause mortality than once a week). Rapamycin, NAD, peptides and stem cells: her judgment calls, to confirm.</w:t>
+      </w:r>
+    </w:p>
+    <w:p>
+      <w:pPr>
+        <w:keepNext/>
+        <w:spacing w:before="280" w:after="80"/>
+      </w:pPr>
+      <w:r>
+        <w:rPr>
+          <w:rFonts w:ascii="Playfair Display" w:hAnsi="Playfair Display"/>
+          <w:b w:val="0"/>
+          <w:i/>
+          <w:color w:val="1E6FFF"/>
+          <w:sz w:val="29"/>
+        </w:rPr>
+        <w:t>Slide 6, menopause</w:t>
+      </w:r>
+    </w:p>
+    <w:p>
+      <w:r>
+        <w:t>The Menopause Society, 2022 Hormone Therapy Position Statement: for healthy symptomatic women under 60 or within 10 years of menopause onset, benefits generally outweigh risks.</w:t>
+      </w:r>
+    </w:p>
+    <w:p>
+      <w:pPr>
+        <w:keepNext/>
+        <w:spacing w:before="280" w:after="80"/>
+      </w:pPr>
+      <w:r>
+        <w:rPr>
+          <w:rFonts w:ascii="Playfair Display" w:hAnsi="Playfair Display"/>
+          <w:b w:val="0"/>
+          <w:i/>
+          <w:color w:val="1E6FFF"/>
+          <w:sz w:val="29"/>
+        </w:rPr>
+        <w:t>Slide 7, sleep</w:t>
+      </w:r>
+    </w:p>
+    <w:p>
+      <w:r>
+        <w:t>The repair shift is literal: glymphatic clearance rises during deep sleep. Xie L et al., Sleep drives metabolite clearance from the adult brain, Science 2013 (mice). Fultz NE et al., Coupled electrophysiological, hemodynamic, and cerebrospinal fluid oscillations in human sleep, Science 2019.</w:t>
+      </w:r>
+    </w:p>
+    <w:p>
+      <w:pPr>
+        <w:keepNext/>
+        <w:spacing w:before="280" w:after="80"/>
+      </w:pPr>
+      <w:r>
+        <w:rPr>
+          <w:rFonts w:ascii="Playfair Display" w:hAnsi="Playfair Display"/>
+          <w:b w:val="0"/>
+          <w:i/>
+          <w:color w:val="1E6FFF"/>
+          <w:sz w:val="29"/>
+        </w:rPr>
+        <w:t>Slide 9, food</w:t>
+      </w:r>
+    </w:p>
+    <w:p>
+      <w:r>
+        <w:t>The fiber gap: recommended 25 to 38 grams a day (Dietary Guidelines for Americans), average intake about 15. Quagliani D, Felt-Gunderson P, Closing America's fiber intake gap, American Journal of Lifestyle Medicine 2017. Protein for older adults: the PROT-AGE group recommends at least 1.0 to 1.2 g per kg a day (Bauer J et al., JAMDA 2013); Julie's own target is higher and is presented as hers.</w:t>
+      </w:r>
+    </w:p>
+    <w:p>
+      <w:pPr>
+        <w:keepNext/>
+        <w:spacing w:before="280" w:after="80"/>
+      </w:pPr>
+      <w:r>
+        <w:rPr>
+          <w:rFonts w:ascii="Playfair Display" w:hAnsi="Playfair Display"/>
+          <w:b w:val="0"/>
+          <w:i/>
+          <w:color w:val="1E6FFF"/>
+          <w:sz w:val="29"/>
+        </w:rPr>
+        <w:t>Slide 10, sugar</w:t>
+      </w:r>
+    </w:p>
+    <w:p>
+      <w:r>
+        <w:t>Spike, signal, scar. Deregulated nutrient sensing is one of the twelve hallmarks of aging: López-Otín C et al., Hallmarks of aging: an expanding universe, Cell 2023. Glycation and advanced glycation end products: Uribarri J et al., Journal of the American Dietetic Association 2010. HbA1c is glycated hemoglobin.</w:t>
+      </w:r>
+    </w:p>
+    <w:p>
+      <w:pPr>
+        <w:keepNext/>
+        <w:spacing w:before="280" w:after="80"/>
+      </w:pPr>
+      <w:r>
+        <w:rPr>
+          <w:rFonts w:ascii="Playfair Display" w:hAnsi="Playfair Display"/>
+          <w:b w:val="0"/>
+          <w:i/>
+          <w:color w:val="1E6FFF"/>
+          <w:sz w:val="29"/>
+        </w:rPr>
+        <w:t>Slide 11, same age</w:t>
+      </w:r>
+    </w:p>
+    <w:p>
+      <w:r>
+        <w:t>The healthspan gap: United States life expectancy about 78 years, healthy life expectancy about 66 (WHO Global Health Observatory, 2019 estimates). Confirm the current figures before the night.</w:t>
+      </w:r>
+    </w:p>
+    <w:p>
+      <w:pPr>
+        <w:keepNext/>
+        <w:spacing w:before="280" w:after="80"/>
+      </w:pPr>
+      <w:r>
+        <w:rPr>
+          <w:rFonts w:ascii="Playfair Display" w:hAnsi="Playfair Display"/>
+          <w:b w:val="0"/>
+          <w:i/>
+          <w:color w:val="1E6FFF"/>
+          <w:sz w:val="29"/>
+        </w:rPr>
+        <w:t>Slide 12, four types</w:t>
+      </w:r>
+    </w:p>
+    <w:p>
+      <w:r>
+        <w:t>Four predictors. Grip: Leong DP et al., Prognostic value of grip strength, Lancet 2015 (PURE, 139,691 adults, 17 countries; each 5 kg lower grip, 16 percent higher all-cause mortality). Fitness: Mandsager K et al., Association of cardiorespiratory fitness with long-term mortality, JAMA Network Open 2018 (122,007 patients; low fitness a larger risk than smoking). Steps: Paluch AE et al., Steps per day and all-cause mortality in middle-aged adults, JAMA Network Open 2021 (2,110 adults aged 38 to 50; 7,000 or more steps, 50 to 70 percent lower mortality over 10.8 years). Balance: Araujo CG et al., Successful 10-second one-legged stance performance predicts survival, British Journal of Sports Medicine 2022 (1,702 adults aged 51 to 75; failing the test, 84 percent higher risk of death over the next decade).</w:t>
+      </w:r>
+    </w:p>
+    <w:p>
+      <w:pPr>
+        <w:keepNext/>
+        <w:spacing w:before="280" w:after="80"/>
+      </w:pPr>
+      <w:r>
+        <w:rPr>
+          <w:rFonts w:ascii="Playfair Display" w:hAnsi="Playfair Display"/>
+          <w:b w:val="0"/>
+          <w:i/>
+          <w:color w:val="1E6FFF"/>
+          <w:sz w:val="29"/>
+        </w:rPr>
+        <w:t>Slide 14, stress</w:t>
+      </w:r>
+    </w:p>
+    <w:p>
+      <w:r>
+        <w:t>Allostatic load: McEwen BS, Protective and damaging effects of stress mediators, New England Journal of Medicine 1998. The physiological sigh: Balban MY, Spiegel D, Huberman AD et al., Brief structured respiration practices enhance mood and reduce physiological arousal, Cell Reports Medicine 2023 (111 people, five minutes a day for a month; cyclic sighing improved mood more than mindfulness meditation and lowered resting breathing rate).</w:t>
+      </w:r>
+    </w:p>
+    <w:p>
+      <w:pPr>
+        <w:keepNext/>
+        <w:spacing w:before="280" w:after="80"/>
+      </w:pPr>
+      <w:r>
+        <w:rPr>
+          <w:rFonts w:ascii="Playfair Display" w:hAnsi="Playfair Display"/>
+          <w:b w:val="0"/>
+          <w:i/>
+          <w:color w:val="1E6FFF"/>
+          <w:sz w:val="29"/>
+        </w:rPr>
+        <w:t>Slide 15, the day</w:t>
+      </w:r>
+    </w:p>
+    <w:p>
+      <w:r>
+        <w:t>Time-restricted eating in a ten-hour window: Wilkinson MJ et al., Ten-hour time-restricted eating reduces weight, blood pressure, and atherogenic lipids in patients with metabolic syndrome, Cell Metabolism 2020 (Salk Institute, 19 participants, 12 weeks).</w:t>
+      </w:r>
+    </w:p>
+    <w:p>
+      <w:pPr>
+        <w:keepNext/>
+        <w:spacing w:before="280" w:after="80"/>
+      </w:pPr>
+      <w:r>
+        <w:rPr>
+          <w:rFonts w:ascii="Playfair Display" w:hAnsi="Playfair Display"/>
+          <w:b w:val="0"/>
+          <w:i/>
+          <w:color w:val="1E6FFF"/>
+          <w:sz w:val="29"/>
+        </w:rPr>
+        <w:t>Slide 17, the close</w:t>
+      </w:r>
+    </w:p>
+    <w:p>
+      <w:r>
+        <w:t>Compression of morbidity: Fries JF, Aging, natural death, and the compression of morbidity, New England Journal of Medicine 1980. The two curves, lifespan and healthspan, and the goal of closing the gap.</w:t>
       </w:r>
     </w:p>
     <w:sectPr>

</xml_diff>

<commit_message>
Script: refresh every model with 2022 to 2025 sources (Mayo, Lancet, BJSM, Annals, PNAS, FDA)
Co-Authored-By: Claude Fable 5.1 <noreply@anthropic.com>
Claude-Session: https://claude.ai/code/session_011ZxZ5Sjnca9JQsayzBoJk5
</commit_message>
<xml_diff>
--- a/script/The-Longevity-Masterclass-script-three-versions.docx
+++ b/script/The-Longevity-Masterclass-script-three-versions.docx
@@ -53,7 +53,7 @@
     </w:p>
     <w:p>
       <w:r>
-        <w:t>Every slide now carries its model: the real science behind the picture, with the study it comes from in brackets so you can check it or cut it. The full list is at the end, under Models and sources. Nothing is stated as fact that does not have a paper behind it, and every one is marked for you to confirm before you say it on camera.</w:t>
+        <w:t>Every slide now carries its model: the real science behind the picture, with the study it comes from in brackets so you can check it or cut it. The studies are the newest strong ones, 2022 to 2025 wherever the science allows: Mayo Clinic, Stanford, the Salk Institute, Duke, The Lancet, JAMA, the FDA. An older paper is named only where the idea was born. The full list is at the end, under Models and sources. Nothing is stated as fact that does not have a paper behind it, and every one is marked for you to confirm before you say it on camera.</w:t>
       </w:r>
     </w:p>
     <w:p>
@@ -210,7 +210,7 @@
           <w:color w:val="5B6472"/>
           <w:sz w:val="22"/>
         </w:rPr>
-        <w:t>On screen: First the plain line, huge, cream: Ten years pass. By this test, I age about six. Nothing else, so the whole room gets the point before any science. Then the gauge rises, hero size: dark glass face, 1.0 at the top, the needle glowing light blue, cream ticks at 0.665 and 0.76, and the second beat of the headline in light blue: The speed towards death. Build: the needle sweeps from 1.0 down to 0.65 as you say the number, then up to 0.76 when you confess it. Approved visual, unchanged in markings and meaning. Final build: the pace-of-aging curve from the study behind the test, a soft bell drawn over the gauge: most people near 1.0, a few near zero, a tail out to three years per year, your 0.665 marked on it. Small: Belsky et al., PNAS 2015.</w:t>
+        <w:t>On screen: First the plain line, huge, cream: Ten years pass. By this test, I age about six. Nothing else, so the whole room gets the point before any science. Then the gauge rises, hero size: dark glass face, 1.0 at the top, the needle glowing light blue, cream ticks at 0.665 and 0.76, and the second beat of the headline in light blue: The speed towards death. Build: the needle sweeps from 1.0 down to 0.65 as you say the number, then up to 0.76 when you confess it. Approved visual, unchanged in markings and meaning. Final build: the pace-of-aging curve, a soft bell drawn over the gauge: most people near 1.0, some slower, a tail of people aging much faster, your 0.665 marked on it. Small: DunedinPACE, Belsky et al., eLife 2022. Now used in more than 65 cohort studies in 18 countries (Duke University, January 2025).</w:t>
       </w:r>
     </w:p>
     <w:p>
@@ -220,7 +220,7 @@
     </w:p>
     <w:p>
       <w:r>
-        <w:t>The test behind that number is called DunedinPACE. The scientists call what it measures your pace of aging. I'll give you the less polite version. It measures your speed towards death. How fast your body is aging right now, this year. A score of 1.0 means you're aging one year for every calendar year, which is what most people do. [check this wording against the test provider's description] My best score was 0.65. Average my three tests and it's 0.665. That's the more honest number, so you get both. And so you know this isn't a vanity number: in the study that built this test, 954 people, all aged 38, were measured. Most were aging about a year per year. A few were close to zero. And some were aging close to three years for every year on the calendar. [Belsky et al., PNAS 2015; confirm you are comfortable citing it]</w:t>
+        <w:t>The test behind that number is called DunedinPACE. The scientists call what it measures your pace of aging. I'll give you the less polite version. It measures your speed towards death. How fast your body is aging right now, this year. A score of 1.0 means you're aging one year for every calendar year, which is what most people do. [check this wording against the test provider's description] My best score was 0.65. Average my three tests and it's 0.665. That's the more honest number, so you get both. And so you know this isn't a vanity number or a gimmick: the test was built at Duke and Columbia from a group of people followed since birth, it was published in 2022, and it's now being used in more than sixty-five large studies in eighteen countries. In 2024, Nature Aging reported that older adults with a faster pace on this test went on to have shorter healthspans and shorter lives. [Belsky et al., eLife 2022; Balachandran et al., Nature Aging 2024; Duke University DunedinPACE summary, January 2025; confirm you are comfortable citing it]</w:t>
       </w:r>
     </w:p>
     <w:p>
@@ -254,12 +254,12 @@
           <w:color w:val="5B6472"/>
           <w:sz w:val="22"/>
         </w:rPr>
-        <w:t>On screen: First build, one root and four branches: Aging at the root, and heart disease, cancer, dementia, type 2 diabetes on the branches. Small: the geroscience hypothesis, Kennedy et al., Cell 2014. Then the cake, hero size, turning slowly, every layer lit evenly this once: Sleep, Food, Movement, Stress Management, the thin layer, the icing labeled Therapies, exactly as you drew it. Headline above, "cake" in light blue. Approved visual, unchanged. It returns at the start of every layer with that layer lit.</w:t>
-      </w:r>
-    </w:p>
-    <w:p>
-      <w:r>
-        <w:t>Before the how, one picture of why anyone bothers. Aging is the biggest risk factor for the four things we're all afraid of: heart disease, cancer, dementia, type 2 diabetes. Slow the aging itself and you push all four back at once. That's the whole bet of a field called geroscience, and it's the bet I made. [Kennedy et al., Cell 2014; the Buck Institute's founding idea] So how does a single mom with a day job end up on that list? Not with what's on your feed. With one picture. Longevity is like a cake. The cake is four layers. Sleep. Food. Movement. Stress. That's where almost all of the work lives. For the women in the room there's one more thin layer, and I'll come to it. And on top is the icing. Sauna. IVs. Peptides. A pill with a very exciting name. Icing is delightful. Nobody has ever eaten a bowl of icing and called it a cake.</w:t>
+        <w:t>On screen: First build, one root and four branches: Aging at the root, and heart disease, cancer, dementia, type 2 diabetes on the branches. Small: the geroscience hypothesis, the Buck Institute; the twelve hallmarks of aging, López-Otín et al., Cell 2023. Then the cake, hero size, turning slowly, every layer lit evenly this once: Sleep, Food, Movement, Stress Management, the thin layer, the icing labeled Therapies, exactly as you drew it. Headline above, "cake" in light blue. Approved visual, unchanged. It returns at the start of every layer with that layer lit.</w:t>
+      </w:r>
+    </w:p>
+    <w:p>
+      <w:r>
+        <w:t>Before the how, one picture of why anyone bothers. Aging is the biggest risk factor for the four things we're all afraid of: heart disease, cancer, dementia, type 2 diabetes. Slow the aging itself and you push all four back at once. That's the whole bet of a field called geroscience, and it's the bet I made. [the geroscience hypothesis, the Buck Institute's founding idea, Kennedy et al., Cell 2014; its current form, López-Otín et al., Hallmarks of aging, Cell 2023] So how does a single mom with a day job end up on that list? Not with what's on your feed. With one picture. Longevity is like a cake. The cake is four layers. Sleep. Food. Movement. Stress. That's where almost all of the work lives. For the women in the room there's one more thin layer, and I'll come to it. And on top is the icing. Sauna. IVs. Peptides. A pill with a very exciting name. Icing is delightful. Nobody has ever eaten a bowl of icing and called it a cake.</w:t>
       </w:r>
     </w:p>
     <w:p>
@@ -304,7 +304,7 @@
           <w:color w:val="5B6472"/>
           <w:sz w:val="22"/>
         </w:rPr>
-        <w:t>On screen: The cake with only the icing lit, then it slides away and the cost map rises: a two-by-two, cost left to right, strength of human evidence bottom to top, glass markers placed on it: Sauna (cheap, twenty years of data), Prebiotics and most supplements (cheap, depends on a test), NAD drips, Peptides, Stem cells (expensive, thin human evidence), Rapamycin with a doctor (prescription, strong animal data, human trials under way), and one marker off the chart at the far right, the two-million-a-year program. [confirm the placements] Small, under the sauna marker: Laukkanen et al., JAMA Internal Medicine 2015. Build 2: four markers turn amber. Build 3: a single coin lights at the far left, "Twelve dollars a day." Build 4: the sauna marker glows warm. The rail is the list; there are no bullets.</w:t>
+        <w:t>On screen: The cake with only the icing lit, then it slides away and the cost map rises: a two-by-two, cost left to right, strength of human evidence bottom to top, glass markers placed on it: Sauna (cheap, nearly thirty years of data), Prebiotics and most supplements (cheap, depends on a test), NAD drips, Peptides, Stem cells (expensive, thin human evidence), Rapamycin with a doctor (prescription, strong animal data, human trials under way), and one marker off the chart at the far right, the two-million-a-year program. [confirm the placements] Small, under the sauna marker: Kunutsor, Jae, Kurl and Laukkanen, Scandinavian Cardiovascular Journal 2024; Laukkanen et al., BMC Medicine 2018. Build 2: four markers turn amber. Build 3: a single coin lights at the far left, "Twelve dollars a day." Build 4: the sauna marker glows warm. The rail is the list; there are no bullets.</w:t>
       </w:r>
     </w:p>
     <w:p>
@@ -329,7 +329,7 @@
     </w:p>
     <w:p>
       <w:r>
-        <w:t>Now a confession. The one piece of icing I use every single week is the cheapest one on the line. Sauna. Three to five mornings a week, at my gym. And here's a secret that will upset every personal trainer on this call: the sauna is why I get up. Nobody in history has leapt out of bed at five in the morning excited about intervals. I get up for the sauna. The workout happens to be on the way. And it's the one piece of icing with serious long-term data behind it. A Finnish study followed 2,315 men for about twenty years. The men who used a sauna four to seven times a week had a forty percent lower risk of dying from any cause than the men who went once a week. [Laukkanen et al., JAMA Internal Medicine 2015; add your own From Paper to Plate sources if you prefer] If you have a heart or blood pressure condition, ask your doctor first. And drink water.</w:t>
+        <w:t>Now a confession. The one piece of icing I use every single week is the cheapest one on the line. Sauna. Three to five mornings a week, at my gym. And here's a secret that will upset every personal trainer on this call: the sauna is why I get up. Nobody in history has leapt out of bed at five in the morning excited about intervals. I get up for the sauna. The workout happens to be on the way. And it's the one piece of icing with serious long-term data behind it. The Finnish group that has studied this longest published its latest analysis in 2024: 2,575 men followed for almost twenty-eight years. The men who used a sauna twice a week or less had a sixteen percent higher risk of dying from any cause than the men who went three to seven times. Their 2018 study, which included women, pointed the same way. [Kunutsor, Jae, Kurl and Laukkanen, Scandinavian Cardiovascular Journal 2024; Laukkanen et al., BMC Medicine 2018, 1,688 men and women over fifty, fifteen years; add your own From Paper to Plate sources if you prefer] If you have a heart or blood pressure condition, ask your doctor first. And drink water.</w:t>
       </w:r>
     </w:p>
     <w:p>
@@ -358,12 +358,12 @@
           <w:color w:val="5B6472"/>
           <w:sz w:val="22"/>
         </w:rPr>
-        <w:t>On screen: The cake returns, the thin layer glowing light blue, everything else dark. One small line beneath: The Menopause Society. Find a certified practitioner. [URL] Second build: a short timeline, menopause to ten years after, labeled the window. Small: The Menopause Society, 2022 Hormone Therapy Position Statement. Final build: the four layers light one after another, bottom to top, the icing dims, and the headline changes to two words in cream: Now we bake.</w:t>
-      </w:r>
-    </w:p>
-    <w:p>
-      <w:r>
-        <w:t>Before we leave the icing, there's one thing that gets filed under it by mistake, usually by people who've never been through it. Menopause therapy. For half of this room, menopause is going to change your sleep, your bones, your mood, and the shape of your body, and it changes how well every other layer can do its job. Decoration doesn't do that. This is a thin layer of the cake. The Menopause Society's own position, updated in 2022, is that for healthy women with symptoms who are under sixty, or within ten years of menopause, the benefits of hormone therapy generally outweigh the risks. That's their sentence, not mine, and it's why the next line matters. [The Menopause Society, 2022 Position Statement; confirm you want to state it] [your own path, one or two sentences, as much as you choose] The action is one line: find a doctor through the Menopause Society. They keep a directory of certified practitioners. [confirm naming it] This is the one place tonight where I'll say it twice. Your doctor. Not a webinar.</w:t>
+        <w:t>On screen: The cake returns, the thin layer glowing light blue, everything else dark. One small line beneath: The Menopause Society. Find a certified practitioner. [URL] Second build: a short timeline, menopause to ten years after, labeled the window. Small: The Menopause Society, 2022 Hormone Therapy Position Statement. FDA, November 2025: boxed warnings removed from menopausal hormone therapy. Final build: the four layers light one after another, bottom to top, the icing dims, and the headline changes to two words in cream: Now we bake.</w:t>
+      </w:r>
+    </w:p>
+    <w:p>
+      <w:r>
+        <w:t>Before we leave the icing, there's one thing that gets filed under it by mistake, usually by people who've never been through it. Menopause therapy. For half of this room, menopause is going to change your sleep, your bones, your mood, and the shape of your body, and it changes how well every other layer can do its job. Decoration doesn't do that. This is a thin layer of the cake. The Menopause Society's own position, updated in 2022, is that for healthy women with symptoms who are under sixty, or within ten years of menopause, the benefits of hormone therapy generally outweigh the risks. That's their sentence, not mine. And in November 2025 the FDA announced it was removing the black-box warnings from menopausal hormone therapy, the warnings that had kept a generation of women and their doctors away from it. The science moved, the conversation is open again, and that's why the next line matters. [The Menopause Society, 2022 Position Statement; FDA announcement, November 2025; confirm you want to state it] [your own path, one or two sentences, as much as you choose] The action is one line: find a doctor through the Menopause Society. They keep a directory of certified practitioners. [confirm naming it] This is the one place tonight where I'll say it twice. Your doctor. Not a webinar.</w:t>
       </w:r>
     </w:p>
     <w:p>
@@ -413,12 +413,12 @@
           <w:color w:val="5B6472"/>
           <w:sz w:val="22"/>
         </w:rPr>
-        <w:t>On screen: The cake, sleep lit, for the first sentence. Then the night arc: one arc from 9 PM on the left to 5 AM on the right, moon to sun, the five numbers the only type: Lights out 9:00 PM. Up 5:00 AM. Last meal three hours before bed. Screens off one hour before. An eight-hour opportunity, cool and dark. Build between the numbers: a band across the deepest part of the night labeled the repair shift. Small: Xie et al., Science 2013; Fultz et al., Science 2019.</w:t>
-      </w:r>
-    </w:p>
-    <w:p>
-      <w:r>
-        <w:t>Bottom layer. Sleep. I think of it as the repair shift. It's the hours when your body does its maintenance while you're not in the way. That's not a metaphor, by the way. In 2013 a team at the University of Rochester showed that during deep sleep the brain's drainage system opens up and flushes out the day's waste, and in 2019 a Boston team watched the same rhythm in sleeping humans. [Xie et al., Science 2013; Fultz et al., Science 2019] If I skimp on it, everything I do on the other three layers works harder and pays me back less. I'm going to give you my exact numbers, because I find vague advice impossible to follow. "Get good sleep" has never once told me what to do at 8:45 on a Tuesday night.</w:t>
+        <w:t>On screen: The cake, sleep lit, for the first sentence. Then the night arc: one arc from 9 PM on the left to 5 AM on the right, moon to sun, the five numbers the only type: Lights out 9:00 PM. Up 5:00 AM. Last meal three hours before bed. Screens off one hour before. An eight-hour opportunity, cool and dark. Build between the numbers: a band across the deepest part of the night labeled the repair shift. Small: Windred et al., Sleep 2023, 60,977 adults: regularity beat duration. Piantino et al., PNAS 2024: the brain's drainage channels imaged in living people for the first time.</w:t>
+      </w:r>
+    </w:p>
+    <w:p>
+      <w:r>
+        <w:t>Bottom layer. Sleep. I think of it as the repair shift. It's the hours when your body does its maintenance while you're not in the way. That's not a metaphor, by the way. The brain has a drainage system that does most of its flushing while you sleep, and in 2024 a team at Oregon Health &amp; Science University imaged those channels in living people for the first time. [Piantino et al., PNAS 2024; first described in mice by Xie et al., Science 2013] And here's why the headline says bedtime. In 2023 a study of nearly sixty-one thousand adults wearing trackers found that how regular your sleep is predicted who lived longer better than how long you slept; the most regular sleepers had a twenty to forty-eight percent lower risk of dying from any cause. Same bedtime, same wake time. [Windred et al., Sleep 2023; confirm the figures before you say them] If I skimp on it, everything I do on the other three layers works harder and pays me back less. I'm going to give you my exact numbers, because I find vague advice impossible to follow. "Get good sleep" has never once told me what to do at 8:45 on a Tuesday night.</w:t>
       </w:r>
     </w:p>
     <w:p>
@@ -491,7 +491,7 @@
           <w:color w:val="5B6472"/>
           <w:sz w:val="22"/>
         </w:rPr>
-        <w:t>On screen: The cake, food lit, for the opening. Then the plate, seen from above, three parts, one line each: Protein is the floor. Fiber is the lever. Whole food is the default. Final build: five numbers around the rim: A pound of vegetables a day. One gram of protein per pound of goal bodyweight. Eat between 8 AM and 6 PM. Coffee cutoff 10 AM. No alcohol on training days. Beside the plate, two numbers: the fiber target, 25 to 38 grams a day, and the average American, about 15. Small: Dietary Guidelines for Americans; Quagliani and Felt-Gunderson, 2017.</w:t>
+        <w:t>On screen: The cake, food lit, for the opening. Then the plate, seen from above, three parts, one line each: Protein is the floor. Fiber is the lever. Whole food is the default. Final build: five numbers around the rim: A pound of vegetables a day. One gram of protein per pound of goal bodyweight. Eat between 8 AM and 6 PM. Coffee cutoff 10 AM. No alcohol on training days. Beside the plate, two numbers: the fiber target, 25 to 38 grams a day, and the share of Americans who miss it: more than 90 percent of women, 97 percent of men. Small: Dietary Guidelines for Americans, 2020 to 2025.</w:t>
       </w:r>
     </w:p>
     <w:p>
@@ -501,7 +501,7 @@
     </w:p>
     <w:p>
       <w:r>
-        <w:t>My plate has three rules. Protein is the floor. It's there at every meal, no exceptions. Fiber is the lever, which is where the vegetables come in, and that's where most of the work gets done. Here's why it's the lever: the target is 25 to 38 grams a day, and the average American gets about 15. Almost nobody is hitting it, which means almost everybody has room. [Dietary Guidelines for Americans; Quagliani and Felt-Gunderson, 2017] And whole food is the default. When I have a choice, I pick the thing that looks like it came from the ground or an animal, not a factory.</w:t>
+        <w:t>My plate has three rules. Protein is the floor. It's there at every meal, no exceptions. Fiber is the lever, which is where the vegetables come in, and that's where most of the work gets done. Here's why it's the lever: the target is 25 to 38 grams a day, and the government's own dietary guidelines say more than ninety percent of women and ninety-seven percent of men don't get there. Almost nobody is hitting it, which means almost everybody has room. [Dietary Guidelines for Americans 2020 to 2025; confirm] And whole food is the default. When I have a choice, I pick the thing that looks like it came from the ground or an animal, not a factory.</w:t>
       </w:r>
     </w:p>
     <w:p>
@@ -535,7 +535,7 @@
           <w:color w:val="5B6472"/>
           <w:sz w:val="22"/>
         </w:rPr>
-        <w:t>On screen: The sugar slide, Omri's build in the same 3D language, three panels on one object: Spike (a glucose curve jumping after a meal), Signal (insulin and the nutrient-sensing pathways switching on; deregulated nutrient sensing is one of the twelve hallmarks of aging), Scar (sugar bonding to proteins, glycation; HbA1c is the measured version of this). Approved slide, model added. Small: López-Otín et al., Cell 2023; Uribarri et al., 2010. Final build: the object dims and two large checkboxes appear, Move dinner earlier and Rebuild one plate, under one word: Monday.</w:t>
+        <w:t>On screen: The sugar slide, Omri's build in the same 3D language, three panels on one object: Spike (a glucose curve jumping after a meal), Signal (insulin and the nutrient-sensing pathways switching on; deregulated nutrient sensing is one of the twelve hallmarks of aging), Scar (sugar bonding to proteins, glycation; HbA1c is the measured version of this). Approved slide, model added. Small: López-Otín et al., Hallmarks of aging, Cell 2023. Final build: the object dims and two large checkboxes appear, Move dinner earlier and Rebuild one plate, under one word: Monday.</w:t>
       </w:r>
     </w:p>
     <w:p>
@@ -590,12 +590,12 @@
           <w:color w:val="5B6472"/>
           <w:sz w:val="22"/>
         </w:rPr>
-        <w:t>On screen: The cake, movement lit, for one breath. Then the photograph: two people, full height, the same age, side by side, same light, same background. One stands tall. One leans on a cane. Two words, cream, centered low. Approved visual, unchanged. Under each figure, a bar: years lived, and years lived well. The gap between them is about twelve years. Small: WHO, healthy life expectancy, United States, 2019.</w:t>
-      </w:r>
-    </w:p>
-    <w:p>
-      <w:r>
-        <w:t>Third layer. Movement. I'm not going to demonstrate a workout. I want to show you one picture. Two people. Same age. One stands tall. One leans on a cane. Not everything that puts a person on a cane is a choice, and I would never say it was. But a great deal of what keeps you off one is a weekly pattern, and that pattern is a choice you can make this week. [confirm you're comfortable with this framing] Here's the number behind the picture. In America, life expectancy is about seventy-eight. Healthy life expectancy, the years you live without serious illness or disability, is about sixty-six. Twelve years, on average, at the end, in poor health. Those twelve years are what this layer is about. [WHO 2019 figures; confirm]</w:t>
+        <w:t>On screen: The cake, movement lit, for one breath. Then the photograph: two people, full height, the same age, side by side, same light, same background. One stands tall. One leans on a cane. Two words, cream, centered low. Approved visual, unchanged. Under each figure, a bar: years lived, and years lived well. The gap between them is 12.4 years. Small: Garmany and Terzic, Mayo Clinic, JAMA Network Open, December 2024: 183 countries; the United States gap is the widest.</w:t>
+      </w:r>
+    </w:p>
+    <w:p>
+      <w:r>
+        <w:t>Third layer. Movement. I'm not going to demonstrate a workout. I want to show you one picture. Two people. Same age. One stands tall. One leans on a cane. Not everything that puts a person on a cane is a choice, and I would never say it was. But a great deal of what keeps you off one is a weekly pattern, and that pattern is a choice you can make this week. [confirm you're comfortable with this framing] Here's the number behind the picture. In December 2024 the Mayo Clinic measured the gap between how long people live and how long they live in good health, in 183 countries. Worldwide it's 9.6 years. In the United States it's 12.4 years, the widest gap in the world. Twelve years, on average, at the end, in poor health. Those twelve years are what this layer is about. [Garmany and Terzic, JAMA Network Open, December 2024; confirm]</w:t>
       </w:r>
     </w:p>
     <w:p>
@@ -624,7 +624,7 @@
           <w:color w:val="5B6472"/>
           <w:sz w:val="22"/>
         </w:rPr>
-        <w:t>On screen: The body map: a translucent figure in profile, four points lighting as you name them, bones and muscle, heart, heart, brain. Four tiles to the right, each with the number researchers use to predict how long you live: Weights, grip strength (Leong et al., Lancet 2015). VO2 max, fitness (Mandsager et al., JAMA Network Open 2018). Zone 2, steps a day (Paluch et al., JAMA Network Open 2021). Mobility and balance, the ten-second one-leg stand (Araujo et al., British Journal of Sports Medicine 2022). The macro slide: the four types, before any detail.</w:t>
+        <w:t>On screen: The body map: a translucent figure in profile, four points lighting as you name them, bones and muscle, heart, heart, brain. Four tiles to the right, each with the number researchers use to predict how long you live: Weights, grip strength (López-Bueno et al., Ageing Research Reviews 2022, 48 studies, 3.1 million people). VO2 max, fitness (Lang et al., British Journal of Sports Medicine 2024, 20.9 million observations). Zone 2, steps a day (Ding et al., The Lancet Public Health, July 2025, 57 studies). Mobility and balance, the one-leg stand (Mayo Clinic, PLOS One, October 2024; Araujo et al., British Journal of Sports Medicine 2022). The macro slide: the four types, before any detail.</w:t>
       </w:r>
     </w:p>
     <w:p>
@@ -639,7 +639,7 @@
     </w:p>
     <w:p>
       <w:r>
-        <w:t>And each tile has a number attached, one that researchers have used to predict how long people live. Grip strength: in a study of a hundred and forty thousand people across seventeen countries, every five kilos of grip you lose came with a sixteen percent higher risk of dying. Fitness: at the Cleveland Clinic, among a hundred and twenty-two thousand patients, being unfit was a bigger risk than smoking. Steps: seven thousand a day cut the risk of death by half or more over ten years, in people in their forties. And balance: in a study of adults between fifty-one and seventy-five, the people who couldn't stand on one leg for ten seconds had an eighty-four percent higher risk of dying in the next decade. Try it tonight. Ten seconds. Shoes off. [Leong 2015; Mandsager 2018; Paluch 2021; Araujo 2022; confirm the figures before you say them]</w:t>
+        <w:t>And each tile has a number attached, one that researchers have used to predict how long people live. Grip strength: a 2022 review pooled forty-eight studies and more than three million people, and the stronger the grip, the lower the risk of dying, almost in a straight line. Fitness: in 2024 the British Journal of Sports Medicine pooled nearly twenty-one million observations, and every single step up in fitness, one MET, came with an eleven to seventeen percent lower risk of dying. Steps: in July 2025 The Lancet Public Health pooled fifty-seven studies. Seven thousand steps a day, against two thousand, came with a forty-seven percent lower risk of dying and a thirty-eight percent lower risk of dementia. Seven thousand. Not ten. And balance: in 2024 the Mayo Clinic tested people over fifty on grip, knee strength, walking and standing on one leg, and the one-leg stand was the measure that fell fastest with age, a better marker of aging than any of the others. Try it tonight. Shoes off. Non-dominant leg. See how close you get to thirty seconds. [López-Bueno et al., Ageing Research Reviews 2022; Lang et al., British Journal of Sports Medicine 2024; Ding et al., The Lancet Public Health 2025; Mayo Clinic, Kaufman and colleagues, PLOS One 2024; confirm the figures before you say them]</w:t>
       </w:r>
     </w:p>
     <w:p>
@@ -762,12 +762,12 @@
           <w:color w:val="5B6472"/>
           <w:sz w:val="22"/>
         </w:rPr>
-        <w:t>On screen: The day ring: your day as a clock, 5 AM to 9 PM, each hour colored by its layer, 9 PM at the top so the eye starts at bedtime. Large hour marks: 5 wake, 7 gym and sauna, 8 window opens, 10 coffee closes, midday biggest meal and walk, afternoon meditation, 6 last meal, 8 screens off, 9 lights out. The one-page schedule people were promised. The ten hours from 8 to 6 shaded as one band: the eating window. Small: Wilkinson et al., Cell Metabolism 2020, the Salk Institute. They screenshot this one.</w:t>
-      </w:r>
-    </w:p>
-    <w:p>
-      <w:r>
-        <w:t>Now let's put the layers into a day, because a day is where they fight each other for the same hour. Five. Wake. Water first, then light. [how you get light: outside, or blinds] Seven, the gym, then the sauna, which we've established is the real reason I show up. [confirm your training time] Eight, the eating window opens. Ten, coffee closes. That window, eight to six, is ten hours, and it isn't an accident: the Salk Institute's work on time-restricted eating used a ten-hour window and saw weight, blood pressure and cholesterol improve in twelve weeks. [Wilkinson et al., Cell Metabolism 2020; confirm] Midday, work, my biggest meal, and the walk after it. [confirm] Afternoon, meditation. [confirm when] Six, last meal. Eight, screens off. Nine, lights out.</w:t>
+        <w:t>On screen: The day ring: your day as a clock, 5 AM to 9 PM, each hour colored by its layer, 9 PM at the top so the eye starts at bedtime. Large hour marks: 5 wake, 7 gym and sauna, 8 window opens, 10 coffee closes, midday biggest meal and walk, afternoon meditation, 6 last meal, 8 screens off, 9 lights out. The one-page schedule people were promised. The ten hours from 8 to 6 shaded as one band: the eating window. Small: Manoogian et al., Annals of Internal Medicine, October 2024: the TIMET trial, Salk Institute and UC San Diego, 108 adults, three months. They screenshot this one.</w:t>
+      </w:r>
+    </w:p>
+    <w:p>
+      <w:r>
+        <w:t>Now let's put the layers into a day, because a day is where they fight each other for the same hour. Five. Wake. Water first, then light. [how you get light: outside, or blinds] Seven, the gym, then the sauna, which we've established is the real reason I show up. [confirm your training time] Eight, the eating window opens. Ten, coffee closes. That window, eight to six, is ten hours, and it isn't an accident: in October 2024 the Salk Institute and UC San Diego published a randomized trial of a hundred and eight adults with metabolic syndrome. The group that kept its eating inside an eight-to-ten-hour window for three months improved its blood sugar marker, HbA1c, and lost about three to four percent of body weight, mostly fat, on top of standard nutrition advice. [Manoogian et al., Annals of Internal Medicine 2024; confirm] Midday, work, my biggest meal, and the walk after it. [confirm] Afternoon, meditation. [confirm when] Six, last meal. Eight, screens off. Nine, lights out.</w:t>
       </w:r>
     </w:p>
     <w:p>
@@ -856,7 +856,7 @@
           <w:color w:val="5B6472"/>
           <w:sz w:val="22"/>
         </w:rPr>
-        <w:t>On screen: The closing cake, every layer lit, the icing on top, turning slowly. Approved visual, unchanged. Build 2: two curves on one chart, how long we live and how long we live well, and the gap between them closing. Small: Fries, New England Journal of Medicine 1980, the compression of morbidity. Build 3: the cake recedes and the ring of three rises: Why, Intention, Resources on a lit ring, a line between each pair; the center lights only when all three are on. Build 4: the Blueprint card in your video-card style, the Academy mark top center, two lines, "The same cake, built week by week," in cream and "with a teacher." in light blue. Final: Your why. Your intention. Your resources. One thing. Forty-eight hours. [link or QR]</w:t>
+        <w:t>On screen: The closing cake, every layer lit, the icing on top, turning slowly. Approved visual, unchanged. Build 2: two curves on one chart, how long we live and how long we live well, and the gap between them closing. Small: the compression of morbidity, Fries 1980. The gap today: 9.6 years worldwide, 12.4 in the United States. Garmany and Terzic, JAMA Network Open 2024. Build 3: the cake recedes and the ring of three rises: Why, Intention, Resources on a lit ring, a line between each pair; the center lights only when all three are on. Build 4: the Blueprint card in your video-card style, the Academy mark top center, two lines, "The same cake, built week by week," in cream and "with a teacher." in light blue. Final: Your why. Your intention. Your resources. One thing. Forty-eight hours. [link or QR]</w:t>
       </w:r>
     </w:p>
     <w:p>
@@ -866,7 +866,7 @@
     </w:p>
     <w:p>
       <w:r>
-        <w:t>What's my why? Mine isn't a leaderboard. It's a kid who needs his mom to show up for a long time. [your words] A why is a direction. It tells you which way to walk. It doesn't tell you how far or how fast. What's my intention? That's the thing you'd write on the wall. Mine is one sentence: I want my healthspan to match my lifespan. There's a drawing from 1980 by a Stanford doctor named James Fries that says it better than I can: two lines, how long you live and how long you live well. Most of medicine pushes the first line out. The point is to drag the second one up to meet it. [Fries, New England Journal of Medicine 1980] Every year I'm alive, I want to be able to use. You can measure that. And what are my resources? Time, money, energy. The real amounts, not the ones you wish you had. Mine are an hour in the morning and about twelve dollars a day. [confirm] Resources set the pace. They decide what you're still doing in March, when nobody's watching.</w:t>
+        <w:t>What's my why? Mine isn't a leaderboard. It's a kid who needs his mom to show up for a long time. [your words] A why is a direction. It tells you which way to walk. It doesn't tell you how far or how fast. What's my intention? That's the thing you'd write on the wall. Mine is one sentence: I want my healthspan to match my lifespan. A Stanford doctor named James Fries drew it as two lines, how long you live and how long you live well, and in December 2024 the Mayo Clinic measured the gap between those two lines: nine and a half years worldwide, more than twelve in this country. Most of medicine pushes the first line out. The point is to drag the second one up to meet it. [Fries, the compression of morbidity, 1980; Garmany and Terzic, JAMA Network Open 2024] Every year I'm alive, I want to be able to use. You can measure that. And what are my resources? Time, money, energy. The real amounts, not the ones you wish you had. Mine are an hour in the morning and about twelve dollars a day. [confirm] Resources set the pace. They decide what you're still doing in March, when nobody's watching.</w:t>
       </w:r>
     </w:p>
     <w:p>
@@ -1046,7 +1046,7 @@
           <w:color w:val="5B6472"/>
           <w:sz w:val="22"/>
         </w:rPr>
-        <w:t>On screen: First the plain line, huge, cream: Ten years pass. By this test, I age about six. Nothing else, so the room gets the point before any science. Then the gauge rises, hero size: dark glass face, 1.0 at the top, needle glowing light blue at 0.65, cream ticks at 0.665 and 0.76, and the second beat of the headline in light blue: The speed towards death. Build: the needle sweeps down to 0.65 as you say it, then up to 0.76. Approved visual, unchanged. Final build: the pace-of-aging curve from the study behind the test, a soft bell drawn over the gauge: most people near 1.0, a few near zero, a tail out to three years per year, your 0.665 marked on it. Small: Belsky et al., PNAS 2015.</w:t>
+        <w:t>On screen: First the plain line, huge, cream: Ten years pass. By this test, I age about six. Nothing else, so the room gets the point before any science. Then the gauge rises, hero size: dark glass face, 1.0 at the top, needle glowing light blue at 0.65, cream ticks at 0.665 and 0.76, and the second beat of the headline in light blue: The speed towards death. Build: the needle sweeps down to 0.65 as you say it, then up to 0.76. Approved visual, unchanged. Final build: the pace-of-aging curve, a soft bell drawn over the gauge: most people near 1.0, some slower, a tail of people aging much faster, your 0.665 marked on it. Small: DunedinPACE, Belsky et al., eLife 2022. Now used in more than 65 cohort studies in 18 countries (Duke University, January 2025).</w:t>
       </w:r>
     </w:p>
     <w:p>
@@ -1056,7 +1056,7 @@
     </w:p>
     <w:p>
       <w:r>
-        <w:t>The test is called DunedinPACE. It reads your blood and estimates how fast your body is aging right now. The scientists call it pace of aging. I call it your speed towards death, because that's what it is, and because it got my attention. A score of 1.0 means one year of aging for every calendar year, which is what most people do. [check against the provider's wording] In 2023 my best score was 0.65. That score put me second in the Rejuvenation Olympics, a global leaderboard of about [number] people, ahead of some very well-funded programs. Average my three tests and I land at 0.665. That's the more honest number, so you get both. And so you know this isn't a vanity number: in the study that built this test, 954 people, all aged 38, were measured. Most were aging about a year per year. A few were close to zero. And some were aging close to three years for every year on the calendar. [Belsky et al., PNAS 2015; confirm you are comfortable citing it]</w:t>
+        <w:t>The test is called DunedinPACE. It reads your blood and estimates how fast your body is aging right now. The scientists call it pace of aging. I call it your speed towards death, because that's what it is, and because it got my attention. A score of 1.0 means one year of aging for every calendar year, which is what most people do. [check against the provider's wording] In 2023 my best score was 0.65. That score put me second in the Rejuvenation Olympics, a global leaderboard of about [number] people, ahead of some very well-funded programs. Average my three tests and I land at 0.665. That's the more honest number, so you get both. And so you know this isn't a vanity number or a gimmick: the test was built at Duke and Columbia from a group of people followed since birth, it was published in 2022, and it's now being used in more than sixty-five large studies in eighteen countries. In 2024, Nature Aging reported that older adults with a faster pace on this test went on to have shorter healthspans and shorter lives. [Belsky et al., eLife 2022; Balachandran et al., Nature Aging 2024; Duke University DunedinPACE summary, January 2025; confirm you are comfortable citing it]</w:t>
       </w:r>
     </w:p>
     <w:p>
@@ -1090,12 +1090,12 @@
           <w:color w:val="5B6472"/>
           <w:sz w:val="22"/>
         </w:rPr>
-        <w:t>On screen: First build, one root and four branches: Aging at the root, and heart disease, cancer, dementia, type 2 diabetes on the branches. Small: the geroscience hypothesis, Kennedy et al., Cell 2014. Then the cake, hero size, turning slowly, every layer lit evenly this once: Sleep, Food, Movement, Stress Management, the thin layer, the icing labeled Therapies, exactly as you drew it. Approved visual, unchanged. It returns at the start of each layer, that layer lit.</w:t>
-      </w:r>
-    </w:p>
-    <w:p>
-      <w:r>
-        <w:t>Before the how, one picture of why anyone bothers. Aging is the biggest risk factor for the four things we're all afraid of: heart disease, cancer, dementia, type 2 diabetes. Slow the aging itself and you push all four back at once. That's the whole bet of a field called geroscience, and it's the bet I made. [Kennedy et al., Cell 2014; the Buck Institute's founding idea] So what moved the number? Here's the model I use for everything. Longevity is like a cake. Four layers: sleep, food, movement, and stress management. Most of the work lives there. For women there's one more thin layer, and I'll come to it in a few minutes. On top is the icing: sauna, IVs, peptides, the pill with the exciting name. Icing is delightful. Nobody has ever eaten a bowl of icing and called it a cake. Part one is about telling the two apart.</w:t>
+        <w:t>On screen: First build, one root and four branches: Aging at the root, and heart disease, cancer, dementia, type 2 diabetes on the branches. Small: the geroscience hypothesis, the Buck Institute; the twelve hallmarks of aging, López-Otín et al., Cell 2023. Then the cake, hero size, turning slowly, every layer lit evenly this once: Sleep, Food, Movement, Stress Management, the thin layer, the icing labeled Therapies, exactly as you drew it. Approved visual, unchanged. It returns at the start of each layer, that layer lit.</w:t>
+      </w:r>
+    </w:p>
+    <w:p>
+      <w:r>
+        <w:t>Before the how, one picture of why anyone bothers. Aging is the biggest risk factor for the four things we're all afraid of: heart disease, cancer, dementia, type 2 diabetes. Slow the aging itself and you push all four back at once. That's the whole bet of a field called geroscience, and it's the bet I made. [the geroscience hypothesis, the Buck Institute's founding idea, Kennedy et al., Cell 2014; its current form, López-Otín et al., Hallmarks of aging, Cell 2023] So what moved the number? Here's the model I use for everything. Longevity is like a cake. Four layers: sleep, food, movement, and stress management. Most of the work lives there. For women there's one more thin layer, and I'll come to it in a few minutes. On top is the icing: sauna, IVs, peptides, the pill with the exciting name. Icing is delightful. Nobody has ever eaten a bowl of icing and called it a cake. Part one is about telling the two apart.</w:t>
       </w:r>
     </w:p>
     <w:p>
@@ -1140,7 +1140,7 @@
           <w:color w:val="5B6472"/>
           <w:sz w:val="22"/>
         </w:rPr>
-        <w:t>On screen: The cost map rises: a two-by-two, cost left to right, strength of human evidence bottom to top, glass markers placed on it: Sauna (cheap, twenty years of data), Prebiotics and most supplements (cheap, depends on a test), NAD drips, Peptides, Stem cells (expensive, thin human evidence), Rapamycin with a doctor (prescription, strong animal data, human trials under way), and one marker off the chart at the far right, the two-million-a-year program. [confirm the placements] Small, under the sauna marker: Laukkanen et al., JAMA Internal Medicine 2015. Build 2: four markers turn amber and a line appears above them, "Four things not worth your money. Yet." Build 3: the sauna marker glows warm. Build 4: a single coin at the far left, "Twelve dollars a day."</w:t>
+        <w:t>On screen: The cost map rises: a two-by-two, cost left to right, strength of human evidence bottom to top, glass markers placed on it: Sauna (cheap, nearly thirty years of data), Prebiotics and most supplements (cheap, depends on a test), NAD drips, Peptides, Stem cells (expensive, thin human evidence), Rapamycin with a doctor (prescription, strong animal data, human trials under way), and one marker off the chart at the far right, the two-million-a-year program. [confirm the placements] Small, under the sauna marker: Kunutsor, Jae, Kurl and Laukkanen, Scandinavian Cardiovascular Journal 2024; Laukkanen et al., BMC Medicine 2018. Build 2: four markers turn amber and a line appears above them, "Four things not worth your money. Yet." Build 3: the sauna marker glows warm. Build 4: a single coin at the far left, "Twelve dollars a day."</w:t>
       </w:r>
     </w:p>
     <w:p>
@@ -1155,7 +1155,7 @@
     </w:p>
     <w:p>
       <w:r>
-        <w:t>The one piece of icing I actually use is the cheapest one. Sauna, three to five days a week, at my gym. And I'll tell you a secret that will horrify every personal trainer on this call: the sauna is what gets me out of bed. It's never the thought of a VO2 max workout. I get up for the sauna, and the workout happens to be on the way. And it's the one piece of icing with serious long-term data behind it. A Finnish study followed 2,315 men for about twenty years. The men who used a sauna four to seven times a week had a forty percent lower risk of dying from any cause than the men who went once a week. [Laukkanen et al., JAMA Internal Medicine 2015; add your own From Paper to Plate sources if you prefer] A quick safety note: heart or blood pressure concerns, ask your doctor first, and drink water.</w:t>
+        <w:t>The one piece of icing I actually use is the cheapest one. Sauna, three to five days a week, at my gym. And I'll tell you a secret that will horrify every personal trainer on this call: the sauna is what gets me out of bed. It's never the thought of a VO2 max workout. I get up for the sauna, and the workout happens to be on the way. And it's the one piece of icing with serious long-term data behind it. The Finnish group that has studied this longest published its latest analysis in 2024: 2,575 men followed for almost twenty-eight years. The men who used a sauna twice a week or less had a sixteen percent higher risk of dying from any cause than the men who went three to seven times. Their 2018 study, which included women, pointed the same way. [Kunutsor, Jae, Kurl and Laukkanen, Scandinavian Cardiovascular Journal 2024; Laukkanen et al., BMC Medicine 2018, 1,688 men and women over fifty, fifteen years; add your own From Paper to Plate sources if you prefer] A quick safety note: heart or blood pressure concerns, ask your doctor first, and drink water.</w:t>
       </w:r>
     </w:p>
     <w:p>
@@ -1189,12 +1189,12 @@
           <w:color w:val="5B6472"/>
           <w:sz w:val="22"/>
         </w:rPr>
-        <w:t>On screen: The cake returns, the thin layer glowing light blue, everything else dark. One small line beneath: The Menopause Society. Find a certified practitioner. [URL] Second build: a short timeline, menopause to ten years after, labeled the window. Small: The Menopause Society, 2022 Hormone Therapy Position Statement. Final build: the four layers light one after another from the bottom, the icing dims, and three words appear beside them as you say them, Sleep, Food, Movement, with a fourth in light blue, Stress, and one line: the layer that makes the other three possible. The three inputs the site promised, as the bridge into part two.</w:t>
-      </w:r>
-    </w:p>
-    <w:p>
-      <w:r>
-        <w:t>One thing gets filed under icing that doesn't belong there. Menopause therapy. For half of this room, menopause will change your sleep, your bones, your mood, and your body composition, and it changes how well every other layer can work. That is not icing. That's a thin layer of the cake, and it deserves the same seriousness as the other four. The Menopause Society's own position, updated in 2022, is that for healthy women with symptoms who are under sixty, or within ten years of menopause, the benefits of hormone therapy generally outweigh the risks. That's their sentence, not mine, and it's why the next line matters. [The Menopause Society, 2022 Position Statement; confirm you want to state it] [your own path, one or two sentences, as much as you choose] The action is one line: find a doctor through the Menopause Society, which keeps a directory of certified practitioners. [confirm naming it] On this one I'll say it twice. Your doctor. Not a webinar.</w:t>
+        <w:t>On screen: The cake returns, the thin layer glowing light blue, everything else dark. One small line beneath: The Menopause Society. Find a certified practitioner. [URL] Second build: a short timeline, menopause to ten years after, labeled the window. Small: The Menopause Society, 2022 Hormone Therapy Position Statement. FDA, November 2025: boxed warnings removed from menopausal hormone therapy. Final build: the four layers light one after another from the bottom, the icing dims, and three words appear beside them as you say them, Sleep, Food, Movement, with a fourth in light blue, Stress, and one line: the layer that makes the other three possible. The three inputs the site promised, as the bridge into part two.</w:t>
+      </w:r>
+    </w:p>
+    <w:p>
+      <w:r>
+        <w:t>One thing gets filed under icing that doesn't belong there. Menopause therapy. For half of this room, menopause will change your sleep, your bones, your mood, and your body composition, and it changes how well every other layer can work. That is not icing. That's a thin layer of the cake, and it deserves the same seriousness as the other four. The Menopause Society's own position, updated in 2022, is that for healthy women with symptoms who are under sixty, or within ten years of menopause, the benefits of hormone therapy generally outweigh the risks. That's their sentence, not mine. And in November 2025 the FDA announced it was removing the black-box warnings from menopausal hormone therapy, the warnings that had kept a generation of women and their doctors away from it. The science moved, the conversation is open again, and that's why the next line matters. [The Menopause Society, 2022 Position Statement; FDA announcement, November 2025; confirm you want to state it] [your own path, one or two sentences, as much as you choose] The action is one line: find a doctor through the Menopause Society, which keeps a directory of certified practitioners. [confirm naming it] On this one I'll say it twice. Your doctor. Not a webinar.</w:t>
       </w:r>
     </w:p>
     <w:p>
@@ -1244,12 +1244,12 @@
           <w:color w:val="5B6472"/>
           <w:sz w:val="22"/>
         </w:rPr>
-        <w:t>On screen: The cake, sleep lit, for the first sentence. Then the night arc, 9 PM on the left to 5 AM on the right, moon to sun, the five numbers the only type: Lights out 9:00 PM. Up 5:00 AM. Last meal three hours before bed. Screens off one hour before bed. An eight-hour opportunity, cool and dark. Build between the numbers: a band across the deepest part of the night labeled the repair shift. Small: Xie et al., Science 2013; Fultz et al., Science 2019.</w:t>
-      </w:r>
-    </w:p>
-    <w:p>
-      <w:r>
-        <w:t>Sleep is the bottom layer, and I think of it as the repair shift: the time your body does its maintenance while you're not in the way. That's not a metaphor, by the way. In 2013 a team at the University of Rochester showed that during deep sleep the brain's drainage system opens up and flushes out the day's waste, and in 2019 a Boston team watched the same rhythm in sleeping humans. [Xie et al., Science 2013; Fultz et al., Science 2019] If I skimp on it, everything I do on the other three layers works harder and pays me back less. I'm going to give you exact numbers, because I find vague advice impossible to follow. "Get good sleep" has never once told me what to do at 8:45 on a Tuesday night.</w:t>
+        <w:t>On screen: The cake, sleep lit, for the first sentence. Then the night arc, 9 PM on the left to 5 AM on the right, moon to sun, the five numbers the only type: Lights out 9:00 PM. Up 5:00 AM. Last meal three hours before bed. Screens off one hour before bed. An eight-hour opportunity, cool and dark. Build between the numbers: a band across the deepest part of the night labeled the repair shift. Small: Windred et al., Sleep 2023, 60,977 adults: regularity beat duration. Piantino et al., PNAS 2024: the brain's drainage channels imaged in living people for the first time.</w:t>
+      </w:r>
+    </w:p>
+    <w:p>
+      <w:r>
+        <w:t>Sleep is the bottom layer, and I think of it as the repair shift: the time your body does its maintenance while you're not in the way. That's not a metaphor, by the way. The brain has a drainage system that does most of its flushing while you sleep, and in 2024 a team at Oregon Health &amp; Science University imaged those channels in living people for the first time. [Piantino et al., PNAS 2024; first described in mice by Xie et al., Science 2013] And here's why the headline says bedtime. In 2023 a study of nearly sixty-one thousand adults wearing trackers found that how regular your sleep is predicted who lived longer better than how long you slept; the most regular sleepers had a twenty to forty-eight percent lower risk of dying from any cause. Same bedtime, same wake time. [Windred et al., Sleep 2023; confirm the figures before you say them] If I skimp on it, everything I do on the other three layers works harder and pays me back less. I'm going to give you exact numbers, because I find vague advice impossible to follow. "Get good sleep" has never once told me what to do at 8:45 on a Tuesday night.</w:t>
       </w:r>
     </w:p>
     <w:p>
@@ -1317,12 +1317,12 @@
           <w:color w:val="5B6472"/>
           <w:sz w:val="22"/>
         </w:rPr>
-        <w:t>On screen: The cake, food lit, for the opening. Then the plate, seen from above, three parts, one line each: Protein is the floor. Fiber is the lever. Whole food is the default. Final build: five numbers around the rim: One pound of vegetables a day. One gram of protein per pound of goal bodyweight. Eating window 8:00 AM to 6:00 PM. Coffee cutoff 10:00 AM. Zero alcohol on training days. Beside the plate, two numbers: the fiber target, 25 to 38 grams a day, and the average American, about 15. Small: Dietary Guidelines for Americans; Quagliani and Felt-Gunderson, 2017.</w:t>
-      </w:r>
-    </w:p>
-    <w:p>
-      <w:r>
-        <w:t>Now food, and first, the type of diet. Vegan, keto, Mediterranean, carnivore. It isn't about the type. I've been vegan; I've been most things. [confirm] People need to take the religion out of their diet and look at the plate. I think of mine in three parts. Protein is the floor; I make sure it's there at every meal. Fiber is the lever, which is where the vegetables come in. Here's why it's the lever: the target is 25 to 38 grams a day, and the average American gets about 15. Almost nobody is hitting it, which means almost everybody has room. [Dietary Guidelines for Americans; Quagliani and Felt-Gunderson, 2017] And whole food is the default: when I have a choice, I pick the thing that looks like it came from the ground or an animal, not from a factory.</w:t>
+        <w:t>On screen: The cake, food lit, for the opening. Then the plate, seen from above, three parts, one line each: Protein is the floor. Fiber is the lever. Whole food is the default. Final build: five numbers around the rim: One pound of vegetables a day. One gram of protein per pound of goal bodyweight. Eating window 8:00 AM to 6:00 PM. Coffee cutoff 10:00 AM. Zero alcohol on training days. Beside the plate, two numbers: the fiber target, 25 to 38 grams a day, and the share of Americans who miss it: more than 90 percent of women, 97 percent of men. Small: Dietary Guidelines for Americans, 2020 to 2025.</w:t>
+      </w:r>
+    </w:p>
+    <w:p>
+      <w:r>
+        <w:t>Now food, and first, the type of diet. Vegan, keto, Mediterranean, carnivore. It isn't about the type. I've been vegan; I've been most things. [confirm] People need to take the religion out of their diet and look at the plate. I think of mine in three parts. Protein is the floor; I make sure it's there at every meal. Fiber is the lever, which is where the vegetables come in. Here's why it's the lever: the target is 25 to 38 grams a day, and the government's own dietary guidelines say more than ninety percent of women and ninety-seven percent of men don't get there. Almost nobody is hitting it, which means almost everybody has room. [Dietary Guidelines for Americans 2020 to 2025; confirm] And whole food is the default: when I have a choice, I pick the thing that looks like it came from the ground or an animal, not from a factory.</w:t>
       </w:r>
     </w:p>
     <w:p>
@@ -1356,7 +1356,7 @@
           <w:color w:val="5B6472"/>
           <w:sz w:val="22"/>
         </w:rPr>
-        <w:t>On screen: The sugar slide, Omri's build in the same 3D language, three panels on one object: Spike (a glucose curve jumping after a meal), Signal (insulin and the nutrient-sensing pathways switching on; deregulated nutrient sensing is one of the twelve hallmarks of aging), Scar (sugar bonding to proteins, glycation; HbA1c is the measured version of this). Approved slide, model added. Small: López-Otín et al., Cell 2023; Uribarri et al., 2010. Final build: the object dims and two large checkboxes appear, Move dinner earlier and Rebuild one plate, under the words: Two changes for Monday.</w:t>
+        <w:t>On screen: The sugar slide, Omri's build in the same 3D language, three panels on one object: Spike (a glucose curve jumping after a meal), Signal (insulin and the nutrient-sensing pathways switching on; deregulated nutrient sensing is one of the twelve hallmarks of aging), Scar (sugar bonding to proteins, glycation; HbA1c is the measured version of this). Approved slide, model added. Small: López-Otín et al., Hallmarks of aging, Cell 2023. Final build: the object dims and two large checkboxes appear, Move dinner earlier and Rebuild one plate, under the words: Two changes for Monday.</w:t>
       </w:r>
     </w:p>
     <w:p>
@@ -1411,12 +1411,12 @@
           <w:color w:val="5B6472"/>
           <w:sz w:val="22"/>
         </w:rPr>
-        <w:t>On screen: The cake, movement lit, for one breath. Then the photograph: two people, full height, the same age, side by side, same light, same background; one stands tall, one leans on a cane. Headline low, cream. Approved visual, unchanged. Under each figure, a bar: years lived, and years lived well. The gap between them is about twelve years. Small: WHO, healthy life expectancy, United States, 2019.</w:t>
-      </w:r>
-    </w:p>
-    <w:p>
-      <w:r>
-        <w:t>Third layer, movement. I'm not going to demonstrate a workout. I want to start with why it matters, in one picture. Two people, the same age. One stands tall. One leans on a cane. Not everything that puts a person on a cane is a choice, and I would never say it was. But a great deal of what keeps you off one is a weekly pattern, and that pattern is a choice. [confirm the framing] Here's the number behind the picture. In America, life expectancy is about seventy-eight. Healthy life expectancy, the years you live without serious illness or disability, is about sixty-six. Twelve years, on average, at the end, in poor health. Those twelve years are what this layer is about. [WHO 2019 figures; confirm] Then I'll show you what belongs in that pattern, and then what my week looks like.</w:t>
+        <w:t>On screen: The cake, movement lit, for one breath. Then the photograph: two people, full height, the same age, side by side, same light, same background; one stands tall, one leans on a cane. Headline low, cream. Approved visual, unchanged. Under each figure, a bar: years lived, and years lived well. The gap between them is 12.4 years. Small: Garmany and Terzic, Mayo Clinic, JAMA Network Open, December 2024: 183 countries; the United States gap is the widest.</w:t>
+      </w:r>
+    </w:p>
+    <w:p>
+      <w:r>
+        <w:t>Third layer, movement. I'm not going to demonstrate a workout. I want to start with why it matters, in one picture. Two people, the same age. One stands tall. One leans on a cane. Not everything that puts a person on a cane is a choice, and I would never say it was. But a great deal of what keeps you off one is a weekly pattern, and that pattern is a choice. [confirm the framing] Here's the number behind the picture. In December 2024 the Mayo Clinic measured the gap between how long people live and how long they live in good health, in 183 countries. Worldwide it's 9.6 years. In the United States it's 12.4 years, the widest gap in the world. Twelve years, on average, at the end, in poor health. Those twelve years are what this layer is about. [Garmany and Terzic, JAMA Network Open, December 2024; confirm] Then I'll show you what belongs in that pattern, and then what my week looks like.</w:t>
       </w:r>
     </w:p>
     <w:p>
@@ -1445,7 +1445,7 @@
           <w:color w:val="5B6472"/>
           <w:sz w:val="22"/>
         </w:rPr>
-        <w:t>On screen: The body map: a translucent figure in profile, four points lighting as you name them, bones and muscle, heart, heart, brain. Four tiles to the right, each with the number researchers use to predict how long you live: Weights, grip strength (Leong et al., Lancet 2015). VO2 max, fitness (Mandsager et al., JAMA Network Open 2018). Zone 2, steps a day (Paluch et al., JAMA Network Open 2021). Mobility and balance, the ten-second one-leg stand (Araujo et al., British Journal of Sports Medicine 2022). The macro slide, before any detail.</w:t>
+        <w:t>On screen: The body map: a translucent figure in profile, four points lighting as you name them, bones and muscle, heart, heart, brain. Four tiles to the right, each with the number researchers use to predict how long you live: Weights, grip strength (López-Bueno et al., Ageing Research Reviews 2022, 48 studies, 3.1 million people). VO2 max, fitness (Lang et al., British Journal of Sports Medicine 2024, 20.9 million observations). Zone 2, steps a day (Ding et al., The Lancet Public Health, July 2025, 57 studies). Mobility and balance, the one-leg stand (Mayo Clinic, PLOS One, October 2024; Araujo et al., British Journal of Sports Medicine 2022). The macro slide, before any detail.</w:t>
       </w:r>
     </w:p>
     <w:p>
@@ -1455,7 +1455,7 @@
     </w:p>
     <w:p>
       <w:r>
-        <w:t>And each tile has a number attached, one that researchers have used to predict how long people live. Grip strength: in a study of a hundred and forty thousand people across seventeen countries, every five kilos of grip you lose came with a sixteen percent higher risk of dying. Fitness: at the Cleveland Clinic, among a hundred and twenty-two thousand patients, being unfit was a bigger risk than smoking. Steps: seven thousand a day cut the risk of death by half or more over ten years, in people in their forties. And balance: in a study of adults between fifty-one and seventy-five, the people who couldn't stand on one leg for ten seconds had an eighty-four percent higher risk of dying in the next decade. Try it tonight. Ten seconds. Shoes off. [Leong 2015; Mandsager 2018; Paluch 2021; Araujo 2022; confirm the figures before you say them]</w:t>
+        <w:t>And each tile has a number attached, one that researchers have used to predict how long people live. Grip strength: a 2022 review pooled forty-eight studies and more than three million people, and the stronger the grip, the lower the risk of dying, almost in a straight line. Fitness: in 2024 the British Journal of Sports Medicine pooled nearly twenty-one million observations, and every single step up in fitness, one MET, came with an eleven to seventeen percent lower risk of dying. Steps: in July 2025 The Lancet Public Health pooled fifty-seven studies. Seven thousand steps a day, against two thousand, came with a forty-seven percent lower risk of dying and a thirty-eight percent lower risk of dementia. Seven thousand. Not ten. And balance: in 2024 the Mayo Clinic tested people over fifty on grip, knee strength, walking and standing on one leg, and the one-leg stand was the measure that fell fastest with age, a better marker of aging than any of the others. Try it tonight. Shoes off. Non-dominant leg. See how close you get to thirty seconds. [López-Bueno et al., Ageing Research Reviews 2022; Lang et al., British Journal of Sports Medicine 2024; Ding et al., The Lancet Public Health 2025; Mayo Clinic, Kaufman and colleagues, PLOS One 2024; confirm the figures before you say them]</w:t>
       </w:r>
     </w:p>
     <w:p>
@@ -1573,12 +1573,12 @@
           <w:color w:val="5B6472"/>
           <w:sz w:val="22"/>
         </w:rPr>
-        <w:t>On screen: The day ring: your day as a clock, 5 AM to 9 PM, each hour colored by its layer, 9 PM at the top. Large hour marks: 5 wake, 7 training and sauna, 8 window opens, 10 coffee closes, midday biggest meal and walk, afternoon meditation, 6 last meal, 8 screens off, 9 lights out. The one-page schedule people were promised. The ten hours from 8 to 6 shaded as one band: the eating window. Small: Wilkinson et al., Cell Metabolism 2020, the Salk Institute. Final build: the ring slides left and two columns stand beside it, your device: What's transferable (the order of priorities; the numbers, as a menu) and What's just me (my clock).</w:t>
-      </w:r>
-    </w:p>
-    <w:p>
-      <w:r>
-        <w:t>Here's my day, so you can see where the layers fit and where they fight each other for the same hour. Five, wake. Water first, then light. [how you get light] Seven, training, then the sauna, which is the real reason I show up. [confirm the time] Eight, eating window opens. Ten, coffee cuts off. That window, eight to six, is ten hours, and it isn't an accident: the Salk Institute's work on time-restricted eating used a ten-hour window and saw weight, blood pressure and cholesterol improve in twelve weeks. [Wilkinson et al., Cell Metabolism 2020; confirm] Midday, work and my biggest meal, followed by a walk. [confirm] Afternoon, meditation. [confirm when] Six, eating window closes; that's my last meal, three hours before bed. Eight, screens off; the wind-down begins. Nine, lights out.</w:t>
+        <w:t>On screen: The day ring: your day as a clock, 5 AM to 9 PM, each hour colored by its layer, 9 PM at the top. Large hour marks: 5 wake, 7 training and sauna, 8 window opens, 10 coffee closes, midday biggest meal and walk, afternoon meditation, 6 last meal, 8 screens off, 9 lights out. The one-page schedule people were promised. The ten hours from 8 to 6 shaded as one band: the eating window. Small: Manoogian et al., Annals of Internal Medicine, October 2024: the TIMET trial, Salk Institute and UC San Diego, 108 adults, three months. Final build: the ring slides left and two columns stand beside it, your device: What's transferable (the order of priorities; the numbers, as a menu) and What's just me (my clock).</w:t>
+      </w:r>
+    </w:p>
+    <w:p>
+      <w:r>
+        <w:t>Here's my day, so you can see where the layers fit and where they fight each other for the same hour. Five, wake. Water first, then light. [how you get light] Seven, training, then the sauna, which is the real reason I show up. [confirm the time] Eight, eating window opens. Ten, coffee cuts off. That window, eight to six, is ten hours, and it isn't an accident: in October 2024 the Salk Institute and UC San Diego published a randomized trial of a hundred and eight adults with metabolic syndrome. The group that kept its eating inside an eight-to-ten-hour window for three months improved its blood sugar marker, HbA1c, and lost about three to four percent of body weight, mostly fat, on top of standard nutrition advice. [Manoogian et al., Annals of Internal Medicine 2024; confirm] Midday, work and my biggest meal, followed by a walk. [confirm] Afternoon, meditation. [confirm when] Six, eating window closes; that's my last meal, three hours before bed. Eight, screens off; the wind-down begins. Nine, lights out.</w:t>
       </w:r>
     </w:p>
     <w:p>
@@ -1672,7 +1672,7 @@
           <w:color w:val="5B6472"/>
           <w:sz w:val="22"/>
         </w:rPr>
-        <w:t>On screen: The closing cake, all four layers labeled, the icing on top, turning slowly; each layer brightens as you give its sentence. Approved visual, unchanged. Build 2: two curves on one chart, how long we live and how long we live well, and the gap between them closing. Small: Fries, New England Journal of Medicine 1980, the compression of morbidity. Build 3: the cake recedes and the ring of three rises: Why, Intention, Resources on a lit ring, a line between each pair; the center lights only when all three are on. Build 4: the Blueprint card in your video-card style, the Academy mark top center, "Eighteen weeks. Eighteen live sessions." in cream and "A class of eight to fifteen." in light blue. Final: Your why. Your intention. Your resources. One action, forty-eight hours. [link or QR]</w:t>
+        <w:t>On screen: The closing cake, all four layers labeled, the icing on top, turning slowly; each layer brightens as you give its sentence. Approved visual, unchanged. Build 2: two curves on one chart, how long we live and how long we live well, and the gap between them closing. Small: the compression of morbidity, Fries 1980. The gap today: 9.6 years worldwide, 12.4 in the United States. Garmany and Terzic, JAMA Network Open 2024. Build 3: the cake recedes and the ring of three rises: Why, Intention, Resources on a lit ring, a line between each pair; the center lights only when all three are on. Build 4: the Blueprint card in your video-card style, the Academy mark top center, "Eighteen weeks. Eighteen live sessions." in cream and "A class of eight to fifteen." in light blue. Final: Your why. Your intention. Your resources. One action, forty-eight hours. [link or QR]</w:t>
       </w:r>
     </w:p>
     <w:p>
@@ -1682,7 +1682,7 @@
     </w:p>
     <w:p>
       <w:r>
-        <w:t>I've given you a lot of numbers, and I'll be honest: numbers aren't what kept me doing this for ten years. [confirm] Three questions did, and I run every decision through them. What's my why? Mine is my son; I want to be here for him for a long time. [your words] A why gives you a direction. What's my intention? Mine is one sentence: I want my healthspan to match my lifespan. There's a drawing from 1980 by a Stanford doctor named James Fries that says it better than I can: two lines, how long you live and how long you live well. Most of medicine pushes the first line out. The point is to drag the second one up to meet it. [Fries, New England Journal of Medicine 1980] Every year I'm alive, I want to be able to use. An intention gives you something you can measure. And what are my resources? Time, money, energy, the real amounts. Mine are an hour in the morning and about twelve dollars a day. [confirm] Resources set the pace. The three only work together. A why with no intention is a wish. An intention with no resources is a plan you quit in week six. Resources with no why are a gym membership you never use. Answer all three once, and you stop asking "what should I do" and start asking "does this fit." Sauna fits. Peptides don't, not for me, not right now. A nine o'clock bedtime fits.</w:t>
+        <w:t>I've given you a lot of numbers, and I'll be honest: numbers aren't what kept me doing this for ten years. [confirm] Three questions did, and I run every decision through them. What's my why? Mine is my son; I want to be here for him for a long time. [your words] A why gives you a direction. What's my intention? Mine is one sentence: I want my healthspan to match my lifespan. A Stanford doctor named James Fries drew it as two lines, how long you live and how long you live well, and in December 2024 the Mayo Clinic measured the gap between those two lines: nine and a half years worldwide, more than twelve in this country. Most of medicine pushes the first line out. The point is to drag the second one up to meet it. [Fries, the compression of morbidity, 1980; Garmany and Terzic, JAMA Network Open 2024] Every year I'm alive, I want to be able to use. An intention gives you something you can measure. And what are my resources? Time, money, energy, the real amounts. Mine are an hour in the morning and about twelve dollars a day. [confirm] Resources set the pace. The three only work together. A why with no intention is a wish. An intention with no resources is a plan you quit in week six. Resources with no why are a gym membership you never use. Answer all three once, and you stop asking "what should I do" and start asking "does this fit." Sauna fits. Peptides don't, not for me, not right now. A nine o'clock bedtime fits.</w:t>
       </w:r>
     </w:p>
     <w:p>
@@ -1857,7 +1857,7 @@
           <w:color w:val="5B6472"/>
           <w:sz w:val="22"/>
         </w:rPr>
-        <w:t>On screen: First the plain line, huge, cream: Ten years pass. By this test, I age about six. Nothing else, so the room gets the point before any science. Then the gauge rises, hero size: dark glass face, 1.0 at the top, needle glowing light blue at 0.65, cream ticks at 0.665 and 0.76, and the second beat of the headline in light blue: The speed towards death. Build: the needle sweeps down to 0.65 as you say it, then up to 0.76. Approved visual, unchanged. Final build: the pace-of-aging curve from the study behind the test, a soft bell drawn over the gauge: most people near 1.0, a few near zero, a tail out to three years per year, your 0.665 marked on it. Small: Belsky et al., PNAS 2015.</w:t>
+        <w:t>On screen: First the plain line, huge, cream: Ten years pass. By this test, I age about six. Nothing else, so the room gets the point before any science. Then the gauge rises, hero size: dark glass face, 1.0 at the top, needle glowing light blue at 0.65, cream ticks at 0.665 and 0.76, and the second beat of the headline in light blue: The speed towards death. Build: the needle sweeps down to 0.65 as you say it, then up to 0.76. Approved visual, unchanged. Final build: the pace-of-aging curve, a soft bell drawn over the gauge: most people near 1.0, some slower, a tail of people aging much faster, your 0.665 marked on it. Small: DunedinPACE, Belsky et al., eLife 2022. Now used in more than 65 cohort studies in 18 countries (Duke University, January 2025).</w:t>
       </w:r>
     </w:p>
     <w:p>
@@ -1867,7 +1867,7 @@
     </w:p>
     <w:p>
       <w:r>
-        <w:t>The score behind that is called DunedinPACE. In plain language it estimates how fast your body is aging. The scientists say pace of aging. I say speed towards death, because it's the same thing and it's harder to ignore. A score of 1.0 means you're aging one year for every calendar year. [check against the provider's wording] My best score was 0.65. Average all three of my tests and I land at 0.665. That's the more honest number, so I'm giving you both. And so you know this isn't a vanity number: in the study that built this test, 954 people, all aged 38, were measured. Most were aging about a year per year. A few were close to zero. And some were aging close to three years for every year on the calendar. [Belsky et al., PNAS 2015; confirm you are comfortable citing it]</w:t>
+        <w:t>The score behind that is called DunedinPACE. In plain language it estimates how fast your body is aging. The scientists say pace of aging. I say speed towards death, because it's the same thing and it's harder to ignore. A score of 1.0 means you're aging one year for every calendar year. [check against the provider's wording] My best score was 0.65. Average all three of my tests and I land at 0.665. That's the more honest number, so I'm giving you both. And so you know this isn't a vanity number or a gimmick: the test was built at Duke and Columbia from a group of people followed since birth, it was published in 2022, and it's now being used in more than sixty-five large studies in eighteen countries. In 2024, Nature Aging reported that older adults with a faster pace on this test went on to have shorter healthspans and shorter lives. [Belsky et al., eLife 2022; Balachandran et al., Nature Aging 2024; Duke University DunedinPACE summary, January 2025; confirm you are comfortable citing it]</w:t>
       </w:r>
     </w:p>
     <w:p>
@@ -1901,12 +1901,12 @@
           <w:color w:val="5B6472"/>
           <w:sz w:val="22"/>
         </w:rPr>
-        <w:t>On screen: First build, one root and four branches: Aging at the root, and heart disease, cancer, dementia, type 2 diabetes on the branches. Small: the geroscience hypothesis, Kennedy et al., Cell 2014. Then the cake, hero size, turning slowly, every layer lit evenly this once: Sleep, Food, Movement, Stress Management, the thin layer, the icing labeled Therapies, exactly as you drew it. Headline above, "cake" in light blue. Approved visual, unchanged. It returns at the start of each layer, lit.</w:t>
-      </w:r>
-    </w:p>
-    <w:p>
-      <w:r>
-        <w:t>Before the how, one picture of why anyone bothers. Aging is the biggest risk factor for the four things we're all afraid of: heart disease, cancer, dementia, type 2 diabetes. Slow the aging itself and you push all four back at once. That's the whole bet of a field called geroscience, and it's the bet I made. [Kennedy et al., Cell 2014; the Buck Institute's founding idea] Here's how I think about all of it. Longevity is like a cake. The cake is four things: sleep, food, movement, and stress management. That's where most of the work lives. For the women here, there's one more thin layer and I'll get to it. The icing is the fun stuff: sauna, and the fancy, expensive therapies. Icing is delightful. But nobody has ever eaten a bowl of icing and called it a cake. We're going to start with the icing, because that's what your feed is full of, and I want you to be able to relax about it. Then we'll build the cake.</w:t>
+        <w:t>On screen: First build, one root and four branches: Aging at the root, and heart disease, cancer, dementia, type 2 diabetes on the branches. Small: the geroscience hypothesis, the Buck Institute; the twelve hallmarks of aging, López-Otín et al., Cell 2023. Then the cake, hero size, turning slowly, every layer lit evenly this once: Sleep, Food, Movement, Stress Management, the thin layer, the icing labeled Therapies, exactly as you drew it. Headline above, "cake" in light blue. Approved visual, unchanged. It returns at the start of each layer, lit.</w:t>
+      </w:r>
+    </w:p>
+    <w:p>
+      <w:r>
+        <w:t>Before the how, one picture of why anyone bothers. Aging is the biggest risk factor for the four things we're all afraid of: heart disease, cancer, dementia, type 2 diabetes. Slow the aging itself and you push all four back at once. That's the whole bet of a field called geroscience, and it's the bet I made. [the geroscience hypothesis, the Buck Institute's founding idea, Kennedy et al., Cell 2014; its current form, López-Otín et al., Hallmarks of aging, Cell 2023] Here's how I think about all of it. Longevity is like a cake. The cake is four things: sleep, food, movement, and stress management. That's where most of the work lives. For the women here, there's one more thin layer and I'll get to it. The icing is the fun stuff: sauna, and the fancy, expensive therapies. Icing is delightful. But nobody has ever eaten a bowl of icing and called it a cake. We're going to start with the icing, because that's what your feed is full of, and I want you to be able to relax about it. Then we'll build the cake.</w:t>
       </w:r>
     </w:p>
     <w:p>
@@ -1951,7 +1951,7 @@
           <w:color w:val="5B6472"/>
           <w:sz w:val="22"/>
         </w:rPr>
-        <w:t>On screen: The cake with only the icing lit, then it slides away and the cost map rises: a two-by-two, cost left to right, strength of human evidence bottom to top, glass markers placed on it: Sauna (cheap, twenty years of data), Prebiotics and most supplements (cheap, depends on a test), NAD drips, Peptides, Stem cells (expensive, thin human evidence), Rapamycin with a doctor (prescription, strong animal data, human trials under way), and one marker off the chart at the far right, the two-million-a-year program. [confirm the placements] Small, under the sauna marker: Laukkanen et al., JAMA Internal Medicine 2015. Build 2: four markers turn amber. Build 3: the sauna marker glows warm. Build 4: a single coin at the far left, "Twelve dollars a day." The rail is the list.</w:t>
+        <w:t>On screen: The cake with only the icing lit, then it slides away and the cost map rises: a two-by-two, cost left to right, strength of human evidence bottom to top, glass markers placed on it: Sauna (cheap, nearly thirty years of data), Prebiotics and most supplements (cheap, depends on a test), NAD drips, Peptides, Stem cells (expensive, thin human evidence), Rapamycin with a doctor (prescription, strong animal data, human trials under way), and one marker off the chart at the far right, the two-million-a-year program. [confirm the placements] Small, under the sauna marker: Kunutsor, Jae, Kurl and Laukkanen, Scandinavian Cardiovascular Journal 2024; Laukkanen et al., BMC Medicine 2018. Build 2: four markers turn amber. Build 3: the sauna marker glows warm. Build 4: a single coin at the far left, "Twelve dollars a day." The rail is the list.</w:t>
       </w:r>
     </w:p>
     <w:p>
@@ -1971,7 +1971,7 @@
     </w:p>
     <w:p>
       <w:r>
-        <w:t>Let me tell you about the therapy I actually use. I go to the sauna three to five days a week, at my gym. And I'll tell you a secret that will horrify every personal trainer on this call: the sauna is what gets me out of bed. It is never the thought of a VO2 max workout. Nobody has ever hopped out of bed at five excited about intervals. I get up for the sauna, and the workout happens to be on the way. And it's the one piece of icing with serious long-term data behind it. A Finnish study followed 2,315 men for about twenty years. The men who used a sauna four to seven times a week had a forty percent lower risk of dying from any cause than the men who went once a week. [Laukkanen et al., JAMA Internal Medicine 2015; add your own From Paper to Plate sources if you prefer] Quick safety note: heart, blood pressure, or other medical concerns, check with your doctor before you start, and drink water.</w:t>
+        <w:t>Let me tell you about the therapy I actually use. I go to the sauna three to five days a week, at my gym. And I'll tell you a secret that will horrify every personal trainer on this call: the sauna is what gets me out of bed. It is never the thought of a VO2 max workout. Nobody has ever hopped out of bed at five excited about intervals. I get up for the sauna, and the workout happens to be on the way. And it's the one piece of icing with serious long-term data behind it. The Finnish group that has studied this longest published its latest analysis in 2024: 2,575 men followed for almost twenty-eight years. The men who used a sauna twice a week or less had a sixteen percent higher risk of dying from any cause than the men who went three to seven times. Their 2018 study, which included women, pointed the same way. [Kunutsor, Jae, Kurl and Laukkanen, Scandinavian Cardiovascular Journal 2024; Laukkanen et al., BMC Medicine 2018, 1,688 men and women over fifty, fifteen years; add your own From Paper to Plate sources if you prefer] Quick safety note: heart, blood pressure, or other medical concerns, check with your doctor before you start, and drink water.</w:t>
       </w:r>
     </w:p>
     <w:p>
@@ -2005,12 +2005,12 @@
           <w:color w:val="5B6472"/>
           <w:sz w:val="22"/>
         </w:rPr>
-        <w:t>On screen: The cake returns, the thin layer glowing light blue, everything else dark. One small line beneath: The Menopause Society. Find a certified practitioner. [URL] Second build: a short timeline, menopause to ten years after, labeled the window. Small: The Menopause Society, 2022 Hormone Therapy Position Statement. Final build: the four layers light one after another, bottom to top, the icing dims, and the headline changes to: Four layers hold up the cake.</w:t>
-      </w:r>
-    </w:p>
-    <w:p>
-      <w:r>
-        <w:t>Before we bake, one thing that gets filed under icing by mistake, usually by people who've never been through it. Menopause therapy. For half of this room, menopause will change your sleep, your bones, your mood, and the shape of your body, and it changes how well every other layer can do its job. Decoration doesn't do that. This is a thin layer of the cake. The Menopause Society's own position, updated in 2022, is that for healthy women with symptoms who are under sixty, or within ten years of menopause, the benefits of hormone therapy generally outweigh the risks. That's their sentence, not mine, and it's why the next line matters. [The Menopause Society, 2022 Position Statement; confirm you want to state it] [your own path, one or two sentences, as much as you choose] The action is one line: find a doctor through the Menopause Society. They keep a directory of certified practitioners. [confirm naming it] This is the one place tonight I'll say it twice. Your doctor. Not a webinar.</w:t>
+        <w:t>On screen: The cake returns, the thin layer glowing light blue, everything else dark. One small line beneath: The Menopause Society. Find a certified practitioner. [URL] Second build: a short timeline, menopause to ten years after, labeled the window. Small: The Menopause Society, 2022 Hormone Therapy Position Statement. FDA, November 2025: boxed warnings removed from menopausal hormone therapy. Final build: the four layers light one after another, bottom to top, the icing dims, and the headline changes to: Four layers hold up the cake.</w:t>
+      </w:r>
+    </w:p>
+    <w:p>
+      <w:r>
+        <w:t>Before we bake, one thing that gets filed under icing by mistake, usually by people who've never been through it. Menopause therapy. For half of this room, menopause will change your sleep, your bones, your mood, and the shape of your body, and it changes how well every other layer can do its job. Decoration doesn't do that. This is a thin layer of the cake. The Menopause Society's own position, updated in 2022, is that for healthy women with symptoms who are under sixty, or within ten years of menopause, the benefits of hormone therapy generally outweigh the risks. That's their sentence, not mine. And in November 2025 the FDA announced it was removing the black-box warnings from menopausal hormone therapy, the warnings that had kept a generation of women and their doctors away from it. The science moved, the conversation is open again, and that's why the next line matters. [The Menopause Society, 2022 Position Statement; FDA announcement, November 2025; confirm you want to state it] [your own path, one or two sentences, as much as you choose] The action is one line: find a doctor through the Menopause Society. They keep a directory of certified practitioners. [confirm naming it] This is the one place tonight I'll say it twice. Your doctor. Not a webinar.</w:t>
       </w:r>
     </w:p>
     <w:p>
@@ -2060,12 +2060,12 @@
           <w:color w:val="5B6472"/>
           <w:sz w:val="22"/>
         </w:rPr>
-        <w:t>On screen: The cake, sleep lit, for the first sentence. Then the night arc, 9 PM on the left to 5 AM on the right, moon to sun, the five numbers the only type: Lights out 9:00 PM. Up 5:00 AM. Last meal three hours before bed. Screens off one hour before bed. An eight-hour opportunity, cool and dark. Build between the numbers: a band across the deepest part of the night labeled the repair shift. Small: Xie et al., Science 2013; Fultz et al., Science 2019.</w:t>
-      </w:r>
-    </w:p>
-    <w:p>
-      <w:r>
-        <w:t>Let's start at the bottom of the cake with sleep. I think of sleep as the repair shift, the time your body does its maintenance while you're not in the way. That's not a metaphor, by the way. In 2013 a team at the University of Rochester showed that during deep sleep the brain's drainage system opens up and flushes out the day's waste, and in 2019 a Boston team watched the same rhythm in sleeping humans. [Xie et al., Science 2013; Fultz et al., Science 2019] If I skimp on it, everything I do on the other three layers works harder and pays me back less. I'm going to give you my exact numbers, because I find vague advice impossible to follow. "Get good sleep" has never once told me what to do at 8:45 on a Tuesday night.</w:t>
+        <w:t>On screen: The cake, sleep lit, for the first sentence. Then the night arc, 9 PM on the left to 5 AM on the right, moon to sun, the five numbers the only type: Lights out 9:00 PM. Up 5:00 AM. Last meal three hours before bed. Screens off one hour before bed. An eight-hour opportunity, cool and dark. Build between the numbers: a band across the deepest part of the night labeled the repair shift. Small: Windred et al., Sleep 2023, 60,977 adults: regularity beat duration. Piantino et al., PNAS 2024: the brain's drainage channels imaged in living people for the first time.</w:t>
+      </w:r>
+    </w:p>
+    <w:p>
+      <w:r>
+        <w:t>Let's start at the bottom of the cake with sleep. I think of sleep as the repair shift, the time your body does its maintenance while you're not in the way. That's not a metaphor, by the way. The brain has a drainage system that does most of its flushing while you sleep, and in 2024 a team at Oregon Health &amp; Science University imaged those channels in living people for the first time. [Piantino et al., PNAS 2024; first described in mice by Xie et al., Science 2013] And here's why the headline says bedtime. In 2023 a study of nearly sixty-one thousand adults wearing trackers found that how regular your sleep is predicted who lived longer better than how long you slept; the most regular sleepers had a twenty to forty-eight percent lower risk of dying from any cause. Same bedtime, same wake time. [Windred et al., Sleep 2023; confirm the figures before you say them] If I skimp on it, everything I do on the other three layers works harder and pays me back less. I'm going to give you my exact numbers, because I find vague advice impossible to follow. "Get good sleep" has never once told me what to do at 8:45 on a Tuesday night.</w:t>
       </w:r>
     </w:p>
     <w:p>
@@ -2138,12 +2138,12 @@
           <w:color w:val="5B6472"/>
           <w:sz w:val="22"/>
         </w:rPr>
-        <w:t>On screen: The cake, food lit, for the opening. Then the plate, seen from above, three parts, one line each: Protein is the floor. Fiber is the lever. Whole food is the default. Final build: five numbers around the rim: One pound of vegetables per day. One gram of protein per pound of goal bodyweight. Eating window 8:00 AM to 6:00 PM. Coffee cutoff 10:00 AM. Zero alcohol on training days. Beside the plate, two numbers: the fiber target, 25 to 38 grams a day, and the average American, about 15. Small: Dietary Guidelines for Americans; Quagliani and Felt-Gunderson, 2017.</w:t>
-      </w:r>
-    </w:p>
-    <w:p>
-      <w:r>
-        <w:t>Now for food. Before any numbers, I want the type of diet off the table. Vegan, keto, Mediterranean, carnivore. It's not about the type. I've been vegan. I've been most things. [confirm] What I've learned is that people need to take the religion out of their diet and look at the plate. I think of mine in three parts. Protein is the floor, meaning I make sure it's there at every meal. Fiber is the lever, which is where the vegetables come in. Here's why it's the lever: the target is 25 to 38 grams a day, and the average American gets about 15. Almost nobody is hitting it, which means almost everybody has room. [Dietary Guidelines for Americans; Quagliani and Felt-Gunderson, 2017] And whole food is the default, which means that when I have a choice, I pick the thing that looks like it came from the ground or an animal, and not from a factory.</w:t>
+        <w:t>On screen: The cake, food lit, for the opening. Then the plate, seen from above, three parts, one line each: Protein is the floor. Fiber is the lever. Whole food is the default. Final build: five numbers around the rim: One pound of vegetables per day. One gram of protein per pound of goal bodyweight. Eating window 8:00 AM to 6:00 PM. Coffee cutoff 10:00 AM. Zero alcohol on training days. Beside the plate, two numbers: the fiber target, 25 to 38 grams a day, and the share of Americans who miss it: more than 90 percent of women, 97 percent of men. Small: Dietary Guidelines for Americans, 2020 to 2025.</w:t>
+      </w:r>
+    </w:p>
+    <w:p>
+      <w:r>
+        <w:t>Now for food. Before any numbers, I want the type of diet off the table. Vegan, keto, Mediterranean, carnivore. It's not about the type. I've been vegan. I've been most things. [confirm] What I've learned is that people need to take the religion out of their diet and look at the plate. I think of mine in three parts. Protein is the floor, meaning I make sure it's there at every meal. Fiber is the lever, which is where the vegetables come in. Here's why it's the lever: the target is 25 to 38 grams a day, and the government's own dietary guidelines say more than ninety percent of women and ninety-seven percent of men don't get there. Almost nobody is hitting it, which means almost everybody has room. [Dietary Guidelines for Americans 2020 to 2025; confirm] And whole food is the default, which means that when I have a choice, I pick the thing that looks like it came from the ground or an animal, and not from a factory.</w:t>
       </w:r>
     </w:p>
     <w:p>
@@ -2177,7 +2177,7 @@
           <w:color w:val="5B6472"/>
           <w:sz w:val="22"/>
         </w:rPr>
-        <w:t>On screen: The sugar slide, Omri's build in the same 3D language, three panels on one object: Spike (a glucose curve jumping after a meal), Signal (insulin and the nutrient-sensing pathways switching on; deregulated nutrient sensing is one of the twelve hallmarks of aging), Scar (sugar bonding to proteins, glycation; HbA1c is the measured version of this). Approved slide, model added. Small: López-Otín et al., Cell 2023; Uribarri et al., 2010. Final build: the object dims and two large checkboxes appear, Move dinner earlier and Rebuild one plate, under the words: Your two Monday changes.</w:t>
+        <w:t>On screen: The sugar slide, Omri's build in the same 3D language, three panels on one object: Spike (a glucose curve jumping after a meal), Signal (insulin and the nutrient-sensing pathways switching on; deregulated nutrient sensing is one of the twelve hallmarks of aging), Scar (sugar bonding to proteins, glycation; HbA1c is the measured version of this). Approved slide, model added. Small: López-Otín et al., Hallmarks of aging, Cell 2023. Final build: the object dims and two large checkboxes appear, Move dinner earlier and Rebuild one plate, under the words: Your two Monday changes.</w:t>
       </w:r>
     </w:p>
     <w:p>
@@ -2232,12 +2232,12 @@
           <w:color w:val="5B6472"/>
           <w:sz w:val="22"/>
         </w:rPr>
-        <w:t>On screen: The cake, movement lit, for one breath. Then the photograph: two people, full height, the same age, side by side, same light, same background; one stands tall, one leans on a cane. Two words, cream, centered low. Approved visual, unchanged. Under each figure, a bar: years lived, and years lived well. The gap between them is about twelve years. Small: WHO, healthy life expectancy, United States, 2019.</w:t>
-      </w:r>
-    </w:p>
-    <w:p>
-      <w:r>
-        <w:t>Now the third layer: movement. I'm not going to demonstrate a workout today. I want to start with one picture of why it matters. Two people, the same age. One stands tall. One leans on a cane. Not everything that puts a person on a cane is a choice, and I would never say it was. But a great deal of what keeps you off one is a weekly pattern, and that pattern is a choice. [confirm the framing] Here's the number behind the picture. In America, life expectancy is about seventy-eight. Healthy life expectancy, the years you live without serious illness or disability, is about sixty-six. Twelve years, on average, at the end, in poor health. Those twelve years are what this layer is about. [WHO 2019 figures; confirm] Here's a confession from a woman who swam competitively as a kid: I like going to the gym, and I do not like working out. [confirm; your line] I never found the love. I found the reason instead.</w:t>
+        <w:t>On screen: The cake, movement lit, for one breath. Then the photograph: two people, full height, the same age, side by side, same light, same background; one stands tall, one leans on a cane. Two words, cream, centered low. Approved visual, unchanged. Under each figure, a bar: years lived, and years lived well. The gap between them is 12.4 years. Small: Garmany and Terzic, Mayo Clinic, JAMA Network Open, December 2024: 183 countries; the United States gap is the widest.</w:t>
+      </w:r>
+    </w:p>
+    <w:p>
+      <w:r>
+        <w:t>Now the third layer: movement. I'm not going to demonstrate a workout today. I want to start with one picture of why it matters. Two people, the same age. One stands tall. One leans on a cane. Not everything that puts a person on a cane is a choice, and I would never say it was. But a great deal of what keeps you off one is a weekly pattern, and that pattern is a choice. [confirm the framing] Here's the number behind the picture. In December 2024 the Mayo Clinic measured the gap between how long people live and how long they live in good health, in 183 countries. Worldwide it's 9.6 years. In the United States it's 12.4 years, the widest gap in the world. Twelve years, on average, at the end, in poor health. Those twelve years are what this layer is about. [Garmany and Terzic, JAMA Network Open, December 2024; confirm] Here's a confession from a woman who swam competitively as a kid: I like going to the gym, and I do not like working out. [confirm; your line] I never found the love. I found the reason instead.</w:t>
       </w:r>
     </w:p>
     <w:p>
@@ -2266,7 +2266,7 @@
           <w:color w:val="5B6472"/>
           <w:sz w:val="22"/>
         </w:rPr>
-        <w:t>On screen: The body map: a translucent figure in profile, four points lighting as you name them, bones and muscle, heart, heart, brain. Four tiles to the right, each with the number researchers use to predict how long you live: Weights, grip strength (Leong et al., Lancet 2015). VO2 max, fitness (Mandsager et al., JAMA Network Open 2018). Zone 2, steps a day (Paluch et al., JAMA Network Open 2021). Mobility and balance, the ten-second one-leg stand (Araujo et al., British Journal of Sports Medicine 2022). The macro slide, before the detail.</w:t>
+        <w:t>On screen: The body map: a translucent figure in profile, four points lighting as you name them, bones and muscle, heart, heart, brain. Four tiles to the right, each with the number researchers use to predict how long you live: Weights, grip strength (López-Bueno et al., Ageing Research Reviews 2022, 48 studies, 3.1 million people). VO2 max, fitness (Lang et al., British Journal of Sports Medicine 2024, 20.9 million observations). Zone 2, steps a day (Ding et al., The Lancet Public Health, July 2025, 57 studies). Mobility and balance, the one-leg stand (Mayo Clinic, PLOS One, October 2024; Araujo et al., British Journal of Sports Medicine 2022). The macro slide, before the detail.</w:t>
       </w:r>
     </w:p>
     <w:p>
@@ -2281,7 +2281,7 @@
     </w:p>
     <w:p>
       <w:r>
-        <w:t>And each tile has a number attached, one that researchers have used to predict how long people live. Grip strength: in a study of a hundred and forty thousand people across seventeen countries, every five kilos of grip you lose came with a sixteen percent higher risk of dying. Fitness: at the Cleveland Clinic, among a hundred and twenty-two thousand patients, being unfit was a bigger risk than smoking. Steps: seven thousand a day cut the risk of death by half or more over ten years, in people in their forties. And balance: in a study of adults between fifty-one and seventy-five, the people who couldn't stand on one leg for ten seconds had an eighty-four percent higher risk of dying in the next decade. Try it tonight. Ten seconds. Shoes off. [Leong 2015; Mandsager 2018; Paluch 2021; Araujo 2022; confirm the figures before you say them]</w:t>
+        <w:t>And each tile has a number attached, one that researchers have used to predict how long people live. Grip strength: a 2022 review pooled forty-eight studies and more than three million people, and the stronger the grip, the lower the risk of dying, almost in a straight line. Fitness: in 2024 the British Journal of Sports Medicine pooled nearly twenty-one million observations, and every single step up in fitness, one MET, came with an eleven to seventeen percent lower risk of dying. Steps: in July 2025 The Lancet Public Health pooled fifty-seven studies. Seven thousand steps a day, against two thousand, came with a forty-seven percent lower risk of dying and a thirty-eight percent lower risk of dementia. Seven thousand. Not ten. And balance: in 2024 the Mayo Clinic tested people over fifty on grip, knee strength, walking and standing on one leg, and the one-leg stand was the measure that fell fastest with age, a better marker of aging than any of the others. Try it tonight. Shoes off. Non-dominant leg. See how close you get to thirty seconds. [López-Bueno et al., Ageing Research Reviews 2022; Lang et al., British Journal of Sports Medicine 2024; Ding et al., The Lancet Public Health 2025; Mayo Clinic, Kaufman and colleagues, PLOS One 2024; confirm the figures before you say them]</w:t>
       </w:r>
     </w:p>
     <w:p>
@@ -2404,12 +2404,12 @@
           <w:color w:val="5B6472"/>
           <w:sz w:val="22"/>
         </w:rPr>
-        <w:t>On screen: The day ring: your day as a clock, 5 AM to 9 PM, each hour colored by its layer, 9 PM at the top so the eye starts at bedtime. Large hour marks: 5 wake, 7 training and sauna, 8 window opens, 10 coffee closes, midday biggest meal and walk, afternoon meditation, 6 last meal, 8 screens off, 9 lights out. The one-page schedule people were promised. The ten hours from 8 to 6 shaded as one band: the eating window. Small: Wilkinson et al., Cell Metabolism 2020, the Salk Institute. They screenshot this one.</w:t>
-      </w:r>
-    </w:p>
-    <w:p>
-      <w:r>
-        <w:t>Now let's put it all together. Here's my day, so you can see where the layers fit and where they fight each other for the same hour. Five, wake. Water first, then light. [how you get light] Seven, training, then the sauna, which is the real reason I show up. [confirm the time] Eight, eating window opens. Ten, coffee cuts off. That window, eight to six, is ten hours, and it isn't an accident: the Salk Institute's work on time-restricted eating used a ten-hour window and saw weight, blood pressure and cholesterol improve in twelve weeks. [Wilkinson et al., Cell Metabolism 2020; confirm] Midday, work and my biggest meal, followed by a walk. [confirm] Afternoon, meditation. [confirm when] Six, eating window closes; that's my last meal, three hours before bed. Eight, screens off; the wind-down begins. Nine, lights out.</w:t>
+        <w:t>On screen: The day ring: your day as a clock, 5 AM to 9 PM, each hour colored by its layer, 9 PM at the top so the eye starts at bedtime. Large hour marks: 5 wake, 7 training and sauna, 8 window opens, 10 coffee closes, midday biggest meal and walk, afternoon meditation, 6 last meal, 8 screens off, 9 lights out. The one-page schedule people were promised. The ten hours from 8 to 6 shaded as one band: the eating window. Small: Manoogian et al., Annals of Internal Medicine, October 2024: the TIMET trial, Salk Institute and UC San Diego, 108 adults, three months. They screenshot this one.</w:t>
+      </w:r>
+    </w:p>
+    <w:p>
+      <w:r>
+        <w:t>Now let's put it all together. Here's my day, so you can see where the layers fit and where they fight each other for the same hour. Five, wake. Water first, then light. [how you get light] Seven, training, then the sauna, which is the real reason I show up. [confirm the time] Eight, eating window opens. Ten, coffee cuts off. That window, eight to six, is ten hours, and it isn't an accident: in October 2024 the Salk Institute and UC San Diego published a randomized trial of a hundred and eight adults with metabolic syndrome. The group that kept its eating inside an eight-to-ten-hour window for three months improved its blood sugar marker, HbA1c, and lost about three to four percent of body weight, mostly fat, on top of standard nutrition advice. [Manoogian et al., Annals of Internal Medicine 2024; confirm] Midday, work and my biggest meal, followed by a walk. [confirm] Afternoon, meditation. [confirm when] Six, eating window closes; that's my last meal, three hours before bed. Eight, screens off; the wind-down begins. Nine, lights out.</w:t>
       </w:r>
     </w:p>
     <w:p>
@@ -2503,7 +2503,7 @@
           <w:color w:val="5B6472"/>
           <w:sz w:val="22"/>
         </w:rPr>
-        <w:t>On screen: The closing cake, every layer lit, the icing on top, turning slowly. Approved visual, unchanged. Build 2: two curves on one chart, how long we live and how long we live well, and the gap between them closing. Small: Fries, New England Journal of Medicine 1980, the compression of morbidity. Build 3: the cake recedes and the ring of three rises: Why, Intention, Resources on a lit ring, a line between each pair; the center lights only when all three are on. Build 4: the Blueprint card in your video-card style, the Academy mark top center, "The same cake, built week by week," in cream and "with a teacher." in light blue. Final: Your why. Your intention. Your resources. One thing, forty-eight hours. [link or QR]</w:t>
+        <w:t>On screen: The closing cake, every layer lit, the icing on top, turning slowly. Approved visual, unchanged. Build 2: two curves on one chart, how long we live and how long we live well, and the gap between them closing. Small: the compression of morbidity, Fries 1980. The gap today: 9.6 years worldwide, 12.4 in the United States. Garmany and Terzic, JAMA Network Open 2024. Build 3: the cake recedes and the ring of three rises: Why, Intention, Resources on a lit ring, a line between each pair; the center lights only when all three are on. Build 4: the Blueprint card in your video-card style, the Academy mark top center, "The same cake, built week by week," in cream and "with a teacher." in light blue. Final: Your why. Your intention. Your resources. One thing, forty-eight hours. [link or QR]</w:t>
       </w:r>
     </w:p>
     <w:p>
@@ -2513,7 +2513,7 @@
     </w:p>
     <w:p>
       <w:r>
-        <w:t>What's my why? Mine isn't a leaderboard. It's a kid who needs his mom to show up for a long time. [your words] A why is a direction. It tells you which way to walk; it doesn't tell you how far or how fast. What's my intention? That's the sentence you'd write on the wall. Mine is: I want my healthspan to match my lifespan. There's a drawing from 1980 by a Stanford doctor named James Fries that says it better than I can: two lines, how long you live and how long you live well. Most of medicine pushes the first line out. The point is to drag the second one up to meet it. [Fries, New England Journal of Medicine 1980] Every year I'm alive, I want to be able to use. You can measure that. And what are my resources? Time, money, energy, the real amounts, not the ones you wish you had. Mine are an hour in the morning and about twelve dollars a day. [confirm] Resources set the pace. They decide what you're still doing in March, when nobody's watching.</w:t>
+        <w:t>What's my why? Mine isn't a leaderboard. It's a kid who needs his mom to show up for a long time. [your words] A why is a direction. It tells you which way to walk; it doesn't tell you how far or how fast. What's my intention? That's the sentence you'd write on the wall. Mine is: I want my healthspan to match my lifespan. A Stanford doctor named James Fries drew it as two lines, how long you live and how long you live well, and in December 2024 the Mayo Clinic measured the gap between those two lines: nine and a half years worldwide, more than twelve in this country. Most of medicine pushes the first line out. The point is to drag the second one up to meet it. [Fries, the compression of morbidity, 1980; Garmany and Terzic, JAMA Network Open 2024] Every year I'm alive, I want to be able to use. You can measure that. And what are my resources? Time, money, energy, the real amounts, not the ones you wish you had. Mine are an hour in the morning and about twelve dollars a day. [confirm] Resources set the pace. They decide what you're still doing in March, when nobody's watching.</w:t>
       </w:r>
     </w:p>
     <w:p>
@@ -4350,7 +4350,7 @@
           <w:color w:val="5B6472"/>
           <w:sz w:val="22"/>
         </w:rPr>
-        <w:t>Every model used on a slide, and the study it comes from. Each is marked [confirm] in the script; nothing goes on camera until Julie is comfortable saying it.</w:t>
+        <w:t>Every model used on a slide, and the study it comes from. The newest strong study leads each entry; an older paper is named only where the idea was born. Each is marked [confirm] in the script; nothing goes on camera until Julie is comfortable saying it.</w:t>
       </w:r>
     </w:p>
     <w:p>
@@ -4371,7 +4371,7 @@
     </w:p>
     <w:p>
       <w:r>
-        <w:t>The pace-of-aging curve. In the Dunedin Study, 954 people all aged 38 were measured with the panel that became DunedinPACE: most aged about one year per year, a few near zero, some near three. Belsky DW et al., Quantification of biological aging in young adults, PNAS 2015.</w:t>
+        <w:t>The pace-of-aging score. DunedinPACE, a DNA-methylation measure of how fast a person is aging: Belsky DW et al., DunedinPACE, a DNA methylation biomarker of the pace of aging, eLife 2022. Now used in more than 65 cohort studies in 18 countries, with more than 400 published reports (Duke University, Moffitt and Caspi lab, DunedinPACE summary, January 2025). Faster pace predicts shorter healthspan and lifespan in older adults: Balachandran A et al., Pace of Aging in older adults matters for healthspan and lifespan, Nature Aging 2024. The original Dunedin pace-of-aging work: Belsky DW et al., PNAS 2015.</w:t>
       </w:r>
     </w:p>
     <w:p>
@@ -4392,7 +4392,7 @@
     </w:p>
     <w:p>
       <w:r>
-        <w:t>The geroscience hypothesis: aging is the largest risk factor for heart disease, cancer, dementia and type 2 diabetes, so slowing aging delays them together. Kennedy BK et al., Geroscience: linking aging to chronic disease, Cell 2014. The founding idea of the Buck Institute.</w:t>
+        <w:t>The geroscience hypothesis: aging is the largest risk factor for heart disease, cancer, dementia and type 2 diabetes, so slowing aging delays them together. The founding idea of the Buck Institute; Kennedy BK et al., Geroscience: linking aging to chronic disease, Cell 2014. Its current form, the twelve hallmarks of aging: López-Otín C et al., Hallmarks of aging: an expanding universe, Cell 2023.</w:t>
       </w:r>
     </w:p>
     <w:p>
@@ -4413,7 +4413,7 @@
     </w:p>
     <w:p>
       <w:r>
-        <w:t>Cost against strength of human evidence, as a two-by-two. Sauna: Laukkanen T et al., Association between sauna bathing and fatal cardiovascular and all-cause mortality events, JAMA Internal Medicine 2015 (2,315 Finnish men, median 20.7 years; 4 to 7 sessions a week, 40 percent lower all-cause mortality than once a week). Rapamycin, NAD, peptides and stem cells: her judgment calls, to confirm.</w:t>
+        <w:t>Cost against strength of human evidence, as a two-by-two. Sauna: Kunutsor SK, Jae SY, Kurl S, Laukkanen JA, Sauna bathing and mortality risk: unraveling the interaction with systolic blood pressure in a cohort of Finnish men, Scandinavian Cardiovascular Journal 2024 (2,575 men aged 42 to 61, median follow-up 27.8 years; two or fewer sessions a week, 16 percent higher all-cause mortality than three to seven). Laukkanen T et al., Sauna bathing and risk of fatal cardiovascular events, BMC Medicine 2018 (1,688 men and women aged 50 and over, 15 years; 4 to 7 sessions a week, 2.7 fatal cardiovascular events per 1,000 person-years against 10.1 at once a week). Rapamycin, NAD, peptides and stem cells: her judgment calls, to confirm.</w:t>
       </w:r>
     </w:p>
     <w:p>
@@ -4434,7 +4434,7 @@
     </w:p>
     <w:p>
       <w:r>
-        <w:t>The Menopause Society, 2022 Hormone Therapy Position Statement: for healthy symptomatic women under 60 or within 10 years of menopause onset, benefits generally outweigh risks.</w:t>
+        <w:t>The Menopause Society, 2022 Hormone Therapy Position Statement: for healthy symptomatic women under 60 or within 10 years of menopause onset, benefits generally outweigh risks. US Food and Drug Administration, 10 November 2025: boxed warnings removed from menopausal hormone therapy products; the original warnings came from the Women's Health Initiative, whose participants averaged 63 years old.</w:t>
       </w:r>
     </w:p>
     <w:p>
@@ -4455,7 +4455,7 @@
     </w:p>
     <w:p>
       <w:r>
-        <w:t>The repair shift is literal: glymphatic clearance rises during deep sleep. Xie L et al., Sleep drives metabolite clearance from the adult brain, Science 2013 (mice). Fultz NE et al., Coupled electrophysiological, hemodynamic, and cerebrospinal fluid oscillations in human sleep, Science 2019.</w:t>
+        <w:t>Bedtime decides the day: Windred DP et al., Sleep regularity is a stronger predictor of mortality risk than sleep duration, Sleep 2023 (60,977 UK Biobank participants wearing accelerometers; the most regular sleepers had 20 to 48 percent lower all-cause mortality). The repair shift is literal: Piantino J et al., Proceedings of the National Academy of Sciences, October 2024 (Oregon Health &amp; Science University; the brain's perivascular drainage channels imaged in living people for the first time). First described in mice: Xie L et al., Sleep drives metabolite clearance from the adult brain, Science 2013.</w:t>
       </w:r>
     </w:p>
     <w:p>
@@ -4476,7 +4476,7 @@
     </w:p>
     <w:p>
       <w:r>
-        <w:t>The fiber gap: recommended 25 to 38 grams a day (Dietary Guidelines for Americans), average intake about 15. Quagliani D, Felt-Gunderson P, Closing America's fiber intake gap, American Journal of Lifestyle Medicine 2017. Protein for older adults: the PROT-AGE group recommends at least 1.0 to 1.2 g per kg a day (Bauer J et al., JAMDA 2013); Julie's own target is higher and is presented as hers.</w:t>
+        <w:t>The fiber gap: recommended 25 to 38 grams a day; more than 90 percent of women and 97 percent of men do not meet recommended intakes (Dietary Guidelines for Americans, 2020 to 2025). Julie's protein target is presented as hers.</w:t>
       </w:r>
     </w:p>
     <w:p>
@@ -4497,7 +4497,7 @@
     </w:p>
     <w:p>
       <w:r>
-        <w:t>Spike, signal, scar. Deregulated nutrient sensing is one of the twelve hallmarks of aging: López-Otín C et al., Hallmarks of aging: an expanding universe, Cell 2023. Glycation and advanced glycation end products: Uribarri J et al., Journal of the American Dietetic Association 2010. HbA1c is glycated hemoglobin.</w:t>
+        <w:t>Spike, signal, scar. Deregulated nutrient sensing is one of the twelve hallmarks of aging: López-Otín C et al., Hallmarks of aging: an expanding universe, Cell 2023. Glycation: sugar bonding to proteins; HbA1c is glycated hemoglobin, the standard clinical measure.</w:t>
       </w:r>
     </w:p>
     <w:p>
@@ -4518,7 +4518,7 @@
     </w:p>
     <w:p>
       <w:r>
-        <w:t>The healthspan gap: United States life expectancy about 78 years, healthy life expectancy about 66 (WHO Global Health Observatory, 2019 estimates). Confirm the current figures before the night.</w:t>
+        <w:t>The healthspan gap: Garmany A, Terzic A, Global healthspan-lifespan gaps among 183 World Health Organization member states, JAMA Network Open, December 2024 (Mayo Clinic; WHO data; global gap 9.6 years; United States 12.4 years, the widest of the 183).</w:t>
       </w:r>
     </w:p>
     <w:p>
@@ -4539,7 +4539,7 @@
     </w:p>
     <w:p>
       <w:r>
-        <w:t>Four predictors. Grip: Leong DP et al., Prognostic value of grip strength, Lancet 2015 (PURE, 139,691 adults, 17 countries; each 5 kg lower grip, 16 percent higher all-cause mortality). Fitness: Mandsager K et al., Association of cardiorespiratory fitness with long-term mortality, JAMA Network Open 2018 (122,007 patients; low fitness a larger risk than smoking). Steps: Paluch AE et al., Steps per day and all-cause mortality in middle-aged adults, JAMA Network Open 2021 (2,110 adults aged 38 to 50; 7,000 or more steps, 50 to 70 percent lower mortality over 10.8 years). Balance: Araujo CG et al., Successful 10-second one-legged stance performance predicts survival, British Journal of Sports Medicine 2022 (1,702 adults aged 51 to 75; failing the test, 84 percent higher risk of death over the next decade).</w:t>
+        <w:t>Four predictors. Grip: López-Bueno R et al., Thresholds of handgrip strength for all-cause, cancer, and cardiovascular mortality, Ageing Research Reviews 2022 (48 studies, 3.1 million adults; near-linear inverse association). Fitness: Lang JJ et al., Cardiorespiratory fitness is a strong and consistent predictor of morbidity and mortality, British Journal of Sports Medicine 2024 (26 systematic reviews, 199 cohorts, 20.9 million observations; each 1-MET gain, 11 to 17 percent lower risk of death). Steps: Ding D et al., Daily steps and health outcomes in adults, The Lancet Public Health, July 2025 (57 studies; 7,000 steps a day against 2,000, 47 percent lower all-cause mortality, 38 percent lower dementia). Balance: Mayo Clinic, Kaufman KR and colleagues, PLOS One, October 2024 (40 healthy adults over 50; the non-dominant one-leg stand declined fastest with age, ahead of grip, knee strength and gait). Also Araujo CG et al., British Journal of Sports Medicine 2022 (1,702 adults aged 51 to 75; failing a ten-second one-leg stand, 84 percent higher mortality).</w:t>
       </w:r>
     </w:p>
     <w:p>
@@ -4560,7 +4560,7 @@
     </w:p>
     <w:p>
       <w:r>
-        <w:t>Allostatic load: McEwen BS, Protective and damaging effects of stress mediators, New England Journal of Medicine 1998. The physiological sigh: Balban MY, Spiegel D, Huberman AD et al., Brief structured respiration practices enhance mood and reduce physiological arousal, Cell Reports Medicine 2023 (111 people, five minutes a day for a month; cyclic sighing improved mood more than mindfulness meditation and lowered resting breathing rate).</w:t>
+        <w:t>Allostatic load: McEwen BS, Protective and damaging effects of stress mediators, New England Journal of Medicine 1998; still the standard model. The physiological sigh: Balban MY, Spiegel D, Huberman AD et al., Brief structured respiration practices enhance mood and reduce physiological arousal, Cell Reports Medicine 2023 (Stanford; 111 people, five minutes a day for a month; cyclic sighing improved mood more than mindfulness meditation and lowered resting respiratory rate).</w:t>
       </w:r>
     </w:p>
     <w:p>
@@ -4581,7 +4581,7 @@
     </w:p>
     <w:p>
       <w:r>
-        <w:t>Time-restricted eating in a ten-hour window: Wilkinson MJ et al., Ten-hour time-restricted eating reduces weight, blood pressure, and atherogenic lipids in patients with metabolic syndrome, Cell Metabolism 2020 (Salk Institute, 19 participants, 12 weeks).</w:t>
+        <w:t>Time-restricted eating: Manoogian ENC et al., Time-restricted eating in adults with metabolic syndrome: a randomized controlled trial (TIMET), Annals of Internal Medicine, October 2024 (Salk Institute and UC San Diego; 108 adults, average age 59; eight-to-ten-hour window for three months; HbA1c improved; weight, BMI and trunk fat down about 3 to 4 percent, mostly fat). The earlier pilot: Wilkinson MJ et al., Cell Metabolism 2020.</w:t>
       </w:r>
     </w:p>
     <w:p>
@@ -4602,7 +4602,7 @@
     </w:p>
     <w:p>
       <w:r>
-        <w:t>Compression of morbidity: Fries JF, Aging, natural death, and the compression of morbidity, New England Journal of Medicine 1980. The two curves, lifespan and healthspan, and the goal of closing the gap.</w:t>
+        <w:t>Compression of morbidity: Fries JF, Aging, natural death, and the compression of morbidity, New England Journal of Medicine 1980. The gap measured today: Garmany A, Terzic A, JAMA Network Open, December 2024 (9.6 years worldwide, 12.4 in the United States).</w:t>
       </w:r>
     </w:p>
     <w:sectPr>

</xml_diff>

<commit_message>
Script: slide 10 sugar model, UCSF JAMA Network Open 2024 and BMJ 2023 umbrella review
Co-Authored-By: Claude Fable 5.1 <noreply@anthropic.com>
Claude-Session: https://claude.ai/code/session_011ZxZ5Sjnca9JQsayzBoJk5
</commit_message>
<xml_diff>
--- a/script/The-Longevity-Masterclass-script-three-versions.docx
+++ b/script/The-Longevity-Masterclass-script-three-versions.docx
@@ -535,12 +535,12 @@
           <w:color w:val="5B6472"/>
           <w:sz w:val="22"/>
         </w:rPr>
-        <w:t>On screen: The sugar slide, Omri's build in the same 3D language, three panels on one object: Spike (a glucose curve jumping after a meal), Signal (insulin and the nutrient-sensing pathways switching on; deregulated nutrient sensing is one of the twelve hallmarks of aging), Scar (sugar bonding to proteins, glycation; HbA1c is the measured version of this). Approved slide, model added. Small: López-Otín et al., Hallmarks of aging, Cell 2023. Final build: the object dims and two large checkboxes appear, Move dinner earlier and Rebuild one plate, under one word: Monday.</w:t>
-      </w:r>
-    </w:p>
-    <w:p>
-      <w:r>
-        <w:t>There are a hundred diets out there, and every one of them argues with the other ninety-nine. You have to find yours. But there's one thing every single one of them agrees on, and it's on the screen. Sugar is bad for aging. Here's the model in three words. Spike, signal, scar. A spike is what you see on a glucose monitor after a sugary meal. The signal is what the spike turns on inside you: insulin and the nutrient-sensing pathways, and when they're on all day, every day, that's one of the twelve recognized hallmarks of aging. And the scar is the part people don't know: sugar sticks to proteins, a process called glycation, and the HbA1c test your doctor already runs is literally a measure of sugar stuck to your red blood cells. [López-Otín et al., Cell 2023; confirm the wording] What I do about it is simple. [one sentence: when you cut sugar and what you keep] In the Academy, every student wears a glucose monitor for two weeks and watches what their own food does to their own blood sugar, on their phone. I'll come back to that.</w:t>
+        <w:t>On screen: The sugar slide, Omri's build in the same 3D language, three panels on one object: Spike (a glucose curve jumping after a meal), Signal (insulin and the nutrient-sensing pathways switching on; deregulated nutrient sensing is one of the twelve hallmarks of aging), Scar (sugar bonding to proteins, glycation; HbA1c is the measured version of this). Approved slide, model added. Small: Chiu, Epel and Laraia, UCSF, JAMA Network Open, July 2024: each gram of added sugar, an older biological age. Huang et al., BMJ 2023: 83 outcomes, 45 harmed. López-Otín et al., Cell 2023. Final build: the object dims and two large checkboxes appear, Move dinner earlier and Rebuild one plate, under one word: Monday.</w:t>
+      </w:r>
+    </w:p>
+    <w:p>
+      <w:r>
+        <w:t>There are a hundred diets out there, and every one of them argues with the other ninety-nine. You have to find yours. But there's one thing every single one of them agrees on, and it's on the screen. Sugar is bad for aging. Here's the model in three words. Spike, signal, scar. A spike is what you see on a glucose monitor after a sugary meal. The signal is what the spike turns on inside you: insulin and the nutrient-sensing pathways, and when they're on all day, every day, that's one of the twelve recognized hallmarks of aging. And the scar is the part people don't know: sugar sticks to proteins, a process called glycation, and the HbA1c test your doctor already runs is literally a measure of sugar stuck to your red blood cells. And this isn't theory. In July 2024 a UCSF team measured biological age in 342 women around forty, with the same kind of clock behind my own number, and every gram of added sugar they ate came with an older biological age, even in the women whose diets were otherwise healthy. They averaged sixty-one grams a day. The year before, the BMJ pulled together seventy-three meta-analyses on sugar, eighty-three health outcomes, found harm in forty-five of them, and landed on a number: under twenty-five grams of added sugar a day. About six teaspoons. [Chiu, Epel and Laraia, JAMA Network Open, July 2024; Huang et al., BMJ 2023; López-Otín et al., Cell 2023; confirm the wording and the figures] What I do about it is simple. [one sentence: when you cut sugar and what you keep] In the Academy, every student wears a glucose monitor for two weeks and watches what their own food does to their own blood sugar, on their phone. I'll come back to that.</w:t>
       </w:r>
     </w:p>
     <w:p>
@@ -1356,12 +1356,12 @@
           <w:color w:val="5B6472"/>
           <w:sz w:val="22"/>
         </w:rPr>
-        <w:t>On screen: The sugar slide, Omri's build in the same 3D language, three panels on one object: Spike (a glucose curve jumping after a meal), Signal (insulin and the nutrient-sensing pathways switching on; deregulated nutrient sensing is one of the twelve hallmarks of aging), Scar (sugar bonding to proteins, glycation; HbA1c is the measured version of this). Approved slide, model added. Small: López-Otín et al., Hallmarks of aging, Cell 2023. Final build: the object dims and two large checkboxes appear, Move dinner earlier and Rebuild one plate, under the words: Two changes for Monday.</w:t>
-      </w:r>
-    </w:p>
-    <w:p>
-      <w:r>
-        <w:t>There are so many diets out there, and everyone needs to find what works for them. But there's one thing every one of them agrees on: sugar is bad for aging. Here's the model in three words. Spike, signal, scar. A spike is what you see on a glucose monitor after a sugary meal. The signal is what the spike turns on inside you: insulin and the nutrient-sensing pathways, and when they're on all day, every day, that's one of the twelve recognized hallmarks of aging. And the scar is the part people don't know: sugar sticks to proteins, a process called glycation, and the HbA1c test your doctor already runs is literally a measure of sugar stuck to your red blood cells. [López-Otín et al., Cell 2023; confirm the wording] Now the practical part. [one sentence: when you cut sugar and what you keep] In the Academy, every student wears a continuous glucose monitor for two weeks and sees what their own meals do to their own blood sugar. It's the fastest way I know to stop arguing about diets and start looking at your own data.</w:t>
+        <w:t>On screen: The sugar slide, Omri's build in the same 3D language, three panels on one object: Spike (a glucose curve jumping after a meal), Signal (insulin and the nutrient-sensing pathways switching on; deregulated nutrient sensing is one of the twelve hallmarks of aging), Scar (sugar bonding to proteins, glycation; HbA1c is the measured version of this). Approved slide, model added. Small: Chiu, Epel and Laraia, UCSF, JAMA Network Open, July 2024: each gram of added sugar, an older biological age. Huang et al., BMJ 2023: 83 outcomes, 45 harmed. López-Otín et al., Cell 2023. Final build: the object dims and two large checkboxes appear, Move dinner earlier and Rebuild one plate, under the words: Two changes for Monday.</w:t>
+      </w:r>
+    </w:p>
+    <w:p>
+      <w:r>
+        <w:t>There are so many diets out there, and everyone needs to find what works for them. But there's one thing every one of them agrees on: sugar is bad for aging. Here's the model in three words. Spike, signal, scar. A spike is what you see on a glucose monitor after a sugary meal. The signal is what the spike turns on inside you: insulin and the nutrient-sensing pathways, and when they're on all day, every day, that's one of the twelve recognized hallmarks of aging. And the scar is the part people don't know: sugar sticks to proteins, a process called glycation, and the HbA1c test your doctor already runs is literally a measure of sugar stuck to your red blood cells. And this isn't theory. In July 2024 a UCSF team measured biological age in 342 women around forty, with the same kind of clock behind my own number, and every gram of added sugar they ate came with an older biological age, even in the women whose diets were otherwise healthy. They averaged sixty-one grams a day. The year before, the BMJ pulled together seventy-three meta-analyses on sugar, eighty-three health outcomes, found harm in forty-five of them, and landed on a number: under twenty-five grams of added sugar a day. About six teaspoons. [Chiu, Epel and Laraia, JAMA Network Open, July 2024; Huang et al., BMJ 2023; López-Otín et al., Cell 2023; confirm the wording and the figures] Now the practical part. [one sentence: when you cut sugar and what you keep] In the Academy, every student wears a continuous glucose monitor for two weeks and sees what their own meals do to their own blood sugar. It's the fastest way I know to stop arguing about diets and start looking at your own data.</w:t>
       </w:r>
     </w:p>
     <w:p>
@@ -2177,12 +2177,12 @@
           <w:color w:val="5B6472"/>
           <w:sz w:val="22"/>
         </w:rPr>
-        <w:t>On screen: The sugar slide, Omri's build in the same 3D language, three panels on one object: Spike (a glucose curve jumping after a meal), Signal (insulin and the nutrient-sensing pathways switching on; deregulated nutrient sensing is one of the twelve hallmarks of aging), Scar (sugar bonding to proteins, glycation; HbA1c is the measured version of this). Approved slide, model added. Small: López-Otín et al., Hallmarks of aging, Cell 2023. Final build: the object dims and two large checkboxes appear, Move dinner earlier and Rebuild one plate, under the words: Your two Monday changes.</w:t>
-      </w:r>
-    </w:p>
-    <w:p>
-      <w:r>
-        <w:t>There are so many diets out there, and everyone needs to find what works for them. But the one thing every single one of them agrees on is that sugar is bad for aging. Here's the model in three words. Spike, signal, scar. A spike is what you see on a glucose monitor after a sugary meal. The signal is what the spike turns on inside you: insulin and the nutrient-sensing pathways, and when they're on all day, every day, that's one of the twelve recognized hallmarks of aging. And the scar is the part people don't know: sugar sticks to proteins, a process called glycation, and the HbA1c test your doctor already runs is literally a measure of sugar stuck to your red blood cells. [López-Otín et al., Cell 2023; confirm the wording] Here's the practical part. [one sentence: when you cut sugar and what you keep] And here's a confession from someone who thought she had this figured out. I wore a glucose monitor for two weeks, braced for pizza to be the villain. Pizza barely moved. The thing that spiked me first thing in the morning was my healthy green drink. [your story from the Outliyr podcast; confirm and adjust] You don't know until you look. That's why every student in the Academy wears one of these for two weeks.</w:t>
+        <w:t>On screen: The sugar slide, Omri's build in the same 3D language, three panels on one object: Spike (a glucose curve jumping after a meal), Signal (insulin and the nutrient-sensing pathways switching on; deregulated nutrient sensing is one of the twelve hallmarks of aging), Scar (sugar bonding to proteins, glycation; HbA1c is the measured version of this). Approved slide, model added. Small: Chiu, Epel and Laraia, UCSF, JAMA Network Open, July 2024: each gram of added sugar, an older biological age. Huang et al., BMJ 2023: 83 outcomes, 45 harmed. López-Otín et al., Cell 2023. Final build: the object dims and two large checkboxes appear, Move dinner earlier and Rebuild one plate, under the words: Your two Monday changes.</w:t>
+      </w:r>
+    </w:p>
+    <w:p>
+      <w:r>
+        <w:t>There are so many diets out there, and everyone needs to find what works for them. But the one thing every single one of them agrees on is that sugar is bad for aging. Here's the model in three words. Spike, signal, scar. A spike is what you see on a glucose monitor after a sugary meal. The signal is what the spike turns on inside you: insulin and the nutrient-sensing pathways, and when they're on all day, every day, that's one of the twelve recognized hallmarks of aging. And the scar is the part people don't know: sugar sticks to proteins, a process called glycation, and the HbA1c test your doctor already runs is literally a measure of sugar stuck to your red blood cells. And this isn't theory. In July 2024 a UCSF team measured biological age in 342 women around forty, with the same kind of clock behind my own number, and every gram of added sugar they ate came with an older biological age, even in the women whose diets were otherwise healthy. They averaged sixty-one grams a day. The year before, the BMJ pulled together seventy-three meta-analyses on sugar, eighty-three health outcomes, found harm in forty-five of them, and landed on a number: under twenty-five grams of added sugar a day. About six teaspoons. [Chiu, Epel and Laraia, JAMA Network Open, July 2024; Huang et al., BMJ 2023; López-Otín et al., Cell 2023; confirm the wording and the figures] Here's the practical part. [one sentence: when you cut sugar and what you keep] And here's a confession from someone who thought she had this figured out. I wore a glucose monitor for two weeks, braced for pizza to be the villain. Pizza barely moved. The thing that spiked me first thing in the morning was my healthy green drink. [your story from the Outliyr podcast; confirm and adjust] You don't know until you look. That's why every student in the Academy wears one of these for two weeks.</w:t>
       </w:r>
     </w:p>
     <w:p>
@@ -4497,7 +4497,7 @@
     </w:p>
     <w:p>
       <w:r>
-        <w:t>Spike, signal, scar. Deregulated nutrient sensing is one of the twelve hallmarks of aging: López-Otín C et al., Hallmarks of aging: an expanding universe, Cell 2023. Glycation: sugar bonding to proteins; HbA1c is glycated hemoglobin, the standard clinical measure.</w:t>
+        <w:t>Sugar and biological age: Chiu DT, Epel ES, Laraia BA et al., Essential nutrients, added sugar intake, and epigenetic age in midlife Black and White women, JAMA Network Open, 29 July 2024 (UCSF and UC Berkeley; 342 women, mean age 39, saliva epigenetic clock; each gram of added sugar associated with older epigenetic age, independent of overall diet quality; mean intake 61.5 g a day). The whole field in one review: Huang Y et al., Dietary sugar consumption and health: umbrella review, BMJ 2023 (73 meta-analyses, 83 outcomes, significant harm for 45, including 18 metabolic, 10 cardiovascular and 7 cancer outcomes; recommends under 25 g free sugar a day and under one sugary drink a week). Spike, signal, scar: deregulated nutrient sensing is one of the twelve hallmarks of aging, López-Otín C et al., Cell 2023; glycation is sugar bonding to proteins, and HbA1c, glycated hemoglobin, is its standard clinical measure.</w:t>
       </w:r>
     </w:p>
     <w:p>

</xml_diff>